<commit_message>
Correct DSS4 review margins to Sellerboard realised figures
Margin before ads 21.0% (30d) to 26.6% (7d), not 27.47%; net 1.6/6.7/8.9%.
Loss map and profitable CPCs recomputed at $6.21 a unit.

Co-Authored-By: Claude Opus 5.5 <noreply@anthropic.com>
Claude-Session: https://claude.ai/code/session_01SJ43rruFMgodvVtPfpW8Ga
</commit_message>
<xml_diff>
--- a/DSS4_Audit_Review_Complete_20260924-d38957cf.docx
+++ b/DSS4_Audit_Review_Complete_20260924-d38957cf.docx
@@ -39,7 +39,7 @@
     <w:p>
       <w:pPr/>
       <w:r>
-        <w:t xml:space="preserve">Sources: the run's JSON export and workbook; the stored agent review (review 14); the 25 September review and its per-row workbook; Command Center search terms for 26 Aug – 24 Sep; SOP-26, 13, 14, 27, 29 and 33 in this repository.</w:t>
+        <w:t xml:space="preserve">Sources: the run's JSON export and workbook; the stored agent review (review 14); the 25 September review and its per-row workbook; Command Center search terms for 26 Aug – 24 Sep; Sellerboard P&amp;L for parent B0H631FLT8 over 7, 14 and 30 days to 25 Sep; SOP-26, 13, 14, 27, 29 and 33 in this repository.</w:t>
       </w:r>
     </w:p>
     <w:p>
@@ -48,7 +48,7 @@
         <w:rPr>
           <w:b/>
         </w:rPr>
-        <w:t xml:space="preserve">The five things that matter most</w:t>
+        <w:t xml:space="preserve">The six things that matter most</w:t>
       </w:r>
     </w:p>
     <w:p>
@@ -67,6 +67,24 @@
       </w:r>
       <w:r>
         <w:t xml:space="preserve"> Week of 14 Sep: TACoS 15.9% against a 7% ceiling, 2.27×. Overspend $2,131 a week (about $304 a day). The run, with this review's holds, releases about $77 a day.</w:t>
+      </w:r>
+    </w:p>
+    <w:p>
+      <w:pPr>
+        <w:pStyle w:val="ListParagraph"/>
+        <w:numPr>
+          <w:ilvl w:val="0"/>
+          <w:numId w:val="2"/>
+        </w:numPr>
+      </w:pPr>
+      <w:r>
+        <w:rPr>
+          <w:b/>
+        </w:rPr>
+        <w:t xml:space="preserve">The engine prices on a margin the product does not earn.</w:t>
+      </w:r>
+      <w:r>
+        <w:t xml:space="preserve"> Every bid ceiling assumes 27.47% before ads ($8.09 a unit). Sellerboard shows 21.0% over 30 days ($6.21 a unit) and 26.6% in the last 7. After ads the product nets 1.6% over 30 days, 6.7% over 14 and 8.9% over 7.</w:t>
       </w:r>
     </w:p>
     <w:p>
@@ -349,7 +367,7 @@
     <w:p>
       <w:pPr/>
       <w:r>
-        <w:t xml:space="preserve">DSS4 is the largest of the three satin products, at $24,000–$43,000 a week in total sales, and its ad spend has outrun its sales since May. TACoS ran 4.8–13.5% from October to mid-May and has not been under 14% since the week of 20 July. ACoS has run 35–41% against a break-even near 27.5%.</w:t>
+        <w:t xml:space="preserve">DSS4 is the largest of the three satin products, at $24,000–$43,000 a week in total sales, and its ad spend has outrun its sales since May. TACoS ran 4.8–13.5% from October to mid-May and has not been under 14% since the week of 20 July. ACoS has run 35–41% against a realised break-even of 21–27%.</w:t>
       </w:r>
     </w:p>
     <w:p>
@@ -406,10 +424,10 @@
         <w:rPr>
           <w:b/>
         </w:rPr>
-        <w:t xml:space="preserve">Economics.</w:t>
-      </w:r>
-      <w:r>
-        <w:t xml:space="preserve"> Five figures are in circulation. One must be chosen before the next run.</w:t>
+        <w:t xml:space="preserve">Margins (Sellerboard, parent B0H631FLT8, Amazon.com, to 25 Sep).</w:t>
+      </w:r>
+      <w:r>
+        <w:t xml:space="preserve"> The product nets 1.6% over 30 days, 6.7% over 14 and 8.9% over the last 7. Its margin before ads is 21.0–26.6%, below the 27.47% the engine prices every bid on.</w:t>
       </w:r>
     </w:p>
     <w:tbl>
@@ -420,9 +438,10 @@
         <w:tblLook w:val="04A0" w:firstRow="1" w:lastRow="0" w:firstColumn="0" w:lastColumn="0" w:noHBand="0" w:noVBand="1"/>
       </w:tblPr>
       <w:tblGrid>
-        <w:gridCol w:w="3120"/>
-        <w:gridCol w:w="3120"/>
-        <w:gridCol w:w="3120"/>
+        <w:gridCol w:w="2340"/>
+        <w:gridCol w:w="2340"/>
+        <w:gridCol w:w="2340"/>
+        <w:gridCol w:w="2340"/>
       </w:tblGrid>
       <w:tr>
         <w:trPr>
@@ -430,212 +449,576 @@
         </w:trPr>
         <w:tc>
           <w:tcPr>
-            <w:tcW w:w="3120" w:type="dxa"/>
+            <w:tcW w:w="2340" w:type="dxa"/>
             <w:shd w:val="clear" w:color="auto" w:fill="F2F2F2"/>
           </w:tcPr>
           <w:p>
             <w:pPr/>
-            <w:r>
-              <w:t xml:space="preserve">Source</w:t>
-            </w:r>
-          </w:p>
-        </w:tc>
-        <w:tc>
-          <w:tcPr>
-            <w:tcW w:w="3120" w:type="dxa"/>
+          </w:p>
+        </w:tc>
+        <w:tc>
+          <w:tcPr>
+            <w:tcW w:w="2340" w:type="dxa"/>
             <w:shd w:val="clear" w:color="auto" w:fill="F2F2F2"/>
           </w:tcPr>
           <w:p>
             <w:pPr/>
             <w:r>
-              <w:t xml:space="preserve">Contribution per unit</w:t>
-            </w:r>
-          </w:p>
-        </w:tc>
-        <w:tc>
-          <w:tcPr>
-            <w:tcW w:w="3120" w:type="dxa"/>
+              <w:t xml:space="preserve">Last 7 days</w:t>
+            </w:r>
+          </w:p>
+        </w:tc>
+        <w:tc>
+          <w:tcPr>
+            <w:tcW w:w="2340" w:type="dxa"/>
             <w:shd w:val="clear" w:color="auto" w:fill="F2F2F2"/>
           </w:tcPr>
           <w:p>
             <w:pPr/>
             <w:r>
-              <w:t xml:space="preserve">Break-even ACoS</w:t>
-            </w:r>
-          </w:p>
-        </w:tc>
-      </w:tr>
-      <w:tr>
-        <w:tc>
-          <w:tcPr>
-            <w:tcW w:w="3120" w:type="dxa"/>
-          </w:tcPr>
-          <w:p>
-            <w:pPr/>
-            <w:r>
-              <w:t xml:space="preserve">Run brief (profitability, 26 Aug – 25 Sep)</w:t>
-            </w:r>
-          </w:p>
-        </w:tc>
-        <w:tc>
-          <w:tcPr>
-            <w:tcW w:w="3120" w:type="dxa"/>
-          </w:tcPr>
-          <w:p>
-            <w:pPr/>
-            <w:r>
-              <w:t xml:space="preserve">$8.09</w:t>
-            </w:r>
-          </w:p>
-        </w:tc>
-        <w:tc>
-          <w:tcPr>
-            <w:tcW w:w="3120" w:type="dxa"/>
-          </w:tcPr>
-          <w:p>
-            <w:pPr/>
-            <w:r>
-              <w:t xml:space="preserve">27.47%</w:t>
-            </w:r>
-          </w:p>
-        </w:tc>
-      </w:tr>
-      <w:tr>
-        <w:tc>
-          <w:tcPr>
-            <w:tcW w:w="3120" w:type="dxa"/>
-          </w:tcPr>
-          <w:p>
-            <w:pPr/>
-            <w:r>
-              <w:t xml:space="preserve">Stored review, reason 9 (25 Aug – 24 Sep)</w:t>
-            </w:r>
-          </w:p>
-        </w:tc>
-        <w:tc>
-          <w:tcPr>
-            <w:tcW w:w="3120" w:type="dxa"/>
-          </w:tcPr>
-          <w:p>
-            <w:pPr/>
-            <w:r>
-              <w:t xml:space="preserve">$7.99</w:t>
-            </w:r>
-          </w:p>
-        </w:tc>
-        <w:tc>
-          <w:tcPr>
-            <w:tcW w:w="3120" w:type="dxa"/>
-          </w:tcPr>
-          <w:p>
-            <w:pPr/>
-            <w:r>
-              <w:t xml:space="preserve">27.23%</w:t>
-            </w:r>
-          </w:p>
-        </w:tc>
-      </w:tr>
-      <w:tr>
-        <w:tc>
-          <w:tcPr>
-            <w:tcW w:w="3120" w:type="dxa"/>
-          </w:tcPr>
-          <w:p>
-            <w:pPr/>
-            <w:r>
-              <w:t xml:space="preserve">Stored review, reason 8</w:t>
-            </w:r>
-          </w:p>
-        </w:tc>
-        <w:tc>
-          <w:tcPr>
-            <w:tcW w:w="3120" w:type="dxa"/>
-          </w:tcPr>
-          <w:p>
-            <w:pPr/>
-            <w:r>
-              <w:t xml:space="preserve">—</w:t>
-            </w:r>
-          </w:p>
-        </w:tc>
-        <w:tc>
-          <w:tcPr>
-            <w:tcW w:w="3120" w:type="dxa"/>
-          </w:tcPr>
-          <w:p>
-            <w:pPr/>
-            <w:r>
-              <w:t xml:space="preserve">27.9%</w:t>
-            </w:r>
-          </w:p>
-        </w:tc>
-      </w:tr>
-      <w:tr>
-        <w:tc>
-          <w:tcPr>
-            <w:tcW w:w="3120" w:type="dxa"/>
-          </w:tcPr>
-          <w:p>
-            <w:pPr/>
-            <w:r>
-              <w:t xml:space="preserve">25 Sep review</w:t>
-            </w:r>
-          </w:p>
-        </w:tc>
-        <w:tc>
-          <w:tcPr>
-            <w:tcW w:w="3120" w:type="dxa"/>
-          </w:tcPr>
-          <w:p>
-            <w:pPr/>
-            <w:r>
-              <w:t xml:space="preserve">$8.07</w:t>
-            </w:r>
-          </w:p>
-        </w:tc>
-        <w:tc>
-          <w:tcPr>
-            <w:tcW w:w="3120" w:type="dxa"/>
-          </w:tcPr>
-          <w:p>
-            <w:pPr/>
-            <w:r>
-              <w:t xml:space="preserve">27.4%</w:t>
-            </w:r>
-          </w:p>
-        </w:tc>
-      </w:tr>
-      <w:tr>
-        <w:tc>
-          <w:tcPr>
-            <w:tcW w:w="3120" w:type="dxa"/>
-          </w:tcPr>
-          <w:p>
-            <w:pPr/>
-            <w:r>
-              <w:t xml:space="preserve">Engine rows, per-campaign basket</w:t>
-            </w:r>
-          </w:p>
-        </w:tc>
-        <w:tc>
-          <w:tcPr>
-            <w:tcW w:w="3120" w:type="dxa"/>
-          </w:tcPr>
-          <w:p>
-            <w:pPr/>
-            <w:r>
-              <w:t xml:space="preserve">$8.31 to $8.66 per order</w:t>
-            </w:r>
-          </w:p>
-        </w:tc>
-        <w:tc>
-          <w:tcPr>
-            <w:tcW w:w="3120" w:type="dxa"/>
-          </w:tcPr>
-          <w:p>
-            <w:pPr/>
-            <w:r>
-              <w:t xml:space="preserve">—</w:t>
+              <w:t xml:space="preserve">Last 14 days</w:t>
+            </w:r>
+          </w:p>
+        </w:tc>
+        <w:tc>
+          <w:tcPr>
+            <w:tcW w:w="2340" w:type="dxa"/>
+            <w:shd w:val="clear" w:color="auto" w:fill="F2F2F2"/>
+          </w:tcPr>
+          <w:p>
+            <w:pPr/>
+            <w:r>
+              <w:t xml:space="preserve">Last 30 days</w:t>
+            </w:r>
+          </w:p>
+        </w:tc>
+      </w:tr>
+      <w:tr>
+        <w:tc>
+          <w:tcPr>
+            <w:tcW w:w="2340" w:type="dxa"/>
+          </w:tcPr>
+          <w:p>
+            <w:pPr/>
+            <w:r>
+              <w:t xml:space="preserve">Dates</w:t>
+            </w:r>
+          </w:p>
+        </w:tc>
+        <w:tc>
+          <w:tcPr>
+            <w:tcW w:w="2340" w:type="dxa"/>
+          </w:tcPr>
+          <w:p>
+            <w:pPr/>
+            <w:r>
+              <w:t xml:space="preserve">19–25 Sep</w:t>
+            </w:r>
+          </w:p>
+        </w:tc>
+        <w:tc>
+          <w:tcPr>
+            <w:tcW w:w="2340" w:type="dxa"/>
+          </w:tcPr>
+          <w:p>
+            <w:pPr/>
+            <w:r>
+              <w:t xml:space="preserve">12–25 Sep</w:t>
+            </w:r>
+          </w:p>
+        </w:tc>
+        <w:tc>
+          <w:tcPr>
+            <w:tcW w:w="2340" w:type="dxa"/>
+          </w:tcPr>
+          <w:p>
+            <w:pPr/>
+            <w:r>
+              <w:t xml:space="preserve">27 Aug–25 Sep</w:t>
+            </w:r>
+          </w:p>
+        </w:tc>
+      </w:tr>
+      <w:tr>
+        <w:tc>
+          <w:tcPr>
+            <w:tcW w:w="2340" w:type="dxa"/>
+          </w:tcPr>
+          <w:p>
+            <w:pPr/>
+            <w:r>
+              <w:t xml:space="preserve">Sales</w:t>
+            </w:r>
+          </w:p>
+        </w:tc>
+        <w:tc>
+          <w:tcPr>
+            <w:tcW w:w="2340" w:type="dxa"/>
+          </w:tcPr>
+          <w:p>
+            <w:pPr/>
+            <w:r>
+              <w:t xml:space="preserve">$21,284</w:t>
+            </w:r>
+          </w:p>
+        </w:tc>
+        <w:tc>
+          <w:tcPr>
+            <w:tcW w:w="2340" w:type="dxa"/>
+          </w:tcPr>
+          <w:p>
+            <w:pPr/>
+            <w:r>
+              <w:t xml:space="preserve">$44,967</w:t>
+            </w:r>
+          </w:p>
+        </w:tc>
+        <w:tc>
+          <w:tcPr>
+            <w:tcW w:w="2340" w:type="dxa"/>
+          </w:tcPr>
+          <w:p>
+            <w:pPr/>
+            <w:r>
+              <w:t xml:space="preserve">$113,394</w:t>
+            </w:r>
+          </w:p>
+        </w:tc>
+      </w:tr>
+      <w:tr>
+        <w:tc>
+          <w:tcPr>
+            <w:tcW w:w="2340" w:type="dxa"/>
+          </w:tcPr>
+          <w:p>
+            <w:pPr/>
+            <w:r>
+              <w:t xml:space="preserve">Units</w:t>
+            </w:r>
+          </w:p>
+        </w:tc>
+        <w:tc>
+          <w:tcPr>
+            <w:tcW w:w="2340" w:type="dxa"/>
+          </w:tcPr>
+          <w:p>
+            <w:pPr/>
+            <w:r>
+              <w:t xml:space="preserve">677</w:t>
+            </w:r>
+          </w:p>
+        </w:tc>
+        <w:tc>
+          <w:tcPr>
+            <w:tcW w:w="2340" w:type="dxa"/>
+          </w:tcPr>
+          <w:p>
+            <w:pPr/>
+            <w:r>
+              <w:t xml:space="preserve">1,439</w:t>
+            </w:r>
+          </w:p>
+        </w:tc>
+        <w:tc>
+          <w:tcPr>
+            <w:tcW w:w="2340" w:type="dxa"/>
+          </w:tcPr>
+          <w:p>
+            <w:pPr/>
+            <w:r>
+              <w:t xml:space="preserve">3,831</w:t>
+            </w:r>
+          </w:p>
+        </w:tc>
+      </w:tr>
+      <w:tr>
+        <w:tc>
+          <w:tcPr>
+            <w:tcW w:w="2340" w:type="dxa"/>
+          </w:tcPr>
+          <w:p>
+            <w:pPr/>
+            <w:r>
+              <w:t xml:space="preserve">Average price</w:t>
+            </w:r>
+          </w:p>
+        </w:tc>
+        <w:tc>
+          <w:tcPr>
+            <w:tcW w:w="2340" w:type="dxa"/>
+          </w:tcPr>
+          <w:p>
+            <w:pPr/>
+            <w:r>
+              <w:t xml:space="preserve">$31.44</w:t>
+            </w:r>
+          </w:p>
+        </w:tc>
+        <w:tc>
+          <w:tcPr>
+            <w:tcW w:w="2340" w:type="dxa"/>
+          </w:tcPr>
+          <w:p>
+            <w:pPr/>
+            <w:r>
+              <w:t xml:space="preserve">$31.25</w:t>
+            </w:r>
+          </w:p>
+        </w:tc>
+        <w:tc>
+          <w:tcPr>
+            <w:tcW w:w="2340" w:type="dxa"/>
+          </w:tcPr>
+          <w:p>
+            <w:pPr/>
+            <w:r>
+              <w:t xml:space="preserve">$29.60</w:t>
+            </w:r>
+          </w:p>
+        </w:tc>
+      </w:tr>
+      <w:tr>
+        <w:tc>
+          <w:tcPr>
+            <w:tcW w:w="2340" w:type="dxa"/>
+          </w:tcPr>
+          <w:p>
+            <w:pPr/>
+            <w:r>
+              <w:t xml:space="preserve">Product cost</w:t>
+            </w:r>
+          </w:p>
+        </w:tc>
+        <w:tc>
+          <w:tcPr>
+            <w:tcW w:w="2340" w:type="dxa"/>
+          </w:tcPr>
+          <w:p>
+            <w:pPr/>
+            <w:r>
+              <w:t xml:space="preserve">−$6,770 (31.8%)</w:t>
+            </w:r>
+          </w:p>
+        </w:tc>
+        <w:tc>
+          <w:tcPr>
+            <w:tcW w:w="2340" w:type="dxa"/>
+          </w:tcPr>
+          <w:p>
+            <w:pPr/>
+            <w:r>
+              <w:t xml:space="preserve">−$14,335 (31.9%)</w:t>
+            </w:r>
+          </w:p>
+        </w:tc>
+        <w:tc>
+          <w:tcPr>
+            <w:tcW w:w="2340" w:type="dxa"/>
+          </w:tcPr>
+          <w:p>
+            <w:pPr/>
+            <w:r>
+              <w:t xml:space="preserve">−$38,199 (33.7%)</w:t>
+            </w:r>
+          </w:p>
+        </w:tc>
+      </w:tr>
+      <w:tr>
+        <w:tc>
+          <w:tcPr>
+            <w:tcW w:w="2340" w:type="dxa"/>
+          </w:tcPr>
+          <w:p>
+            <w:pPr/>
+            <w:r>
+              <w:t xml:space="preserve">Amazon fees</w:t>
+            </w:r>
+          </w:p>
+        </w:tc>
+        <w:tc>
+          <w:tcPr>
+            <w:tcW w:w="2340" w:type="dxa"/>
+          </w:tcPr>
+          <w:p>
+            <w:pPr/>
+            <w:r>
+              <w:t xml:space="preserve">−$7,676 (36.1%)</w:t>
+            </w:r>
+          </w:p>
+        </w:tc>
+        <w:tc>
+          <w:tcPr>
+            <w:tcW w:w="2340" w:type="dxa"/>
+          </w:tcPr>
+          <w:p>
+            <w:pPr/>
+            <w:r>
+              <w:t xml:space="preserve">−$17,389 (38.7%)</w:t>
+            </w:r>
+          </w:p>
+        </w:tc>
+        <w:tc>
+          <w:tcPr>
+            <w:tcW w:w="2340" w:type="dxa"/>
+          </w:tcPr>
+          <w:p>
+            <w:pPr/>
+            <w:r>
+              <w:t xml:space="preserve">−$47,319 (41.7%)</w:t>
+            </w:r>
+          </w:p>
+        </w:tc>
+      </w:tr>
+      <w:tr>
+        <w:tc>
+          <w:tcPr>
+            <w:tcW w:w="2340" w:type="dxa"/>
+          </w:tcPr>
+          <w:p>
+            <w:pPr/>
+            <w:r>
+              <w:t xml:space="preserve">Refunds</w:t>
+            </w:r>
+          </w:p>
+        </w:tc>
+        <w:tc>
+          <w:tcPr>
+            <w:tcW w:w="2340" w:type="dxa"/>
+          </w:tcPr>
+          <w:p>
+            <w:pPr/>
+            <w:r>
+              <w:t xml:space="preserve">−$1,184 (5.6%)</w:t>
+            </w:r>
+          </w:p>
+        </w:tc>
+        <w:tc>
+          <w:tcPr>
+            <w:tcW w:w="2340" w:type="dxa"/>
+          </w:tcPr>
+          <w:p>
+            <w:pPr/>
+            <w:r>
+              <w:t xml:space="preserve">−$2,101 (4.7%)</w:t>
+            </w:r>
+          </w:p>
+        </w:tc>
+        <w:tc>
+          <w:tcPr>
+            <w:tcW w:w="2340" w:type="dxa"/>
+          </w:tcPr>
+          <w:p>
+            <w:pPr/>
+            <w:r>
+              <w:t xml:space="preserve">−$4,072 (3.6%)</w:t>
+            </w:r>
+          </w:p>
+        </w:tc>
+      </w:tr>
+      <w:tr>
+        <w:tc>
+          <w:tcPr>
+            <w:tcW w:w="2340" w:type="dxa"/>
+          </w:tcPr>
+          <w:p>
+            <w:pPr/>
+            <w:r>
+              <w:rPr>
+                <w:b/>
+              </w:rPr>
+              <w:t xml:space="preserve">Margin before ads</w:t>
+            </w:r>
+          </w:p>
+        </w:tc>
+        <w:tc>
+          <w:tcPr>
+            <w:tcW w:w="2340" w:type="dxa"/>
+          </w:tcPr>
+          <w:p>
+            <w:pPr/>
+            <w:r>
+              <w:rPr>
+                <w:b/>
+              </w:rPr>
+              <w:t xml:space="preserve">$5,654 (26.6%)</w:t>
+            </w:r>
+          </w:p>
+        </w:tc>
+        <w:tc>
+          <w:tcPr>
+            <w:tcW w:w="2340" w:type="dxa"/>
+          </w:tcPr>
+          <w:p>
+            <w:pPr/>
+            <w:r>
+              <w:rPr>
+                <w:b/>
+              </w:rPr>
+              <w:t xml:space="preserve">$11,143 (24.8%)</w:t>
+            </w:r>
+          </w:p>
+        </w:tc>
+        <w:tc>
+          <w:tcPr>
+            <w:tcW w:w="2340" w:type="dxa"/>
+          </w:tcPr>
+          <w:p>
+            <w:pPr/>
+            <w:r>
+              <w:rPr>
+                <w:b/>
+              </w:rPr>
+              <w:t xml:space="preserve">$23,804 (21.0%)</w:t>
+            </w:r>
+          </w:p>
+        </w:tc>
+      </w:tr>
+      <w:tr>
+        <w:tc>
+          <w:tcPr>
+            <w:tcW w:w="2340" w:type="dxa"/>
+          </w:tcPr>
+          <w:p>
+            <w:pPr/>
+            <w:r>
+              <w:t xml:space="preserve">Margin before ads, per unit</w:t>
+            </w:r>
+          </w:p>
+        </w:tc>
+        <w:tc>
+          <w:tcPr>
+            <w:tcW w:w="2340" w:type="dxa"/>
+          </w:tcPr>
+          <w:p>
+            <w:pPr/>
+            <w:r>
+              <w:t xml:space="preserve">$8.35</w:t>
+            </w:r>
+          </w:p>
+        </w:tc>
+        <w:tc>
+          <w:tcPr>
+            <w:tcW w:w="2340" w:type="dxa"/>
+          </w:tcPr>
+          <w:p>
+            <w:pPr/>
+            <w:r>
+              <w:t xml:space="preserve">$7.74</w:t>
+            </w:r>
+          </w:p>
+        </w:tc>
+        <w:tc>
+          <w:tcPr>
+            <w:tcW w:w="2340" w:type="dxa"/>
+          </w:tcPr>
+          <w:p>
+            <w:pPr/>
+            <w:r>
+              <w:t xml:space="preserve">$6.21</w:t>
+            </w:r>
+          </w:p>
+        </w:tc>
+      </w:tr>
+      <w:tr>
+        <w:tc>
+          <w:tcPr>
+            <w:tcW w:w="2340" w:type="dxa"/>
+          </w:tcPr>
+          <w:p>
+            <w:pPr/>
+            <w:r>
+              <w:t xml:space="preserve">Advertising (incl. Sponsored Brands and Video)</w:t>
+            </w:r>
+          </w:p>
+        </w:tc>
+        <w:tc>
+          <w:tcPr>
+            <w:tcW w:w="2340" w:type="dxa"/>
+          </w:tcPr>
+          <w:p>
+            <w:pPr/>
+            <w:r>
+              <w:t xml:space="preserve">−$3,754 (17.6%)</w:t>
+            </w:r>
+          </w:p>
+        </w:tc>
+        <w:tc>
+          <w:tcPr>
+            <w:tcW w:w="2340" w:type="dxa"/>
+          </w:tcPr>
+          <w:p>
+            <w:pPr/>
+            <w:r>
+              <w:t xml:space="preserve">−$8,126 (18.1%)</w:t>
+            </w:r>
+          </w:p>
+        </w:tc>
+        <w:tc>
+          <w:tcPr>
+            <w:tcW w:w="2340" w:type="dxa"/>
+          </w:tcPr>
+          <w:p>
+            <w:pPr/>
+            <w:r>
+              <w:t xml:space="preserve">−$21,948 (19.4%)</w:t>
+            </w:r>
+          </w:p>
+        </w:tc>
+      </w:tr>
+      <w:tr>
+        <w:tc>
+          <w:tcPr>
+            <w:tcW w:w="2340" w:type="dxa"/>
+          </w:tcPr>
+          <w:p>
+            <w:pPr/>
+            <w:r>
+              <w:rPr>
+                <w:b/>
+              </w:rPr>
+              <w:t xml:space="preserve">Net profit</w:t>
+            </w:r>
+          </w:p>
+        </w:tc>
+        <w:tc>
+          <w:tcPr>
+            <w:tcW w:w="2340" w:type="dxa"/>
+          </w:tcPr>
+          <w:p>
+            <w:pPr/>
+            <w:r>
+              <w:rPr>
+                <w:b/>
+              </w:rPr>
+              <w:t xml:space="preserve">$1,900 (8.9%)</w:t>
+            </w:r>
+          </w:p>
+        </w:tc>
+        <w:tc>
+          <w:tcPr>
+            <w:tcW w:w="2340" w:type="dxa"/>
+          </w:tcPr>
+          <w:p>
+            <w:pPr/>
+            <w:r>
+              <w:rPr>
+                <w:b/>
+              </w:rPr>
+              <w:t xml:space="preserve">$3,017 (6.7%)</w:t>
+            </w:r>
+          </w:p>
+        </w:tc>
+        <w:tc>
+          <w:tcPr>
+            <w:tcW w:w="2340" w:type="dxa"/>
+          </w:tcPr>
+          <w:p>
+            <w:pPr/>
+            <w:r>
+              <w:rPr>
+                <w:b/>
+              </w:rPr>
+              <w:t xml:space="preserve">$1,857 (1.6%)</w:t>
             </w:r>
           </w:p>
         </w:tc>
@@ -644,7 +1027,34 @@
     <w:p>
       <w:pPr/>
       <w:r>
-        <w:t xml:space="preserve">Command Center's landed-cost figure is $10.79 at the $32.08 list price; the run's average order value is $30.03. One blended figure covers sizes that average $7.76 (Twin) to $16.77 (Full) at list.</w:t>
+        <w:t xml:space="preserve">The margin before ads is the real break-even ACoS: about 21% over 30 days, 27% in the best recent week. The 30-day gap comes from a lower average price ($29.60 against $31.44) and heavier fees: monthly storage and removal charges land in the older days, and the 14-day window alone carries $1,222 of long-term storage. The last 7 days will read slightly high until their refunds arrive.</w:t>
+      </w:r>
+    </w:p>
+    <w:p>
+      <w:pPr/>
+      <w:r>
+        <w:rPr>
+          <w:b/>
+        </w:rPr>
+        <w:t xml:space="preserve">The margin to use.</w:t>
+      </w:r>
+      <w:r>
+        <w:t xml:space="preserve"> This review uses </w:t>
+      </w:r>
+      <w:r>
+        <w:rPr>
+          <w:b/>
+        </w:rPr>
+        <w:t xml:space="preserve">$6.21 a unit (21.0%)</w:t>
+      </w:r>
+      <w:r>
+        <w:t xml:space="preserve">, the 30-day figure that matches the 30-day search-term window in N8. The other figures in circulation are retired: $8.09 / 27.47% (run brief), $7.99 / 27.23% and 27.9% (stored review), $8.07 / 27.4% (25 Sep review), and $8.31–$8.66 per order (engine campaign baskets). At the 7% mature ceiling, this week's 26.6% margin before ads would net about 19.6%.</w:t>
+      </w:r>
+    </w:p>
+    <w:p>
+      <w:pPr/>
+      <w:r>
+        <w:t xml:space="preserve">Product cost runs $9.97–$10.00 a unit in Sellerboard; Command Center carries a $10.79 landed cost at the $32.08 list price. The 25 Sep review put contribution by size at about $7.76 (Twin) to $16.77 (Full) at list; one blended figure hides that spread.</w:t>
       </w:r>
     </w:p>
     <w:p>
@@ -1343,6 +1753,12 @@
     <w:p>
       <w:pPr/>
       <w:r>
+        <w:t xml:space="preserve">The table uses Command Center's Sponsored Products spend. Sellerboard, which adds Sponsored Brands and Video, puts ad spend at 17.6% of sales over 7 days, 18.1% over 14 and 19.4% over 30: 2.5–2.8× the ceiling either way. With a realised margin before ads of 21.0% (30 days), the product keeps 1.6% of sales today.</w:t>
+      </w:r>
+    </w:p>
+    <w:p>
+      <w:pPr/>
+      <w:r>
         <w:t xml:space="preserve">The eight weeks before ran $2,727–$5,157 a week over. The stage was declared MATURE on 21 Sep (operator ruling, reverted from RANKING), so the mature band applies from that date. Read against it, the second limb (over 1.5× for two weeks) has been met every week since 18 May.</w:t>
       </w:r>
     </w:p>
@@ -3060,7 +3476,7 @@
     <w:p>
       <w:pPr/>
       <w:r>
-        <w:t xml:space="preserve">In a code red the cuts are right: "satin sheets" pays $1.89 a click against a $1.31 profitable CPC. What is wrong is the claim. These rows stand as flagged code-red cuts with the rank claims withdrawn and new predictions: top-of-search clicks at about 0.5–0.6×, the engine's own measured response to cuts this size. The 10 base cuts are missing from the outcome; their targets carry 276 orders in 90 days, about 21 a week.</w:t>
+        <w:t xml:space="preserve">In a code red the cuts are right: "satin sheets" pays $1.89 a click against a $1.00 profitable CPC at the realised margin. What is wrong is the claim. These rows stand as flagged code-red cuts with the rank claims withdrawn and new predictions: top-of-search clicks at about 0.5–0.6×, the engine's own measured response to cuts this size. The 10 base cuts are missing from the outcome; their targets carry 276 orders in 90 days, about 21 a week.</w:t>
       </w:r>
     </w:p>
     <w:p>
@@ -3221,7 +3637,7 @@
           <w:p>
             <w:pPr/>
             <w:r>
-              <w:t xml:space="preserve">$3.79 vs $1.73</w:t>
+              <w:t xml:space="preserve">$3.79 vs $1.33</w:t>
             </w:r>
           </w:p>
         </w:tc>
@@ -3289,7 +3705,7 @@
           <w:p>
             <w:pPr/>
             <w:r>
-              <w:t xml:space="preserve">$3.20 vs $1.09</w:t>
+              <w:t xml:space="preserve">$3.20 vs $0.83</w:t>
             </w:r>
           </w:p>
         </w:tc>
@@ -3454,7 +3870,7 @@
         <w:t xml:space="preserve">satin bed sheets full</w:t>
       </w:r>
       <w:r>
-        <w:t xml:space="preserve"> ($108 in 14 days, 64% ACoS) sits on a 300% modifier and the run holds every lever on it ("the delivery check fails and the reduction waits").</w:t>
+        <w:t xml:space="preserve"> ($108 in 14 days, 64% ACoS, $3.19 a click against a $1.05 profitable CPC) sits on a 300% modifier and the run holds every lever on it ("the delivery check fails and the reduction waits").</w:t>
       </w:r>
     </w:p>
     <w:p>
@@ -3827,7 +4243,7 @@
     <w:p>
       <w:pPr/>
       <w:r>
-        <w:t xml:space="preserve">The top 20 search terms by spend lost about $3,000 over 26 Aug – 24 Sep, about $700 a week, a third of the weekly overspend. Loss = spend − units × $8.09; profitable CPC = $8.09 × units per click. Ordered by loss:</w:t>
+        <w:t xml:space="preserve">All 20 of the top search terms by spend lost money over 26 Aug – 24 Sep: about $4,200 in total, about $985 a week, 46% of the weekly overspend. Loss = spend − units × $6.21 (the realised 30-day margin before ads, section A); profitable CPC = $6.21 × units per click. Ordered by loss:</w:t>
       </w:r>
     </w:p>
     <w:tbl>
@@ -3838,14 +4254,15 @@
         <w:tblLook w:val="04A0" w:firstRow="1" w:lastRow="0" w:firstColumn="0" w:lastColumn="0" w:noHBand="0" w:noVBand="1"/>
       </w:tblPr>
       <w:tblGrid>
-        <w:gridCol w:w="1170"/>
-        <w:gridCol w:w="1170"/>
-        <w:gridCol w:w="1170"/>
-        <w:gridCol w:w="1170"/>
-        <w:gridCol w:w="1170"/>
-        <w:gridCol w:w="1170"/>
-        <w:gridCol w:w="1170"/>
-        <w:gridCol w:w="1170"/>
+        <w:gridCol w:w="1040"/>
+        <w:gridCol w:w="1040"/>
+        <w:gridCol w:w="1040"/>
+        <w:gridCol w:w="1040"/>
+        <w:gridCol w:w="1040"/>
+        <w:gridCol w:w="1040"/>
+        <w:gridCol w:w="1040"/>
+        <w:gridCol w:w="1040"/>
+        <w:gridCol w:w="1040"/>
       </w:tblGrid>
       <w:tr>
         <w:trPr>
@@ -3853,7 +4270,7 @@
         </w:trPr>
         <w:tc>
           <w:tcPr>
-            <w:tcW w:w="1170" w:type="dxa"/>
+            <w:tcW w:w="1040" w:type="dxa"/>
             <w:shd w:val="clear" w:color="auto" w:fill="F2F2F2"/>
           </w:tcPr>
           <w:p>
@@ -3865,7 +4282,7 @@
         </w:tc>
         <w:tc>
           <w:tcPr>
-            <w:tcW w:w="1170" w:type="dxa"/>
+            <w:tcW w:w="1040" w:type="dxa"/>
             <w:shd w:val="clear" w:color="auto" w:fill="F2F2F2"/>
           </w:tcPr>
           <w:p>
@@ -3877,7 +4294,7 @@
         </w:tc>
         <w:tc>
           <w:tcPr>
-            <w:tcW w:w="1170" w:type="dxa"/>
+            <w:tcW w:w="1040" w:type="dxa"/>
             <w:shd w:val="clear" w:color="auto" w:fill="F2F2F2"/>
           </w:tcPr>
           <w:p>
@@ -3889,7 +4306,7 @@
         </w:tc>
         <w:tc>
           <w:tcPr>
-            <w:tcW w:w="1170" w:type="dxa"/>
+            <w:tcW w:w="1040" w:type="dxa"/>
             <w:shd w:val="clear" w:color="auto" w:fill="F2F2F2"/>
           </w:tcPr>
           <w:p>
@@ -3901,7 +4318,7 @@
         </w:tc>
         <w:tc>
           <w:tcPr>
-            <w:tcW w:w="1170" w:type="dxa"/>
+            <w:tcW w:w="1040" w:type="dxa"/>
             <w:shd w:val="clear" w:color="auto" w:fill="F2F2F2"/>
           </w:tcPr>
           <w:p>
@@ -3913,7 +4330,7 @@
         </w:tc>
         <w:tc>
           <w:tcPr>
-            <w:tcW w:w="1170" w:type="dxa"/>
+            <w:tcW w:w="1040" w:type="dxa"/>
             <w:shd w:val="clear" w:color="auto" w:fill="F2F2F2"/>
           </w:tcPr>
           <w:p>
@@ -3925,7 +4342,7 @@
         </w:tc>
         <w:tc>
           <w:tcPr>
-            <w:tcW w:w="1170" w:type="dxa"/>
+            <w:tcW w:w="1040" w:type="dxa"/>
             <w:shd w:val="clear" w:color="auto" w:fill="F2F2F2"/>
           </w:tcPr>
           <w:p>
@@ -3937,12 +4354,24 @@
         </w:tc>
         <w:tc>
           <w:tcPr>
-            <w:tcW w:w="1170" w:type="dxa"/>
+            <w:tcW w:w="1040" w:type="dxa"/>
             <w:shd w:val="clear" w:color="auto" w:fill="F2F2F2"/>
           </w:tcPr>
           <w:p>
             <w:pPr/>
             <w:r>
+              <w:t xml:space="preserve">CPC ÷ profitable</w:t>
+            </w:r>
+          </w:p>
+        </w:tc>
+        <w:tc>
+          <w:tcPr>
+            <w:tcW w:w="1040" w:type="dxa"/>
+            <w:shd w:val="clear" w:color="auto" w:fill="F2F2F2"/>
+          </w:tcPr>
+          <w:p>
+            <w:pPr/>
+            <w:r>
               <w:t xml:space="preserve">Loss 30d</w:t>
             </w:r>
           </w:p>
@@ -3951,7 +4380,108 @@
       <w:tr>
         <w:tc>
           <w:tcPr>
-            <w:tcW w:w="1170" w:type="dxa"/>
+            <w:tcW w:w="1040" w:type="dxa"/>
+          </w:tcPr>
+          <w:p>
+            <w:pPr/>
+            <w:r>
+              <w:t xml:space="preserve">satin sheets</w:t>
+            </w:r>
+          </w:p>
+        </w:tc>
+        <w:tc>
+          <w:tcPr>
+            <w:tcW w:w="1040" w:type="dxa"/>
+          </w:tcPr>
+          <w:p>
+            <w:pPr/>
+            <w:r>
+              <w:t xml:space="preserve">5</w:t>
+            </w:r>
+          </w:p>
+        </w:tc>
+        <w:tc>
+          <w:tcPr>
+            <w:tcW w:w="1040" w:type="dxa"/>
+          </w:tcPr>
+          <w:p>
+            <w:pPr/>
+            <w:r>
+              <w:t xml:space="preserve">$1,595</w:t>
+            </w:r>
+          </w:p>
+        </w:tc>
+        <w:tc>
+          <w:tcPr>
+            <w:tcW w:w="1040" w:type="dxa"/>
+          </w:tcPr>
+          <w:p>
+            <w:pPr/>
+            <w:r>
+              <w:t xml:space="preserve">133</w:t>
+            </w:r>
+          </w:p>
+        </w:tc>
+        <w:tc>
+          <w:tcPr>
+            <w:tcW w:w="1040" w:type="dxa"/>
+          </w:tcPr>
+          <w:p>
+            <w:pPr/>
+            <w:r>
+              <w:t xml:space="preserve">40%</w:t>
+            </w:r>
+          </w:p>
+        </w:tc>
+        <w:tc>
+          <w:tcPr>
+            <w:tcW w:w="1040" w:type="dxa"/>
+          </w:tcPr>
+          <w:p>
+            <w:pPr/>
+            <w:r>
+              <w:t xml:space="preserve">$1.89</w:t>
+            </w:r>
+          </w:p>
+        </w:tc>
+        <w:tc>
+          <w:tcPr>
+            <w:tcW w:w="1040" w:type="dxa"/>
+          </w:tcPr>
+          <w:p>
+            <w:pPr/>
+            <w:r>
+              <w:t xml:space="preserve">$1.00</w:t>
+            </w:r>
+          </w:p>
+        </w:tc>
+        <w:tc>
+          <w:tcPr>
+            <w:tcW w:w="1040" w:type="dxa"/>
+          </w:tcPr>
+          <w:p>
+            <w:pPr/>
+            <w:r>
+              <w:t xml:space="preserve">1.9×</w:t>
+            </w:r>
+          </w:p>
+        </w:tc>
+        <w:tc>
+          <w:tcPr>
+            <w:tcW w:w="1040" w:type="dxa"/>
+          </w:tcPr>
+          <w:p>
+            <w:pPr/>
+            <w:r>
+              <w:t xml:space="preserve">$751</w:t>
+            </w:r>
+          </w:p>
+        </w:tc>
+      </w:tr>
+      <w:tr>
+        <w:tc>
+          <w:tcPr>
+            <w:tcW w:w="1040" w:type="dxa"/>
           </w:tcPr>
           <w:p>
             <w:pPr/>
@@ -3962,7 +4492,7 @@
         </w:tc>
         <w:tc>
           <w:tcPr>
-            <w:tcW w:w="1170" w:type="dxa"/>
+            <w:tcW w:w="1040" w:type="dxa"/>
           </w:tcPr>
           <w:p>
             <w:pPr/>
@@ -3973,7 +4503,7 @@
         </w:tc>
         <w:tc>
           <w:tcPr>
-            <w:tcW w:w="1170" w:type="dxa"/>
+            <w:tcW w:w="1040" w:type="dxa"/>
           </w:tcPr>
           <w:p>
             <w:pPr/>
@@ -3984,7 +4514,7 @@
         </w:tc>
         <w:tc>
           <w:tcPr>
-            <w:tcW w:w="1170" w:type="dxa"/>
+            <w:tcW w:w="1040" w:type="dxa"/>
           </w:tcPr>
           <w:p>
             <w:pPr/>
@@ -3995,7 +4525,7 @@
         </w:tc>
         <w:tc>
           <w:tcPr>
-            <w:tcW w:w="1170" w:type="dxa"/>
+            <w:tcW w:w="1040" w:type="dxa"/>
           </w:tcPr>
           <w:p>
             <w:pPr/>
@@ -4006,7 +4536,7 @@
         </w:tc>
         <w:tc>
           <w:tcPr>
-            <w:tcW w:w="1170" w:type="dxa"/>
+            <w:tcW w:w="1040" w:type="dxa"/>
           </w:tcPr>
           <w:p>
             <w:pPr/>
@@ -4017,42 +4547,962 @@
         </w:tc>
         <w:tc>
           <w:tcPr>
-            <w:tcW w:w="1170" w:type="dxa"/>
-          </w:tcPr>
-          <w:p>
-            <w:pPr/>
-            <w:r>
-              <w:t xml:space="preserve">$1.54</w:t>
-            </w:r>
-          </w:p>
-        </w:tc>
-        <w:tc>
-          <w:tcPr>
-            <w:tcW w:w="1170" w:type="dxa"/>
-          </w:tcPr>
-          <w:p>
-            <w:pPr/>
-            <w:r>
-              <w:t xml:space="preserve">$551</w:t>
-            </w:r>
-          </w:p>
-        </w:tc>
-      </w:tr>
-      <w:tr>
-        <w:tc>
-          <w:tcPr>
-            <w:tcW w:w="1170" w:type="dxa"/>
-          </w:tcPr>
-          <w:p>
-            <w:pPr/>
-            <w:r>
-              <w:t xml:space="preserve">satin sheets</w:t>
-            </w:r>
-          </w:p>
-        </w:tc>
-        <w:tc>
-          <w:tcPr>
-            <w:tcW w:w="1170" w:type="dxa"/>
+            <w:tcW w:w="1040" w:type="dxa"/>
+          </w:tcPr>
+          <w:p>
+            <w:pPr/>
+            <w:r>
+              <w:t xml:space="preserve">$1.18</w:t>
+            </w:r>
+          </w:p>
+        </w:tc>
+        <w:tc>
+          <w:tcPr>
+            <w:tcW w:w="1040" w:type="dxa"/>
+          </w:tcPr>
+          <w:p>
+            <w:pPr/>
+            <w:r>
+              <w:t xml:space="preserve">2.3×</w:t>
+            </w:r>
+          </w:p>
+        </w:tc>
+        <w:tc>
+          <w:tcPr>
+            <w:tcW w:w="1040" w:type="dxa"/>
+          </w:tcPr>
+          <w:p>
+            <w:pPr/>
+            <w:r>
+              <w:t xml:space="preserve">$715</w:t>
+            </w:r>
+          </w:p>
+        </w:tc>
+      </w:tr>
+      <w:tr>
+        <w:tc>
+          <w:tcPr>
+            <w:tcW w:w="1040" w:type="dxa"/>
+          </w:tcPr>
+          <w:p>
+            <w:pPr/>
+            <w:r>
+              <w:t xml:space="preserve">king size silk sheets set</w:t>
+            </w:r>
+          </w:p>
+        </w:tc>
+        <w:tc>
+          <w:tcPr>
+            <w:tcW w:w="1040" w:type="dxa"/>
+          </w:tcPr>
+          <w:p>
+            <w:pPr/>
+            <w:r>
+              <w:t xml:space="preserve">6</w:t>
+            </w:r>
+          </w:p>
+        </w:tc>
+        <w:tc>
+          <w:tcPr>
+            <w:tcW w:w="1040" w:type="dxa"/>
+          </w:tcPr>
+          <w:p>
+            <w:pPr/>
+            <w:r>
+              <w:t xml:space="preserve">$503</w:t>
+            </w:r>
+          </w:p>
+        </w:tc>
+        <w:tc>
+          <w:tcPr>
+            <w:tcW w:w="1040" w:type="dxa"/>
+          </w:tcPr>
+          <w:p>
+            <w:pPr/>
+            <w:r>
+              <w:t xml:space="preserve">28</w:t>
+            </w:r>
+          </w:p>
+        </w:tc>
+        <w:tc>
+          <w:tcPr>
+            <w:tcW w:w="1040" w:type="dxa"/>
+          </w:tcPr>
+          <w:p>
+            <w:pPr/>
+            <w:r>
+              <w:t xml:space="preserve">55%</w:t>
+            </w:r>
+          </w:p>
+        </w:tc>
+        <w:tc>
+          <w:tcPr>
+            <w:tcW w:w="1040" w:type="dxa"/>
+          </w:tcPr>
+          <w:p>
+            <w:pPr/>
+            <w:r>
+              <w:t xml:space="preserve">$3.54</w:t>
+            </w:r>
+          </w:p>
+        </w:tc>
+        <w:tc>
+          <w:tcPr>
+            <w:tcW w:w="1040" w:type="dxa"/>
+          </w:tcPr>
+          <w:p>
+            <w:pPr/>
+            <w:r>
+              <w:t xml:space="preserve">$1.22</w:t>
+            </w:r>
+          </w:p>
+        </w:tc>
+        <w:tc>
+          <w:tcPr>
+            <w:tcW w:w="1040" w:type="dxa"/>
+          </w:tcPr>
+          <w:p>
+            <w:pPr/>
+            <w:r>
+              <w:t xml:space="preserve">2.9×</w:t>
+            </w:r>
+          </w:p>
+        </w:tc>
+        <w:tc>
+          <w:tcPr>
+            <w:tcW w:w="1040" w:type="dxa"/>
+          </w:tcPr>
+          <w:p>
+            <w:pPr/>
+            <w:r>
+              <w:t xml:space="preserve">$329</w:t>
+            </w:r>
+          </w:p>
+        </w:tc>
+      </w:tr>
+      <w:tr>
+        <w:tc>
+          <w:tcPr>
+            <w:tcW w:w="1040" w:type="dxa"/>
+          </w:tcPr>
+          <w:p>
+            <w:pPr/>
+            <w:r>
+              <w:t xml:space="preserve">king silk sheets</w:t>
+            </w:r>
+          </w:p>
+        </w:tc>
+        <w:tc>
+          <w:tcPr>
+            <w:tcW w:w="1040" w:type="dxa"/>
+          </w:tcPr>
+          <w:p>
+            <w:pPr/>
+            <w:r>
+              <w:t xml:space="preserve">14</w:t>
+            </w:r>
+          </w:p>
+        </w:tc>
+        <w:tc>
+          <w:tcPr>
+            <w:tcW w:w="1040" w:type="dxa"/>
+          </w:tcPr>
+          <w:p>
+            <w:pPr/>
+            <w:r>
+              <w:t xml:space="preserve">$353</w:t>
+            </w:r>
+          </w:p>
+        </w:tc>
+        <w:tc>
+          <w:tcPr>
+            <w:tcW w:w="1040" w:type="dxa"/>
+          </w:tcPr>
+          <w:p>
+            <w:pPr/>
+            <w:r>
+              <w:t xml:space="preserve">17</w:t>
+            </w:r>
+          </w:p>
+        </w:tc>
+        <w:tc>
+          <w:tcPr>
+            <w:tcW w:w="1040" w:type="dxa"/>
+          </w:tcPr>
+          <w:p>
+            <w:pPr/>
+            <w:r>
+              <w:t xml:space="preserve">64%</w:t>
+            </w:r>
+          </w:p>
+        </w:tc>
+        <w:tc>
+          <w:tcPr>
+            <w:tcW w:w="1040" w:type="dxa"/>
+          </w:tcPr>
+          <w:p>
+            <w:pPr/>
+            <w:r>
+              <w:t xml:space="preserve">$3.43</w:t>
+            </w:r>
+          </w:p>
+        </w:tc>
+        <w:tc>
+          <w:tcPr>
+            <w:tcW w:w="1040" w:type="dxa"/>
+          </w:tcPr>
+          <w:p>
+            <w:pPr/>
+            <w:r>
+              <w:t xml:space="preserve">$1.02</w:t>
+            </w:r>
+          </w:p>
+        </w:tc>
+        <w:tc>
+          <w:tcPr>
+            <w:tcW w:w="1040" w:type="dxa"/>
+          </w:tcPr>
+          <w:p>
+            <w:pPr/>
+            <w:r>
+              <w:t xml:space="preserve">3.4×</w:t>
+            </w:r>
+          </w:p>
+        </w:tc>
+        <w:tc>
+          <w:tcPr>
+            <w:tcW w:w="1040" w:type="dxa"/>
+          </w:tcPr>
+          <w:p>
+            <w:pPr/>
+            <w:r>
+              <w:t xml:space="preserve">$248</w:t>
+            </w:r>
+          </w:p>
+        </w:tc>
+      </w:tr>
+      <w:tr>
+        <w:tc>
+          <w:tcPr>
+            <w:tcW w:w="1040" w:type="dxa"/>
+          </w:tcPr>
+          <w:p>
+            <w:pPr/>
+            <w:r>
+              <w:t xml:space="preserve">satin sheets king</w:t>
+            </w:r>
+          </w:p>
+        </w:tc>
+        <w:tc>
+          <w:tcPr>
+            <w:tcW w:w="1040" w:type="dxa"/>
+          </w:tcPr>
+          <w:p>
+            <w:pPr/>
+            <w:r>
+              <w:t xml:space="preserve">6</w:t>
+            </w:r>
+          </w:p>
+        </w:tc>
+        <w:tc>
+          <w:tcPr>
+            <w:tcW w:w="1040" w:type="dxa"/>
+          </w:tcPr>
+          <w:p>
+            <w:pPr/>
+            <w:r>
+              <w:t xml:space="preserve">$519</w:t>
+            </w:r>
+          </w:p>
+        </w:tc>
+        <w:tc>
+          <w:tcPr>
+            <w:tcW w:w="1040" w:type="dxa"/>
+          </w:tcPr>
+          <w:p>
+            <w:pPr/>
+            <w:r>
+              <w:t xml:space="preserve">47</w:t>
+            </w:r>
+          </w:p>
+        </w:tc>
+        <w:tc>
+          <w:tcPr>
+            <w:tcW w:w="1040" w:type="dxa"/>
+          </w:tcPr>
+          <w:p>
+            <w:pPr/>
+            <w:r>
+              <w:t xml:space="preserve">33%</w:t>
+            </w:r>
+          </w:p>
+        </w:tc>
+        <w:tc>
+          <w:tcPr>
+            <w:tcW w:w="1040" w:type="dxa"/>
+          </w:tcPr>
+          <w:p>
+            <w:pPr/>
+            <w:r>
+              <w:t xml:space="preserve">$2.27</w:t>
+            </w:r>
+          </w:p>
+        </w:tc>
+        <w:tc>
+          <w:tcPr>
+            <w:tcW w:w="1040" w:type="dxa"/>
+          </w:tcPr>
+          <w:p>
+            <w:pPr/>
+            <w:r>
+              <w:t xml:space="preserve">$1.33</w:t>
+            </w:r>
+          </w:p>
+        </w:tc>
+        <w:tc>
+          <w:tcPr>
+            <w:tcW w:w="1040" w:type="dxa"/>
+          </w:tcPr>
+          <w:p>
+            <w:pPr/>
+            <w:r>
+              <w:t xml:space="preserve">1.7×</w:t>
+            </w:r>
+          </w:p>
+        </w:tc>
+        <w:tc>
+          <w:tcPr>
+            <w:tcW w:w="1040" w:type="dxa"/>
+          </w:tcPr>
+          <w:p>
+            <w:pPr/>
+            <w:r>
+              <w:t xml:space="preserve">$214</w:t>
+            </w:r>
+          </w:p>
+        </w:tc>
+      </w:tr>
+      <w:tr>
+        <w:tc>
+          <w:tcPr>
+            <w:tcW w:w="1040" w:type="dxa"/>
+          </w:tcPr>
+          <w:p>
+            <w:pPr/>
+            <w:r>
+              <w:t xml:space="preserve">silk sheets twin</w:t>
+            </w:r>
+          </w:p>
+        </w:tc>
+        <w:tc>
+          <w:tcPr>
+            <w:tcW w:w="1040" w:type="dxa"/>
+          </w:tcPr>
+          <w:p>
+            <w:pPr/>
+            <w:r>
+              <w:t xml:space="preserve">15</w:t>
+            </w:r>
+          </w:p>
+        </w:tc>
+        <w:tc>
+          <w:tcPr>
+            <w:tcW w:w="1040" w:type="dxa"/>
+          </w:tcPr>
+          <w:p>
+            <w:pPr/>
+            <w:r>
+              <w:t xml:space="preserve">$280</w:t>
+            </w:r>
+          </w:p>
+        </w:tc>
+        <w:tc>
+          <w:tcPr>
+            <w:tcW w:w="1040" w:type="dxa"/>
+          </w:tcPr>
+          <w:p>
+            <w:pPr/>
+            <w:r>
+              <w:t xml:space="preserve">11</w:t>
+            </w:r>
+          </w:p>
+        </w:tc>
+        <w:tc>
+          <w:tcPr>
+            <w:tcW w:w="1040" w:type="dxa"/>
+          </w:tcPr>
+          <w:p>
+            <w:pPr/>
+            <w:r>
+              <w:t xml:space="preserve">90%</w:t>
+            </w:r>
+          </w:p>
+        </w:tc>
+        <w:tc>
+          <w:tcPr>
+            <w:tcW w:w="1040" w:type="dxa"/>
+          </w:tcPr>
+          <w:p>
+            <w:pPr/>
+            <w:r>
+              <w:t xml:space="preserve">$2.64</w:t>
+            </w:r>
+          </w:p>
+        </w:tc>
+        <w:tc>
+          <w:tcPr>
+            <w:tcW w:w="1040" w:type="dxa"/>
+          </w:tcPr>
+          <w:p>
+            <w:pPr/>
+            <w:r>
+              <w:t xml:space="preserve">$0.64</w:t>
+            </w:r>
+          </w:p>
+        </w:tc>
+        <w:tc>
+          <w:tcPr>
+            <w:tcW w:w="1040" w:type="dxa"/>
+          </w:tcPr>
+          <w:p>
+            <w:pPr/>
+            <w:r>
+              <w:t xml:space="preserve">4.1×</w:t>
+            </w:r>
+          </w:p>
+        </w:tc>
+        <w:tc>
+          <w:tcPr>
+            <w:tcW w:w="1040" w:type="dxa"/>
+          </w:tcPr>
+          <w:p>
+            <w:pPr/>
+            <w:r>
+              <w:t xml:space="preserve">$212</w:t>
+            </w:r>
+          </w:p>
+        </w:tc>
+      </w:tr>
+      <w:tr>
+        <w:tc>
+          <w:tcPr>
+            <w:tcW w:w="1040" w:type="dxa"/>
+          </w:tcPr>
+          <w:p>
+            <w:pPr/>
+            <w:r>
+              <w:t xml:space="preserve">king satin sheets</w:t>
+            </w:r>
+          </w:p>
+        </w:tc>
+        <w:tc>
+          <w:tcPr>
+            <w:tcW w:w="1040" w:type="dxa"/>
+          </w:tcPr>
+          <w:p>
+            <w:pPr/>
+            <w:r>
+              <w:t xml:space="preserve">8</w:t>
+            </w:r>
+          </w:p>
+        </w:tc>
+        <w:tc>
+          <w:tcPr>
+            <w:tcW w:w="1040" w:type="dxa"/>
+          </w:tcPr>
+          <w:p>
+            <w:pPr/>
+            <w:r>
+              <w:t xml:space="preserve">$284</w:t>
+            </w:r>
+          </w:p>
+        </w:tc>
+        <w:tc>
+          <w:tcPr>
+            <w:tcW w:w="1040" w:type="dxa"/>
+          </w:tcPr>
+          <w:p>
+            <w:pPr/>
+            <w:r>
+              <w:t xml:space="preserve">13</w:t>
+            </w:r>
+          </w:p>
+        </w:tc>
+        <w:tc>
+          <w:tcPr>
+            <w:tcW w:w="1040" w:type="dxa"/>
+          </w:tcPr>
+          <w:p>
+            <w:pPr/>
+            <w:r>
+              <w:t xml:space="preserve">69%</w:t>
+            </w:r>
+          </w:p>
+        </w:tc>
+        <w:tc>
+          <w:tcPr>
+            <w:tcW w:w="1040" w:type="dxa"/>
+          </w:tcPr>
+          <w:p>
+            <w:pPr/>
+            <w:r>
+              <w:t xml:space="preserve">$2.20</w:t>
+            </w:r>
+          </w:p>
+        </w:tc>
+        <w:tc>
+          <w:tcPr>
+            <w:tcW w:w="1040" w:type="dxa"/>
+          </w:tcPr>
+          <w:p>
+            <w:pPr/>
+            <w:r>
+              <w:t xml:space="preserve">$0.63</w:t>
+            </w:r>
+          </w:p>
+        </w:tc>
+        <w:tc>
+          <w:tcPr>
+            <w:tcW w:w="1040" w:type="dxa"/>
+          </w:tcPr>
+          <w:p>
+            <w:pPr/>
+            <w:r>
+              <w:t xml:space="preserve">3.5×</w:t>
+            </w:r>
+          </w:p>
+        </w:tc>
+        <w:tc>
+          <w:tcPr>
+            <w:tcW w:w="1040" w:type="dxa"/>
+          </w:tcPr>
+          <w:p>
+            <w:pPr/>
+            <w:r>
+              <w:t xml:space="preserve">$204</w:t>
+            </w:r>
+          </w:p>
+        </w:tc>
+      </w:tr>
+      <w:tr>
+        <w:tc>
+          <w:tcPr>
+            <w:tcW w:w="1040" w:type="dxa"/>
+          </w:tcPr>
+          <w:p>
+            <w:pPr/>
+            <w:r>
+              <w:t xml:space="preserve">silk sheets queen</w:t>
+            </w:r>
+          </w:p>
+        </w:tc>
+        <w:tc>
+          <w:tcPr>
+            <w:tcW w:w="1040" w:type="dxa"/>
+          </w:tcPr>
+          <w:p>
+            <w:pPr/>
+            <w:r>
+              <w:t xml:space="preserve">8</w:t>
+            </w:r>
+          </w:p>
+        </w:tc>
+        <w:tc>
+          <w:tcPr>
+            <w:tcW w:w="1040" w:type="dxa"/>
+          </w:tcPr>
+          <w:p>
+            <w:pPr/>
+            <w:r>
+              <w:t xml:space="preserve">$547</w:t>
+            </w:r>
+          </w:p>
+        </w:tc>
+        <w:tc>
+          <w:tcPr>
+            <w:tcW w:w="1040" w:type="dxa"/>
+          </w:tcPr>
+          <w:p>
+            <w:pPr/>
+            <w:r>
+              <w:t xml:space="preserve">59</w:t>
+            </w:r>
+          </w:p>
+        </w:tc>
+        <w:tc>
+          <w:tcPr>
+            <w:tcW w:w="1040" w:type="dxa"/>
+          </w:tcPr>
+          <w:p>
+            <w:pPr/>
+            <w:r>
+              <w:t xml:space="preserve">31%</w:t>
+            </w:r>
+          </w:p>
+        </w:tc>
+        <w:tc>
+          <w:tcPr>
+            <w:tcW w:w="1040" w:type="dxa"/>
+          </w:tcPr>
+          <w:p>
+            <w:pPr/>
+            <w:r>
+              <w:t xml:space="preserve">$1.70</w:t>
+            </w:r>
+          </w:p>
+        </w:tc>
+        <w:tc>
+          <w:tcPr>
+            <w:tcW w:w="1040" w:type="dxa"/>
+          </w:tcPr>
+          <w:p>
+            <w:pPr/>
+            <w:r>
+              <w:t xml:space="preserve">$1.14</w:t>
+            </w:r>
+          </w:p>
+        </w:tc>
+        <w:tc>
+          <w:tcPr>
+            <w:tcW w:w="1040" w:type="dxa"/>
+          </w:tcPr>
+          <w:p>
+            <w:pPr/>
+            <w:r>
+              <w:t xml:space="preserve">1.5×</w:t>
+            </w:r>
+          </w:p>
+        </w:tc>
+        <w:tc>
+          <w:tcPr>
+            <w:tcW w:w="1040" w:type="dxa"/>
+          </w:tcPr>
+          <w:p>
+            <w:pPr/>
+            <w:r>
+              <w:t xml:space="preserve">$181</w:t>
+            </w:r>
+          </w:p>
+        </w:tc>
+      </w:tr>
+      <w:tr>
+        <w:tc>
+          <w:tcPr>
+            <w:tcW w:w="1040" w:type="dxa"/>
+          </w:tcPr>
+          <w:p>
+            <w:pPr/>
+            <w:r>
+              <w:t xml:space="preserve">silk sheets</w:t>
+            </w:r>
+          </w:p>
+        </w:tc>
+        <w:tc>
+          <w:tcPr>
+            <w:tcW w:w="1040" w:type="dxa"/>
+          </w:tcPr>
+          <w:p>
+            <w:pPr/>
+            <w:r>
+              <w:t xml:space="preserve">23</w:t>
+            </w:r>
+          </w:p>
+        </w:tc>
+        <w:tc>
+          <w:tcPr>
+            <w:tcW w:w="1040" w:type="dxa"/>
+          </w:tcPr>
+          <w:p>
+            <w:pPr/>
+            <w:r>
+              <w:t xml:space="preserve">$327</w:t>
+            </w:r>
+          </w:p>
+        </w:tc>
+        <w:tc>
+          <w:tcPr>
+            <w:tcW w:w="1040" w:type="dxa"/>
+          </w:tcPr>
+          <w:p>
+            <w:pPr/>
+            <w:r>
+              <w:t xml:space="preserve">26</w:t>
+            </w:r>
+          </w:p>
+        </w:tc>
+        <w:tc>
+          <w:tcPr>
+            <w:tcW w:w="1040" w:type="dxa"/>
+          </w:tcPr>
+          <w:p>
+            <w:pPr/>
+            <w:r>
+              <w:t xml:space="preserve">39%</w:t>
+            </w:r>
+          </w:p>
+        </w:tc>
+        <w:tc>
+          <w:tcPr>
+            <w:tcW w:w="1040" w:type="dxa"/>
+          </w:tcPr>
+          <w:p>
+            <w:pPr/>
+            <w:r>
+              <w:t xml:space="preserve">$1.47</w:t>
+            </w:r>
+          </w:p>
+        </w:tc>
+        <w:tc>
+          <w:tcPr>
+            <w:tcW w:w="1040" w:type="dxa"/>
+          </w:tcPr>
+          <w:p>
+            <w:pPr/>
+            <w:r>
+              <w:t xml:space="preserve">$0.75</w:t>
+            </w:r>
+          </w:p>
+        </w:tc>
+        <w:tc>
+          <w:tcPr>
+            <w:tcW w:w="1040" w:type="dxa"/>
+          </w:tcPr>
+          <w:p>
+            <w:pPr/>
+            <w:r>
+              <w:t xml:space="preserve">2.0×</w:t>
+            </w:r>
+          </w:p>
+        </w:tc>
+        <w:tc>
+          <w:tcPr>
+            <w:tcW w:w="1040" w:type="dxa"/>
+          </w:tcPr>
+          <w:p>
+            <w:pPr/>
+            <w:r>
+              <w:t xml:space="preserve">$160</w:t>
+            </w:r>
+          </w:p>
+        </w:tc>
+      </w:tr>
+      <w:tr>
+        <w:tc>
+          <w:tcPr>
+            <w:tcW w:w="1040" w:type="dxa"/>
+          </w:tcPr>
+          <w:p>
+            <w:pPr/>
+            <w:r>
+              <w:t xml:space="preserve">king size silk sheets</w:t>
+            </w:r>
+          </w:p>
+        </w:tc>
+        <w:tc>
+          <w:tcPr>
+            <w:tcW w:w="1040" w:type="dxa"/>
+          </w:tcPr>
+          <w:p>
+            <w:pPr/>
+            <w:r>
+              <w:t xml:space="preserve">11</w:t>
+            </w:r>
+          </w:p>
+        </w:tc>
+        <w:tc>
+          <w:tcPr>
+            <w:tcW w:w="1040" w:type="dxa"/>
+          </w:tcPr>
+          <w:p>
+            <w:pPr/>
+            <w:r>
+              <w:t xml:space="preserve">$214</w:t>
+            </w:r>
+          </w:p>
+        </w:tc>
+        <w:tc>
+          <w:tcPr>
+            <w:tcW w:w="1040" w:type="dxa"/>
+          </w:tcPr>
+          <w:p>
+            <w:pPr/>
+            <w:r>
+              <w:t xml:space="preserve">9</w:t>
+            </w:r>
+          </w:p>
+        </w:tc>
+        <w:tc>
+          <w:tcPr>
+            <w:tcW w:w="1040" w:type="dxa"/>
+          </w:tcPr>
+          <w:p>
+            <w:pPr/>
+            <w:r>
+              <w:t xml:space="preserve">73%</w:t>
+            </w:r>
+          </w:p>
+        </w:tc>
+        <w:tc>
+          <w:tcPr>
+            <w:tcW w:w="1040" w:type="dxa"/>
+          </w:tcPr>
+          <w:p>
+            <w:pPr/>
+            <w:r>
+              <w:t xml:space="preserve">$3.20</w:t>
+            </w:r>
+          </w:p>
+        </w:tc>
+        <w:tc>
+          <w:tcPr>
+            <w:tcW w:w="1040" w:type="dxa"/>
+          </w:tcPr>
+          <w:p>
+            <w:pPr/>
+            <w:r>
+              <w:t xml:space="preserve">$0.83</w:t>
+            </w:r>
+          </w:p>
+        </w:tc>
+        <w:tc>
+          <w:tcPr>
+            <w:tcW w:w="1040" w:type="dxa"/>
+          </w:tcPr>
+          <w:p>
+            <w:pPr/>
+            <w:r>
+              <w:t xml:space="preserve">3.8×</w:t>
+            </w:r>
+          </w:p>
+        </w:tc>
+        <w:tc>
+          <w:tcPr>
+            <w:tcW w:w="1040" w:type="dxa"/>
+          </w:tcPr>
+          <w:p>
+            <w:pPr/>
+            <w:r>
+              <w:t xml:space="preserve">$158</w:t>
+            </w:r>
+          </w:p>
+        </w:tc>
+      </w:tr>
+      <w:tr>
+        <w:tc>
+          <w:tcPr>
+            <w:tcW w:w="1040" w:type="dxa"/>
+          </w:tcPr>
+          <w:p>
+            <w:pPr/>
+            <w:r>
+              <w:t xml:space="preserve">satin sheets full</w:t>
+            </w:r>
+          </w:p>
+        </w:tc>
+        <w:tc>
+          <w:tcPr>
+            <w:tcW w:w="1040" w:type="dxa"/>
+          </w:tcPr>
+          <w:p>
+            <w:pPr/>
+            <w:r>
+              <w:t xml:space="preserve">7</w:t>
+            </w:r>
+          </w:p>
+        </w:tc>
+        <w:tc>
+          <w:tcPr>
+            <w:tcW w:w="1040" w:type="dxa"/>
+          </w:tcPr>
+          <w:p>
+            <w:pPr/>
+            <w:r>
+              <w:t xml:space="preserve">$390</w:t>
+            </w:r>
+          </w:p>
+        </w:tc>
+        <w:tc>
+          <w:tcPr>
+            <w:tcW w:w="1040" w:type="dxa"/>
+          </w:tcPr>
+          <w:p>
+            <w:pPr/>
+            <w:r>
+              <w:t xml:space="preserve">39</w:t>
+            </w:r>
+          </w:p>
+        </w:tc>
+        <w:tc>
+          <w:tcPr>
+            <w:tcW w:w="1040" w:type="dxa"/>
+          </w:tcPr>
+          <w:p>
+            <w:pPr/>
+            <w:r>
+              <w:t xml:space="preserve">34%</w:t>
+            </w:r>
+          </w:p>
+        </w:tc>
+        <w:tc>
+          <w:tcPr>
+            <w:tcW w:w="1040" w:type="dxa"/>
+          </w:tcPr>
+          <w:p>
+            <w:pPr/>
+            <w:r>
+              <w:t xml:space="preserve">$2.57</w:t>
+            </w:r>
+          </w:p>
+        </w:tc>
+        <w:tc>
+          <w:tcPr>
+            <w:tcW w:w="1040" w:type="dxa"/>
+          </w:tcPr>
+          <w:p>
+            <w:pPr/>
+            <w:r>
+              <w:t xml:space="preserve">$1.59</w:t>
+            </w:r>
+          </w:p>
+        </w:tc>
+        <w:tc>
+          <w:tcPr>
+            <w:tcW w:w="1040" w:type="dxa"/>
+          </w:tcPr>
+          <w:p>
+            <w:pPr/>
+            <w:r>
+              <w:t xml:space="preserve">1.6×</w:t>
+            </w:r>
+          </w:p>
+        </w:tc>
+        <w:tc>
+          <w:tcPr>
+            <w:tcW w:w="1040" w:type="dxa"/>
+          </w:tcPr>
+          <w:p>
+            <w:pPr/>
+            <w:r>
+              <w:t xml:space="preserve">$148</w:t>
+            </w:r>
+          </w:p>
+        </w:tc>
+      </w:tr>
+      <w:tr>
+        <w:tc>
+          <w:tcPr>
+            <w:tcW w:w="1040" w:type="dxa"/>
+          </w:tcPr>
+          <w:p>
+            <w:pPr/>
+            <w:r>
+              <w:t xml:space="preserve">king size satin sheet set</w:t>
+            </w:r>
+          </w:p>
+        </w:tc>
+        <w:tc>
+          <w:tcPr>
+            <w:tcW w:w="1040" w:type="dxa"/>
           </w:tcPr>
           <w:p>
             <w:pPr/>
@@ -4063,86 +5513,198 @@
         </w:tc>
         <w:tc>
           <w:tcPr>
-            <w:tcW w:w="1170" w:type="dxa"/>
-          </w:tcPr>
-          <w:p>
-            <w:pPr/>
-            <w:r>
-              <w:t xml:space="preserve">$1,595</w:t>
-            </w:r>
-          </w:p>
-        </w:tc>
-        <w:tc>
-          <w:tcPr>
-            <w:tcW w:w="1170" w:type="dxa"/>
-          </w:tcPr>
-          <w:p>
-            <w:pPr/>
-            <w:r>
-              <w:t xml:space="preserve">133</w:t>
-            </w:r>
-          </w:p>
-        </w:tc>
-        <w:tc>
-          <w:tcPr>
-            <w:tcW w:w="1170" w:type="dxa"/>
-          </w:tcPr>
-          <w:p>
-            <w:pPr/>
-            <w:r>
-              <w:t xml:space="preserve">40%</w:t>
-            </w:r>
-          </w:p>
-        </w:tc>
-        <w:tc>
-          <w:tcPr>
-            <w:tcW w:w="1170" w:type="dxa"/>
-          </w:tcPr>
-          <w:p>
-            <w:pPr/>
-            <w:r>
-              <w:t xml:space="preserve">$1.89</w:t>
-            </w:r>
-          </w:p>
-        </w:tc>
-        <w:tc>
-          <w:tcPr>
-            <w:tcW w:w="1170" w:type="dxa"/>
-          </w:tcPr>
-          <w:p>
-            <w:pPr/>
-            <w:r>
-              <w:t xml:space="preserve">$1.31</w:t>
-            </w:r>
-          </w:p>
-        </w:tc>
-        <w:tc>
-          <w:tcPr>
-            <w:tcW w:w="1170" w:type="dxa"/>
-          </w:tcPr>
-          <w:p>
-            <w:pPr/>
-            <w:r>
-              <w:t xml:space="preserve">$495</w:t>
-            </w:r>
-          </w:p>
-        </w:tc>
-      </w:tr>
-      <w:tr>
-        <w:tc>
-          <w:tcPr>
-            <w:tcW w:w="1170" w:type="dxa"/>
-          </w:tcPr>
-          <w:p>
-            <w:pPr/>
-            <w:r>
-              <w:t xml:space="preserve">king size silk sheets set</w:t>
-            </w:r>
-          </w:p>
-        </w:tc>
-        <w:tc>
-          <w:tcPr>
-            <w:tcW w:w="1170" w:type="dxa"/>
+            <w:tcW w:w="1040" w:type="dxa"/>
+          </w:tcPr>
+          <w:p>
+            <w:pPr/>
+            <w:r>
+              <w:t xml:space="preserve">$197</w:t>
+            </w:r>
+          </w:p>
+        </w:tc>
+        <w:tc>
+          <w:tcPr>
+            <w:tcW w:w="1040" w:type="dxa"/>
+          </w:tcPr>
+          <w:p>
+            <w:pPr/>
+            <w:r>
+              <w:t xml:space="preserve">11</w:t>
+            </w:r>
+          </w:p>
+        </w:tc>
+        <w:tc>
+          <w:tcPr>
+            <w:tcW w:w="1040" w:type="dxa"/>
+          </w:tcPr>
+          <w:p>
+            <w:pPr/>
+            <w:r>
+              <w:t xml:space="preserve">58%</w:t>
+            </w:r>
+          </w:p>
+        </w:tc>
+        <w:tc>
+          <w:tcPr>
+            <w:tcW w:w="1040" w:type="dxa"/>
+          </w:tcPr>
+          <w:p>
+            <w:pPr/>
+            <w:r>
+              <w:t xml:space="preserve">$2.90</w:t>
+            </w:r>
+          </w:p>
+        </w:tc>
+        <w:tc>
+          <w:tcPr>
+            <w:tcW w:w="1040" w:type="dxa"/>
+          </w:tcPr>
+          <w:p>
+            <w:pPr/>
+            <w:r>
+              <w:t xml:space="preserve">$1.00</w:t>
+            </w:r>
+          </w:p>
+        </w:tc>
+        <w:tc>
+          <w:tcPr>
+            <w:tcW w:w="1040" w:type="dxa"/>
+          </w:tcPr>
+          <w:p>
+            <w:pPr/>
+            <w:r>
+              <w:t xml:space="preserve">2.9×</w:t>
+            </w:r>
+          </w:p>
+        </w:tc>
+        <w:tc>
+          <w:tcPr>
+            <w:tcW w:w="1040" w:type="dxa"/>
+          </w:tcPr>
+          <w:p>
+            <w:pPr/>
+            <w:r>
+              <w:t xml:space="preserve">$129</w:t>
+            </w:r>
+          </w:p>
+        </w:tc>
+      </w:tr>
+      <w:tr>
+        <w:tc>
+          <w:tcPr>
+            <w:tcW w:w="1040" w:type="dxa"/>
+          </w:tcPr>
+          <w:p>
+            <w:pPr/>
+            <w:r>
+              <w:t xml:space="preserve">red satin sheets</w:t>
+            </w:r>
+          </w:p>
+        </w:tc>
+        <w:tc>
+          <w:tcPr>
+            <w:tcW w:w="1040" w:type="dxa"/>
+          </w:tcPr>
+          <w:p>
+            <w:pPr/>
+            <w:r>
+              <w:t xml:space="preserve">4</w:t>
+            </w:r>
+          </w:p>
+        </w:tc>
+        <w:tc>
+          <w:tcPr>
+            <w:tcW w:w="1040" w:type="dxa"/>
+          </w:tcPr>
+          <w:p>
+            <w:pPr/>
+            <w:r>
+              <w:t xml:space="preserve">$345</w:t>
+            </w:r>
+          </w:p>
+        </w:tc>
+        <w:tc>
+          <w:tcPr>
+            <w:tcW w:w="1040" w:type="dxa"/>
+          </w:tcPr>
+          <w:p>
+            <w:pPr/>
+            <w:r>
+              <w:t xml:space="preserve">36</w:t>
+            </w:r>
+          </w:p>
+        </w:tc>
+        <w:tc>
+          <w:tcPr>
+            <w:tcW w:w="1040" w:type="dxa"/>
+          </w:tcPr>
+          <w:p>
+            <w:pPr/>
+            <w:r>
+              <w:t xml:space="preserve">32%</w:t>
+            </w:r>
+          </w:p>
+        </w:tc>
+        <w:tc>
+          <w:tcPr>
+            <w:tcW w:w="1040" w:type="dxa"/>
+          </w:tcPr>
+          <w:p>
+            <w:pPr/>
+            <w:r>
+              <w:t xml:space="preserve">$1.38</w:t>
+            </w:r>
+          </w:p>
+        </w:tc>
+        <w:tc>
+          <w:tcPr>
+            <w:tcW w:w="1040" w:type="dxa"/>
+          </w:tcPr>
+          <w:p>
+            <w:pPr/>
+            <w:r>
+              <w:t xml:space="preserve">$0.90</w:t>
+            </w:r>
+          </w:p>
+        </w:tc>
+        <w:tc>
+          <w:tcPr>
+            <w:tcW w:w="1040" w:type="dxa"/>
+          </w:tcPr>
+          <w:p>
+            <w:pPr/>
+            <w:r>
+              <w:t xml:space="preserve">1.5×</w:t>
+            </w:r>
+          </w:p>
+        </w:tc>
+        <w:tc>
+          <w:tcPr>
+            <w:tcW w:w="1040" w:type="dxa"/>
+          </w:tcPr>
+          <w:p>
+            <w:pPr/>
+            <w:r>
+              <w:t xml:space="preserve">$121</w:t>
+            </w:r>
+          </w:p>
+        </w:tc>
+      </w:tr>
+      <w:tr>
+        <w:tc>
+          <w:tcPr>
+            <w:tcW w:w="1040" w:type="dxa"/>
+          </w:tcPr>
+          <w:p>
+            <w:pPr/>
+            <w:r>
+              <w:t xml:space="preserve">satin queen sheets set</w:t>
+            </w:r>
+          </w:p>
+        </w:tc>
+        <w:tc>
+          <w:tcPr>
+            <w:tcW w:w="1040" w:type="dxa"/>
           </w:tcPr>
           <w:p>
             <w:pPr/>
@@ -4153,86 +5715,523 @@
         </w:tc>
         <w:tc>
           <w:tcPr>
-            <w:tcW w:w="1170" w:type="dxa"/>
-          </w:tcPr>
-          <w:p>
-            <w:pPr/>
-            <w:r>
-              <w:t xml:space="preserve">$503</w:t>
-            </w:r>
-          </w:p>
-        </w:tc>
-        <w:tc>
-          <w:tcPr>
-            <w:tcW w:w="1170" w:type="dxa"/>
-          </w:tcPr>
-          <w:p>
-            <w:pPr/>
-            <w:r>
-              <w:t xml:space="preserve">28</w:t>
-            </w:r>
-          </w:p>
-        </w:tc>
-        <w:tc>
-          <w:tcPr>
-            <w:tcW w:w="1170" w:type="dxa"/>
-          </w:tcPr>
-          <w:p>
-            <w:pPr/>
-            <w:r>
-              <w:t xml:space="preserve">55%</w:t>
-            </w:r>
-          </w:p>
-        </w:tc>
-        <w:tc>
-          <w:tcPr>
-            <w:tcW w:w="1170" w:type="dxa"/>
-          </w:tcPr>
-          <w:p>
-            <w:pPr/>
-            <w:r>
-              <w:t xml:space="preserve">$3.54</w:t>
-            </w:r>
-          </w:p>
-        </w:tc>
-        <w:tc>
-          <w:tcPr>
-            <w:tcW w:w="1170" w:type="dxa"/>
-          </w:tcPr>
-          <w:p>
-            <w:pPr/>
-            <w:r>
-              <w:t xml:space="preserve">$1.60</w:t>
-            </w:r>
-          </w:p>
-        </w:tc>
-        <w:tc>
-          <w:tcPr>
-            <w:tcW w:w="1170" w:type="dxa"/>
-          </w:tcPr>
-          <w:p>
-            <w:pPr/>
-            <w:r>
-              <w:t xml:space="preserve">$277</w:t>
-            </w:r>
-          </w:p>
-        </w:tc>
-      </w:tr>
-      <w:tr>
-        <w:tc>
-          <w:tcPr>
-            <w:tcW w:w="1170" w:type="dxa"/>
-          </w:tcPr>
-          <w:p>
-            <w:pPr/>
-            <w:r>
-              <w:t xml:space="preserve">king silk sheets</w:t>
-            </w:r>
-          </w:p>
-        </w:tc>
-        <w:tc>
-          <w:tcPr>
-            <w:tcW w:w="1170" w:type="dxa"/>
+            <w:tcW w:w="1040" w:type="dxa"/>
+          </w:tcPr>
+          <w:p>
+            <w:pPr/>
+            <w:r>
+              <w:t xml:space="preserve">$170</w:t>
+            </w:r>
+          </w:p>
+        </w:tc>
+        <w:tc>
+          <w:tcPr>
+            <w:tcW w:w="1040" w:type="dxa"/>
+          </w:tcPr>
+          <w:p>
+            <w:pPr/>
+            <w:r>
+              <w:t xml:space="preserve">9</w:t>
+            </w:r>
+          </w:p>
+        </w:tc>
+        <w:tc>
+          <w:tcPr>
+            <w:tcW w:w="1040" w:type="dxa"/>
+          </w:tcPr>
+          <w:p>
+            <w:pPr/>
+            <w:r>
+              <w:t xml:space="preserve">66%</w:t>
+            </w:r>
+          </w:p>
+        </w:tc>
+        <w:tc>
+          <w:tcPr>
+            <w:tcW w:w="1040" w:type="dxa"/>
+          </w:tcPr>
+          <w:p>
+            <w:pPr/>
+            <w:r>
+              <w:t xml:space="preserve">$1.77</w:t>
+            </w:r>
+          </w:p>
+        </w:tc>
+        <w:tc>
+          <w:tcPr>
+            <w:tcW w:w="1040" w:type="dxa"/>
+          </w:tcPr>
+          <w:p>
+            <w:pPr/>
+            <w:r>
+              <w:t xml:space="preserve">$0.58</w:t>
+            </w:r>
+          </w:p>
+        </w:tc>
+        <w:tc>
+          <w:tcPr>
+            <w:tcW w:w="1040" w:type="dxa"/>
+          </w:tcPr>
+          <w:p>
+            <w:pPr/>
+            <w:r>
+              <w:t xml:space="preserve">3.0×</w:t>
+            </w:r>
+          </w:p>
+        </w:tc>
+        <w:tc>
+          <w:tcPr>
+            <w:tcW w:w="1040" w:type="dxa"/>
+          </w:tcPr>
+          <w:p>
+            <w:pPr/>
+            <w:r>
+              <w:t xml:space="preserve">$114</w:t>
+            </w:r>
+          </w:p>
+        </w:tc>
+      </w:tr>
+      <w:tr>
+        <w:tc>
+          <w:tcPr>
+            <w:tcW w:w="1040" w:type="dxa"/>
+          </w:tcPr>
+          <w:p>
+            <w:pPr/>
+            <w:r>
+              <w:t xml:space="preserve">silk twin bed sheets</w:t>
+            </w:r>
+          </w:p>
+        </w:tc>
+        <w:tc>
+          <w:tcPr>
+            <w:tcW w:w="1040" w:type="dxa"/>
+          </w:tcPr>
+          <w:p>
+            <w:pPr/>
+            <w:r>
+              <w:t xml:space="preserve">7</w:t>
+            </w:r>
+          </w:p>
+        </w:tc>
+        <w:tc>
+          <w:tcPr>
+            <w:tcW w:w="1040" w:type="dxa"/>
+          </w:tcPr>
+          <w:p>
+            <w:pPr/>
+            <w:r>
+              <w:t xml:space="preserve">$227</w:t>
+            </w:r>
+          </w:p>
+        </w:tc>
+        <w:tc>
+          <w:tcPr>
+            <w:tcW w:w="1040" w:type="dxa"/>
+          </w:tcPr>
+          <w:p>
+            <w:pPr/>
+            <w:r>
+              <w:t xml:space="preserve">20</w:t>
+            </w:r>
+          </w:p>
+        </w:tc>
+        <w:tc>
+          <w:tcPr>
+            <w:tcW w:w="1040" w:type="dxa"/>
+          </w:tcPr>
+          <w:p>
+            <w:pPr/>
+            <w:r>
+              <w:t xml:space="preserve">43%</w:t>
+            </w:r>
+          </w:p>
+        </w:tc>
+        <w:tc>
+          <w:tcPr>
+            <w:tcW w:w="1040" w:type="dxa"/>
+          </w:tcPr>
+          <w:p>
+            <w:pPr/>
+            <w:r>
+              <w:t xml:space="preserve">$3.29</w:t>
+            </w:r>
+          </w:p>
+        </w:tc>
+        <w:tc>
+          <w:tcPr>
+            <w:tcW w:w="1040" w:type="dxa"/>
+          </w:tcPr>
+          <w:p>
+            <w:pPr/>
+            <w:r>
+              <w:t xml:space="preserve">$1.80</w:t>
+            </w:r>
+          </w:p>
+        </w:tc>
+        <w:tc>
+          <w:tcPr>
+            <w:tcW w:w="1040" w:type="dxa"/>
+          </w:tcPr>
+          <w:p>
+            <w:pPr/>
+            <w:r>
+              <w:t xml:space="preserve">1.8×</w:t>
+            </w:r>
+          </w:p>
+        </w:tc>
+        <w:tc>
+          <w:tcPr>
+            <w:tcW w:w="1040" w:type="dxa"/>
+          </w:tcPr>
+          <w:p>
+            <w:pPr/>
+            <w:r>
+              <w:t xml:space="preserve">$103</w:t>
+            </w:r>
+          </w:p>
+        </w:tc>
+      </w:tr>
+      <w:tr>
+        <w:tc>
+          <w:tcPr>
+            <w:tcW w:w="1040" w:type="dxa"/>
+          </w:tcPr>
+          <w:p>
+            <w:pPr/>
+            <w:r>
+              <w:t xml:space="preserve">silk sheets full</w:t>
+            </w:r>
+          </w:p>
+        </w:tc>
+        <w:tc>
+          <w:tcPr>
+            <w:tcW w:w="1040" w:type="dxa"/>
+          </w:tcPr>
+          <w:p>
+            <w:pPr/>
+            <w:r>
+              <w:t xml:space="preserve">9</w:t>
+            </w:r>
+          </w:p>
+        </w:tc>
+        <w:tc>
+          <w:tcPr>
+            <w:tcW w:w="1040" w:type="dxa"/>
+          </w:tcPr>
+          <w:p>
+            <w:pPr/>
+            <w:r>
+              <w:t xml:space="preserve">$288</w:t>
+            </w:r>
+          </w:p>
+        </w:tc>
+        <w:tc>
+          <w:tcPr>
+            <w:tcW w:w="1040" w:type="dxa"/>
+          </w:tcPr>
+          <w:p>
+            <w:pPr/>
+            <w:r>
+              <w:t xml:space="preserve">30</w:t>
+            </w:r>
+          </w:p>
+        </w:tc>
+        <w:tc>
+          <w:tcPr>
+            <w:tcW w:w="1040" w:type="dxa"/>
+          </w:tcPr>
+          <w:p>
+            <w:pPr/>
+            <w:r>
+              <w:t xml:space="preserve">33%</w:t>
+            </w:r>
+          </w:p>
+        </w:tc>
+        <w:tc>
+          <w:tcPr>
+            <w:tcW w:w="1040" w:type="dxa"/>
+          </w:tcPr>
+          <w:p>
+            <w:pPr/>
+            <w:r>
+              <w:t xml:space="preserve">$2.18</w:t>
+            </w:r>
+          </w:p>
+        </w:tc>
+        <w:tc>
+          <w:tcPr>
+            <w:tcW w:w="1040" w:type="dxa"/>
+          </w:tcPr>
+          <w:p>
+            <w:pPr/>
+            <w:r>
+              <w:t xml:space="preserve">$1.41</w:t>
+            </w:r>
+          </w:p>
+        </w:tc>
+        <w:tc>
+          <w:tcPr>
+            <w:tcW w:w="1040" w:type="dxa"/>
+          </w:tcPr>
+          <w:p>
+            <w:pPr/>
+            <w:r>
+              <w:t xml:space="preserve">1.5×</w:t>
+            </w:r>
+          </w:p>
+        </w:tc>
+        <w:tc>
+          <w:tcPr>
+            <w:tcW w:w="1040" w:type="dxa"/>
+          </w:tcPr>
+          <w:p>
+            <w:pPr/>
+            <w:r>
+              <w:t xml:space="preserve">$101</w:t>
+            </w:r>
+          </w:p>
+        </w:tc>
+      </w:tr>
+      <w:tr>
+        <w:tc>
+          <w:tcPr>
+            <w:tcW w:w="1040" w:type="dxa"/>
+          </w:tcPr>
+          <w:p>
+            <w:pPr/>
+            <w:r>
+              <w:t xml:space="preserve">satin sheets queen</w:t>
+            </w:r>
+          </w:p>
+        </w:tc>
+        <w:tc>
+          <w:tcPr>
+            <w:tcW w:w="1040" w:type="dxa"/>
+          </w:tcPr>
+          <w:p>
+            <w:pPr/>
+            <w:r>
+              <w:t xml:space="preserve">7</w:t>
+            </w:r>
+          </w:p>
+        </w:tc>
+        <w:tc>
+          <w:tcPr>
+            <w:tcW w:w="1040" w:type="dxa"/>
+          </w:tcPr>
+          <w:p>
+            <w:pPr/>
+            <w:r>
+              <w:t xml:space="preserve">$180</w:t>
+            </w:r>
+          </w:p>
+        </w:tc>
+        <w:tc>
+          <w:tcPr>
+            <w:tcW w:w="1040" w:type="dxa"/>
+          </w:tcPr>
+          <w:p>
+            <w:pPr/>
+            <w:r>
+              <w:t xml:space="preserve">12</w:t>
+            </w:r>
+          </w:p>
+        </w:tc>
+        <w:tc>
+          <w:tcPr>
+            <w:tcW w:w="1040" w:type="dxa"/>
+          </w:tcPr>
+          <w:p>
+            <w:pPr/>
+            <w:r>
+              <w:t xml:space="preserve">45%</w:t>
+            </w:r>
+          </w:p>
+        </w:tc>
+        <w:tc>
+          <w:tcPr>
+            <w:tcW w:w="1040" w:type="dxa"/>
+          </w:tcPr>
+          <w:p>
+            <w:pPr/>
+            <w:r>
+              <w:t xml:space="preserve">$2.64</w:t>
+            </w:r>
+          </w:p>
+        </w:tc>
+        <w:tc>
+          <w:tcPr>
+            <w:tcW w:w="1040" w:type="dxa"/>
+          </w:tcPr>
+          <w:p>
+            <w:pPr/>
+            <w:r>
+              <w:t xml:space="preserve">$1.19</w:t>
+            </w:r>
+          </w:p>
+        </w:tc>
+        <w:tc>
+          <w:tcPr>
+            <w:tcW w:w="1040" w:type="dxa"/>
+          </w:tcPr>
+          <w:p>
+            <w:pPr/>
+            <w:r>
+              <w:t xml:space="preserve">2.2×</w:t>
+            </w:r>
+          </w:p>
+        </w:tc>
+        <w:tc>
+          <w:tcPr>
+            <w:tcW w:w="1040" w:type="dxa"/>
+          </w:tcPr>
+          <w:p>
+            <w:pPr/>
+            <w:r>
+              <w:t xml:space="preserve">$99</w:t>
+            </w:r>
+          </w:p>
+        </w:tc>
+      </w:tr>
+      <w:tr>
+        <w:tc>
+          <w:tcPr>
+            <w:tcW w:w="1040" w:type="dxa"/>
+          </w:tcPr>
+          <w:p>
+            <w:pPr/>
+            <w:r>
+              <w:t xml:space="preserve">black silk sheets</w:t>
+            </w:r>
+          </w:p>
+        </w:tc>
+        <w:tc>
+          <w:tcPr>
+            <w:tcW w:w="1040" w:type="dxa"/>
+          </w:tcPr>
+          <w:p>
+            <w:pPr/>
+            <w:r>
+              <w:t xml:space="preserve">12</w:t>
+            </w:r>
+          </w:p>
+        </w:tc>
+        <w:tc>
+          <w:tcPr>
+            <w:tcW w:w="1040" w:type="dxa"/>
+          </w:tcPr>
+          <w:p>
+            <w:pPr/>
+            <w:r>
+              <w:t xml:space="preserve">$245</w:t>
+            </w:r>
+          </w:p>
+        </w:tc>
+        <w:tc>
+          <w:tcPr>
+            <w:tcW w:w="1040" w:type="dxa"/>
+          </w:tcPr>
+          <w:p>
+            <w:pPr/>
+            <w:r>
+              <w:t xml:space="preserve">23</w:t>
+            </w:r>
+          </w:p>
+        </w:tc>
+        <w:tc>
+          <w:tcPr>
+            <w:tcW w:w="1040" w:type="dxa"/>
+          </w:tcPr>
+          <w:p>
+            <w:pPr/>
+            <w:r>
+              <w:t xml:space="preserve">33%</w:t>
+            </w:r>
+          </w:p>
+        </w:tc>
+        <w:tc>
+          <w:tcPr>
+            <w:tcW w:w="1040" w:type="dxa"/>
+          </w:tcPr>
+          <w:p>
+            <w:pPr/>
+            <w:r>
+              <w:t xml:space="preserve">$1.68</w:t>
+            </w:r>
+          </w:p>
+        </w:tc>
+        <w:tc>
+          <w:tcPr>
+            <w:tcW w:w="1040" w:type="dxa"/>
+          </w:tcPr>
+          <w:p>
+            <w:pPr/>
+            <w:r>
+              <w:t xml:space="preserve">$1.06</w:t>
+            </w:r>
+          </w:p>
+        </w:tc>
+        <w:tc>
+          <w:tcPr>
+            <w:tcW w:w="1040" w:type="dxa"/>
+          </w:tcPr>
+          <w:p>
+            <w:pPr/>
+            <w:r>
+              <w:t xml:space="preserve">1.6×</w:t>
+            </w:r>
+          </w:p>
+        </w:tc>
+        <w:tc>
+          <w:tcPr>
+            <w:tcW w:w="1040" w:type="dxa"/>
+          </w:tcPr>
+          <w:p>
+            <w:pPr/>
+            <w:r>
+              <w:t xml:space="preserve">$89</w:t>
+            </w:r>
+          </w:p>
+        </w:tc>
+      </w:tr>
+      <w:tr>
+        <w:tc>
+          <w:tcPr>
+            <w:tcW w:w="1040" w:type="dxa"/>
+          </w:tcPr>
+          <w:p>
+            <w:pPr/>
+            <w:r>
+              <w:t xml:space="preserve">silk bedsheets</w:t>
+            </w:r>
+          </w:p>
+        </w:tc>
+        <w:tc>
+          <w:tcPr>
+            <w:tcW w:w="1040" w:type="dxa"/>
+          </w:tcPr>
+          <w:p>
+            <w:pPr/>
+            <w:r>
+              <w:t xml:space="preserve">16</w:t>
+            </w:r>
+          </w:p>
+        </w:tc>
+        <w:tc>
+          <w:tcPr>
+            <w:tcW w:w="1040" w:type="dxa"/>
+          </w:tcPr>
+          <w:p>
+            <w:pPr/>
+            <w:r>
+              <w:t xml:space="preserve">$175</w:t>
+            </w:r>
+          </w:p>
+        </w:tc>
+        <w:tc>
+          <w:tcPr>
+            <w:tcW w:w="1040" w:type="dxa"/>
           </w:tcPr>
           <w:p>
             <w:pPr/>
@@ -4243,141 +6242,29 @@
         </w:tc>
         <w:tc>
           <w:tcPr>
-            <w:tcW w:w="1170" w:type="dxa"/>
-          </w:tcPr>
-          <w:p>
-            <w:pPr/>
-            <w:r>
-              <w:t xml:space="preserve">$353</w:t>
-            </w:r>
-          </w:p>
-        </w:tc>
-        <w:tc>
-          <w:tcPr>
-            <w:tcW w:w="1170" w:type="dxa"/>
-          </w:tcPr>
-          <w:p>
-            <w:pPr/>
-            <w:r>
-              <w:t xml:space="preserve">17</w:t>
-            </w:r>
-          </w:p>
-        </w:tc>
-        <w:tc>
-          <w:tcPr>
-            <w:tcW w:w="1170" w:type="dxa"/>
-          </w:tcPr>
-          <w:p>
-            <w:pPr/>
-            <w:r>
-              <w:t xml:space="preserve">64%</w:t>
-            </w:r>
-          </w:p>
-        </w:tc>
-        <w:tc>
-          <w:tcPr>
-            <w:tcW w:w="1170" w:type="dxa"/>
-          </w:tcPr>
-          <w:p>
-            <w:pPr/>
-            <w:r>
-              <w:t xml:space="preserve">$3.43</w:t>
-            </w:r>
-          </w:p>
-        </w:tc>
-        <w:tc>
-          <w:tcPr>
-            <w:tcW w:w="1170" w:type="dxa"/>
-          </w:tcPr>
-          <w:p>
-            <w:pPr/>
-            <w:r>
-              <w:t xml:space="preserve">$1.34</w:t>
-            </w:r>
-          </w:p>
-        </w:tc>
-        <w:tc>
-          <w:tcPr>
-            <w:tcW w:w="1170" w:type="dxa"/>
-          </w:tcPr>
-          <w:p>
-            <w:pPr/>
-            <w:r>
-              <w:t xml:space="preserve">$216</w:t>
-            </w:r>
-          </w:p>
-        </w:tc>
-      </w:tr>
-      <w:tr>
-        <w:tc>
-          <w:tcPr>
-            <w:tcW w:w="1170" w:type="dxa"/>
-          </w:tcPr>
-          <w:p>
-            <w:pPr/>
-            <w:r>
-              <w:t xml:space="preserve">silk sheets twin</w:t>
-            </w:r>
-          </w:p>
-        </w:tc>
-        <w:tc>
-          <w:tcPr>
-            <w:tcW w:w="1170" w:type="dxa"/>
-          </w:tcPr>
-          <w:p>
-            <w:pPr/>
-            <w:r>
-              <w:t xml:space="preserve">15</w:t>
-            </w:r>
-          </w:p>
-        </w:tc>
-        <w:tc>
-          <w:tcPr>
-            <w:tcW w:w="1170" w:type="dxa"/>
-          </w:tcPr>
-          <w:p>
-            <w:pPr/>
-            <w:r>
-              <w:t xml:space="preserve">$280</w:t>
-            </w:r>
-          </w:p>
-        </w:tc>
-        <w:tc>
-          <w:tcPr>
-            <w:tcW w:w="1170" w:type="dxa"/>
-          </w:tcPr>
-          <w:p>
-            <w:pPr/>
-            <w:r>
-              <w:t xml:space="preserve">11</w:t>
-            </w:r>
-          </w:p>
-        </w:tc>
-        <w:tc>
-          <w:tcPr>
-            <w:tcW w:w="1170" w:type="dxa"/>
-          </w:tcPr>
-          <w:p>
-            <w:pPr/>
-            <w:r>
-              <w:t xml:space="preserve">90%</w:t>
-            </w:r>
-          </w:p>
-        </w:tc>
-        <w:tc>
-          <w:tcPr>
-            <w:tcW w:w="1170" w:type="dxa"/>
-          </w:tcPr>
-          <w:p>
-            <w:pPr/>
-            <w:r>
-              <w:t xml:space="preserve">$2.64</w:t>
-            </w:r>
-          </w:p>
-        </w:tc>
-        <w:tc>
-          <w:tcPr>
-            <w:tcW w:w="1170" w:type="dxa"/>
+            <w:tcW w:w="1040" w:type="dxa"/>
+          </w:tcPr>
+          <w:p>
+            <w:pPr/>
+            <w:r>
+              <w:t xml:space="preserve">43%</w:t>
+            </w:r>
+          </w:p>
+        </w:tc>
+        <w:tc>
+          <w:tcPr>
+            <w:tcW w:w="1040" w:type="dxa"/>
+          </w:tcPr>
+          <w:p>
+            <w:pPr/>
+            <w:r>
+              <w:t xml:space="preserve">$1.70</w:t>
+            </w:r>
+          </w:p>
+        </w:tc>
+        <w:tc>
+          <w:tcPr>
+            <w:tcW w:w="1040" w:type="dxa"/>
           </w:tcPr>
           <w:p>
             <w:pPr/>
@@ -4388,143 +6275,42 @@
         </w:tc>
         <w:tc>
           <w:tcPr>
-            <w:tcW w:w="1170" w:type="dxa"/>
-          </w:tcPr>
-          <w:p>
-            <w:pPr/>
-            <w:r>
-              <w:t xml:space="preserve">$191</w:t>
-            </w:r>
-          </w:p>
-        </w:tc>
-      </w:tr>
-      <w:tr>
-        <w:tc>
-          <w:tcPr>
-            <w:tcW w:w="1170" w:type="dxa"/>
-          </w:tcPr>
-          <w:p>
-            <w:pPr/>
-            <w:r>
-              <w:t xml:space="preserve">king satin sheets</w:t>
-            </w:r>
-          </w:p>
-        </w:tc>
-        <w:tc>
-          <w:tcPr>
-            <w:tcW w:w="1170" w:type="dxa"/>
-          </w:tcPr>
-          <w:p>
-            <w:pPr/>
-            <w:r>
-              <w:t xml:space="preserve">8</w:t>
-            </w:r>
-          </w:p>
-        </w:tc>
-        <w:tc>
-          <w:tcPr>
-            <w:tcW w:w="1170" w:type="dxa"/>
-          </w:tcPr>
-          <w:p>
-            <w:pPr/>
-            <w:r>
-              <w:t xml:space="preserve">$284</w:t>
-            </w:r>
-          </w:p>
-        </w:tc>
-        <w:tc>
-          <w:tcPr>
-            <w:tcW w:w="1170" w:type="dxa"/>
-          </w:tcPr>
-          <w:p>
-            <w:pPr/>
-            <w:r>
-              <w:t xml:space="preserve">13</w:t>
-            </w:r>
-          </w:p>
-        </w:tc>
-        <w:tc>
-          <w:tcPr>
-            <w:tcW w:w="1170" w:type="dxa"/>
-          </w:tcPr>
-          <w:p>
-            <w:pPr/>
-            <w:r>
-              <w:t xml:space="preserve">69%</w:t>
-            </w:r>
-          </w:p>
-        </w:tc>
-        <w:tc>
-          <w:tcPr>
-            <w:tcW w:w="1170" w:type="dxa"/>
-          </w:tcPr>
-          <w:p>
-            <w:pPr/>
-            <w:r>
-              <w:t xml:space="preserve">$2.20</w:t>
-            </w:r>
-          </w:p>
-        </w:tc>
-        <w:tc>
-          <w:tcPr>
-            <w:tcW w:w="1170" w:type="dxa"/>
-          </w:tcPr>
-          <w:p>
-            <w:pPr/>
-            <w:r>
-              <w:t xml:space="preserve">$0.82</w:t>
-            </w:r>
-          </w:p>
-        </w:tc>
-        <w:tc>
-          <w:tcPr>
-            <w:tcW w:w="1170" w:type="dxa"/>
-          </w:tcPr>
-          <w:p>
-            <w:pPr/>
-            <w:r>
-              <w:t xml:space="preserve">$179</w:t>
-            </w:r>
-          </w:p>
-        </w:tc>
-      </w:tr>
-      <w:tr>
-        <w:tc>
-          <w:tcPr>
-            <w:tcW w:w="1170" w:type="dxa"/>
-          </w:tcPr>
-          <w:p>
-            <w:pPr/>
-            <w:r>
-              <w:t xml:space="preserve">king size silk sheets</w:t>
-            </w:r>
-          </w:p>
-        </w:tc>
-        <w:tc>
-          <w:tcPr>
-            <w:tcW w:w="1170" w:type="dxa"/>
-          </w:tcPr>
-          <w:p>
-            <w:pPr/>
-            <w:r>
-              <w:t xml:space="preserve">11</w:t>
-            </w:r>
-          </w:p>
-        </w:tc>
-        <w:tc>
-          <w:tcPr>
-            <w:tcW w:w="1170" w:type="dxa"/>
-          </w:tcPr>
-          <w:p>
-            <w:pPr/>
-            <w:r>
-              <w:t xml:space="preserve">$214</w:t>
-            </w:r>
-          </w:p>
-        </w:tc>
-        <w:tc>
-          <w:tcPr>
-            <w:tcW w:w="1170" w:type="dxa"/>
+            <w:tcW w:w="1040" w:type="dxa"/>
+          </w:tcPr>
+          <w:p>
+            <w:pPr/>
+            <w:r>
+              <w:t xml:space="preserve">2.0×</w:t>
+            </w:r>
+          </w:p>
+        </w:tc>
+        <w:tc>
+          <w:tcPr>
+            <w:tcW w:w="1040" w:type="dxa"/>
+          </w:tcPr>
+          <w:p>
+            <w:pPr/>
+            <w:r>
+              <w:t xml:space="preserve">$89</w:t>
+            </w:r>
+          </w:p>
+        </w:tc>
+      </w:tr>
+      <w:tr>
+        <w:tc>
+          <w:tcPr>
+            <w:tcW w:w="1040" w:type="dxa"/>
+          </w:tcPr>
+          <w:p>
+            <w:pPr/>
+            <w:r>
+              <w:t xml:space="preserve">queen satin sheets</w:t>
+            </w:r>
+          </w:p>
+        </w:tc>
+        <w:tc>
+          <w:tcPr>
+            <w:tcW w:w="1040" w:type="dxa"/>
           </w:tcPr>
           <w:p>
             <w:pPr/>
@@ -4535,907 +6321,29 @@
         </w:tc>
         <w:tc>
           <w:tcPr>
-            <w:tcW w:w="1170" w:type="dxa"/>
-          </w:tcPr>
-          <w:p>
-            <w:pPr/>
-            <w:r>
-              <w:t xml:space="preserve">73%</w:t>
-            </w:r>
-          </w:p>
-        </w:tc>
-        <w:tc>
-          <w:tcPr>
-            <w:tcW w:w="1170" w:type="dxa"/>
-          </w:tcPr>
-          <w:p>
-            <w:pPr/>
-            <w:r>
-              <w:t xml:space="preserve">$3.20</w:t>
-            </w:r>
-          </w:p>
-        </w:tc>
-        <w:tc>
-          <w:tcPr>
-            <w:tcW w:w="1170" w:type="dxa"/>
-          </w:tcPr>
-          <w:p>
-            <w:pPr/>
-            <w:r>
-              <w:t xml:space="preserve">$1.09</w:t>
-            </w:r>
-          </w:p>
-        </w:tc>
-        <w:tc>
-          <w:tcPr>
-            <w:tcW w:w="1170" w:type="dxa"/>
-          </w:tcPr>
-          <w:p>
-            <w:pPr/>
-            <w:r>
-              <w:t xml:space="preserve">$141</w:t>
-            </w:r>
-          </w:p>
-        </w:tc>
-      </w:tr>
-      <w:tr>
-        <w:tc>
-          <w:tcPr>
-            <w:tcW w:w="1170" w:type="dxa"/>
-          </w:tcPr>
-          <w:p>
-            <w:pPr/>
-            <w:r>
-              <w:t xml:space="preserve">satin sheets king</w:t>
-            </w:r>
-          </w:p>
-        </w:tc>
-        <w:tc>
-          <w:tcPr>
-            <w:tcW w:w="1170" w:type="dxa"/>
-          </w:tcPr>
-          <w:p>
-            <w:pPr/>
-            <w:r>
-              <w:t xml:space="preserve">6</w:t>
-            </w:r>
-          </w:p>
-        </w:tc>
-        <w:tc>
-          <w:tcPr>
-            <w:tcW w:w="1170" w:type="dxa"/>
-          </w:tcPr>
-          <w:p>
-            <w:pPr/>
-            <w:r>
-              <w:t xml:space="preserve">$519</w:t>
-            </w:r>
-          </w:p>
-        </w:tc>
-        <w:tc>
-          <w:tcPr>
-            <w:tcW w:w="1170" w:type="dxa"/>
-          </w:tcPr>
-          <w:p>
-            <w:pPr/>
-            <w:r>
-              <w:t xml:space="preserve">47</w:t>
-            </w:r>
-          </w:p>
-        </w:tc>
-        <w:tc>
-          <w:tcPr>
-            <w:tcW w:w="1170" w:type="dxa"/>
-          </w:tcPr>
-          <w:p>
-            <w:pPr/>
-            <w:r>
-              <w:t xml:space="preserve">33%</w:t>
-            </w:r>
-          </w:p>
-        </w:tc>
-        <w:tc>
-          <w:tcPr>
-            <w:tcW w:w="1170" w:type="dxa"/>
-          </w:tcPr>
-          <w:p>
-            <w:pPr/>
-            <w:r>
-              <w:t xml:space="preserve">$2.27</w:t>
-            </w:r>
-          </w:p>
-        </w:tc>
-        <w:tc>
-          <w:tcPr>
-            <w:tcW w:w="1170" w:type="dxa"/>
-          </w:tcPr>
-          <w:p>
-            <w:pPr/>
-            <w:r>
-              <w:t xml:space="preserve">$1.73</w:t>
-            </w:r>
-          </w:p>
-        </w:tc>
-        <w:tc>
-          <w:tcPr>
-            <w:tcW w:w="1170" w:type="dxa"/>
-          </w:tcPr>
-          <w:p>
-            <w:pPr/>
-            <w:r>
-              <w:t xml:space="preserve">$122</w:t>
-            </w:r>
-          </w:p>
-        </w:tc>
-      </w:tr>
-      <w:tr>
-        <w:tc>
-          <w:tcPr>
-            <w:tcW w:w="1170" w:type="dxa"/>
-          </w:tcPr>
-          <w:p>
-            <w:pPr/>
-            <w:r>
-              <w:t xml:space="preserve">silk sheets</w:t>
-            </w:r>
-          </w:p>
-        </w:tc>
-        <w:tc>
-          <w:tcPr>
-            <w:tcW w:w="1170" w:type="dxa"/>
-          </w:tcPr>
-          <w:p>
-            <w:pPr/>
-            <w:r>
-              <w:t xml:space="preserve">23</w:t>
-            </w:r>
-          </w:p>
-        </w:tc>
-        <w:tc>
-          <w:tcPr>
-            <w:tcW w:w="1170" w:type="dxa"/>
-          </w:tcPr>
-          <w:p>
-            <w:pPr/>
-            <w:r>
-              <w:t xml:space="preserve">$327</w:t>
-            </w:r>
-          </w:p>
-        </w:tc>
-        <w:tc>
-          <w:tcPr>
-            <w:tcW w:w="1170" w:type="dxa"/>
-          </w:tcPr>
-          <w:p>
-            <w:pPr/>
-            <w:r>
-              <w:t xml:space="preserve">26</w:t>
-            </w:r>
-          </w:p>
-        </w:tc>
-        <w:tc>
-          <w:tcPr>
-            <w:tcW w:w="1170" w:type="dxa"/>
-          </w:tcPr>
-          <w:p>
-            <w:pPr/>
-            <w:r>
-              <w:t xml:space="preserve">39%</w:t>
-            </w:r>
-          </w:p>
-        </w:tc>
-        <w:tc>
-          <w:tcPr>
-            <w:tcW w:w="1170" w:type="dxa"/>
-          </w:tcPr>
-          <w:p>
-            <w:pPr/>
-            <w:r>
-              <w:t xml:space="preserve">$1.47</w:t>
-            </w:r>
-          </w:p>
-        </w:tc>
-        <w:tc>
-          <w:tcPr>
-            <w:tcW w:w="1170" w:type="dxa"/>
-          </w:tcPr>
-          <w:p>
-            <w:pPr/>
-            <w:r>
-              <w:t xml:space="preserve">$0.98</w:t>
-            </w:r>
-          </w:p>
-        </w:tc>
-        <w:tc>
-          <w:tcPr>
-            <w:tcW w:w="1170" w:type="dxa"/>
-          </w:tcPr>
-          <w:p>
-            <w:pPr/>
-            <w:r>
-              <w:t xml:space="preserve">$109</w:t>
-            </w:r>
-          </w:p>
-        </w:tc>
-      </w:tr>
-      <w:tr>
-        <w:tc>
-          <w:tcPr>
-            <w:tcW w:w="1170" w:type="dxa"/>
-          </w:tcPr>
-          <w:p>
-            <w:pPr/>
-            <w:r>
-              <w:t xml:space="preserve">king size satin sheet set</w:t>
-            </w:r>
-          </w:p>
-        </w:tc>
-        <w:tc>
-          <w:tcPr>
-            <w:tcW w:w="1170" w:type="dxa"/>
-          </w:tcPr>
-          <w:p>
-            <w:pPr/>
-            <w:r>
-              <w:t xml:space="preserve">5</w:t>
-            </w:r>
-          </w:p>
-        </w:tc>
-        <w:tc>
-          <w:tcPr>
-            <w:tcW w:w="1170" w:type="dxa"/>
-          </w:tcPr>
-          <w:p>
-            <w:pPr/>
-            <w:r>
-              <w:t xml:space="preserve">$197</w:t>
-            </w:r>
-          </w:p>
-        </w:tc>
-        <w:tc>
-          <w:tcPr>
-            <w:tcW w:w="1170" w:type="dxa"/>
-          </w:tcPr>
-          <w:p>
-            <w:pPr/>
-            <w:r>
-              <w:t xml:space="preserve">11</w:t>
-            </w:r>
-          </w:p>
-        </w:tc>
-        <w:tc>
-          <w:tcPr>
-            <w:tcW w:w="1170" w:type="dxa"/>
-          </w:tcPr>
-          <w:p>
-            <w:pPr/>
-            <w:r>
-              <w:t xml:space="preserve">58%</w:t>
-            </w:r>
-          </w:p>
-        </w:tc>
-        <w:tc>
-          <w:tcPr>
-            <w:tcW w:w="1170" w:type="dxa"/>
-          </w:tcPr>
-          <w:p>
-            <w:pPr/>
-            <w:r>
-              <w:t xml:space="preserve">$2.90</w:t>
-            </w:r>
-          </w:p>
-        </w:tc>
-        <w:tc>
-          <w:tcPr>
-            <w:tcW w:w="1170" w:type="dxa"/>
-          </w:tcPr>
-          <w:p>
-            <w:pPr/>
-            <w:r>
-              <w:t xml:space="preserve">$1.31</w:t>
-            </w:r>
-          </w:p>
-        </w:tc>
-        <w:tc>
-          <w:tcPr>
-            <w:tcW w:w="1170" w:type="dxa"/>
-          </w:tcPr>
-          <w:p>
-            <w:pPr/>
-            <w:r>
-              <w:t xml:space="preserve">$108</w:t>
-            </w:r>
-          </w:p>
-        </w:tc>
-      </w:tr>
-      <w:tr>
-        <w:tc>
-          <w:tcPr>
-            <w:tcW w:w="1170" w:type="dxa"/>
-          </w:tcPr>
-          <w:p>
-            <w:pPr/>
-            <w:r>
-              <w:t xml:space="preserve">satin queen sheets set</w:t>
-            </w:r>
-          </w:p>
-        </w:tc>
-        <w:tc>
-          <w:tcPr>
-            <w:tcW w:w="1170" w:type="dxa"/>
-          </w:tcPr>
-          <w:p>
-            <w:pPr/>
-            <w:r>
-              <w:t xml:space="preserve">6</w:t>
-            </w:r>
-          </w:p>
-        </w:tc>
-        <w:tc>
-          <w:tcPr>
-            <w:tcW w:w="1170" w:type="dxa"/>
-          </w:tcPr>
-          <w:p>
-            <w:pPr/>
-            <w:r>
-              <w:t xml:space="preserve">$170</w:t>
-            </w:r>
-          </w:p>
-        </w:tc>
-        <w:tc>
-          <w:tcPr>
-            <w:tcW w:w="1170" w:type="dxa"/>
-          </w:tcPr>
-          <w:p>
-            <w:pPr/>
-            <w:r>
-              <w:t xml:space="preserve">9</w:t>
-            </w:r>
-          </w:p>
-        </w:tc>
-        <w:tc>
-          <w:tcPr>
-            <w:tcW w:w="1170" w:type="dxa"/>
-          </w:tcPr>
-          <w:p>
-            <w:pPr/>
-            <w:r>
-              <w:t xml:space="preserve">66%</w:t>
-            </w:r>
-          </w:p>
-        </w:tc>
-        <w:tc>
-          <w:tcPr>
-            <w:tcW w:w="1170" w:type="dxa"/>
-          </w:tcPr>
-          <w:p>
-            <w:pPr/>
-            <w:r>
-              <w:t xml:space="preserve">$1.77</w:t>
-            </w:r>
-          </w:p>
-        </w:tc>
-        <w:tc>
-          <w:tcPr>
-            <w:tcW w:w="1170" w:type="dxa"/>
-          </w:tcPr>
-          <w:p>
-            <w:pPr/>
-            <w:r>
-              <w:t xml:space="preserve">$0.76</w:t>
-            </w:r>
-          </w:p>
-        </w:tc>
-        <w:tc>
-          <w:tcPr>
-            <w:tcW w:w="1170" w:type="dxa"/>
-          </w:tcPr>
-          <w:p>
-            <w:pPr/>
-            <w:r>
-              <w:t xml:space="preserve">$97</w:t>
-            </w:r>
-          </w:p>
-        </w:tc>
-      </w:tr>
-      <w:tr>
-        <w:tc>
-          <w:tcPr>
-            <w:tcW w:w="1170" w:type="dxa"/>
-          </w:tcPr>
-          <w:p>
-            <w:pPr/>
-            <w:r>
-              <w:t xml:space="preserve">satin sheets queen</w:t>
-            </w:r>
-          </w:p>
-        </w:tc>
-        <w:tc>
-          <w:tcPr>
-            <w:tcW w:w="1170" w:type="dxa"/>
-          </w:tcPr>
-          <w:p>
-            <w:pPr/>
-            <w:r>
-              <w:t xml:space="preserve">7</w:t>
-            </w:r>
-          </w:p>
-        </w:tc>
-        <w:tc>
-          <w:tcPr>
-            <w:tcW w:w="1170" w:type="dxa"/>
-          </w:tcPr>
-          <w:p>
-            <w:pPr/>
-            <w:r>
-              <w:t xml:space="preserve">$180</w:t>
-            </w:r>
-          </w:p>
-        </w:tc>
-        <w:tc>
-          <w:tcPr>
-            <w:tcW w:w="1170" w:type="dxa"/>
-          </w:tcPr>
-          <w:p>
-            <w:pPr/>
-            <w:r>
-              <w:t xml:space="preserve">12</w:t>
-            </w:r>
-          </w:p>
-        </w:tc>
-        <w:tc>
-          <w:tcPr>
-            <w:tcW w:w="1170" w:type="dxa"/>
-          </w:tcPr>
-          <w:p>
-            <w:pPr/>
-            <w:r>
-              <w:t xml:space="preserve">45%</w:t>
-            </w:r>
-          </w:p>
-        </w:tc>
-        <w:tc>
-          <w:tcPr>
-            <w:tcW w:w="1170" w:type="dxa"/>
-          </w:tcPr>
-          <w:p>
-            <w:pPr/>
-            <w:r>
-              <w:t xml:space="preserve">$2.64</w:t>
-            </w:r>
-          </w:p>
-        </w:tc>
-        <w:tc>
-          <w:tcPr>
-            <w:tcW w:w="1170" w:type="dxa"/>
-          </w:tcPr>
-          <w:p>
-            <w:pPr/>
-            <w:r>
-              <w:t xml:space="preserve">$1.55</w:t>
-            </w:r>
-          </w:p>
-        </w:tc>
-        <w:tc>
-          <w:tcPr>
-            <w:tcW w:w="1170" w:type="dxa"/>
-          </w:tcPr>
-          <w:p>
-            <w:pPr/>
-            <w:r>
-              <w:t xml:space="preserve">$74</w:t>
-            </w:r>
-          </w:p>
-        </w:tc>
-      </w:tr>
-      <w:tr>
-        <w:tc>
-          <w:tcPr>
-            <w:tcW w:w="1170" w:type="dxa"/>
-          </w:tcPr>
-          <w:p>
-            <w:pPr/>
-            <w:r>
-              <w:t xml:space="preserve">satin sheets full</w:t>
-            </w:r>
-          </w:p>
-        </w:tc>
-        <w:tc>
-          <w:tcPr>
-            <w:tcW w:w="1170" w:type="dxa"/>
-          </w:tcPr>
-          <w:p>
-            <w:pPr/>
-            <w:r>
-              <w:t xml:space="preserve">7</w:t>
-            </w:r>
-          </w:p>
-        </w:tc>
-        <w:tc>
-          <w:tcPr>
-            <w:tcW w:w="1170" w:type="dxa"/>
-          </w:tcPr>
-          <w:p>
-            <w:pPr/>
-            <w:r>
-              <w:t xml:space="preserve">$390</w:t>
-            </w:r>
-          </w:p>
-        </w:tc>
-        <w:tc>
-          <w:tcPr>
-            <w:tcW w:w="1170" w:type="dxa"/>
-          </w:tcPr>
-          <w:p>
-            <w:pPr/>
-            <w:r>
-              <w:t xml:space="preserve">39</w:t>
-            </w:r>
-          </w:p>
-        </w:tc>
-        <w:tc>
-          <w:tcPr>
-            <w:tcW w:w="1170" w:type="dxa"/>
-          </w:tcPr>
-          <w:p>
-            <w:pPr/>
-            <w:r>
-              <w:t xml:space="preserve">34%</w:t>
-            </w:r>
-          </w:p>
-        </w:tc>
-        <w:tc>
-          <w:tcPr>
-            <w:tcW w:w="1170" w:type="dxa"/>
-          </w:tcPr>
-          <w:p>
-            <w:pPr/>
-            <w:r>
-              <w:t xml:space="preserve">$2.57</w:t>
-            </w:r>
-          </w:p>
-        </w:tc>
-        <w:tc>
-          <w:tcPr>
-            <w:tcW w:w="1170" w:type="dxa"/>
-          </w:tcPr>
-          <w:p>
-            <w:pPr/>
-            <w:r>
-              <w:t xml:space="preserve">$2.08</w:t>
-            </w:r>
-          </w:p>
-        </w:tc>
-        <w:tc>
-          <w:tcPr>
-            <w:tcW w:w="1170" w:type="dxa"/>
-          </w:tcPr>
-          <w:p>
-            <w:pPr/>
-            <w:r>
-              <w:t xml:space="preserve">$74</w:t>
-            </w:r>
-          </w:p>
-        </w:tc>
-      </w:tr>
-      <w:tr>
-        <w:tc>
-          <w:tcPr>
-            <w:tcW w:w="1170" w:type="dxa"/>
-          </w:tcPr>
-          <w:p>
-            <w:pPr/>
-            <w:r>
-              <w:t xml:space="preserve">silk sheets queen</w:t>
-            </w:r>
-          </w:p>
-        </w:tc>
-        <w:tc>
-          <w:tcPr>
-            <w:tcW w:w="1170" w:type="dxa"/>
-          </w:tcPr>
-          <w:p>
-            <w:pPr/>
-            <w:r>
-              <w:t xml:space="preserve">8</w:t>
-            </w:r>
-          </w:p>
-        </w:tc>
-        <w:tc>
-          <w:tcPr>
-            <w:tcW w:w="1170" w:type="dxa"/>
-          </w:tcPr>
-          <w:p>
-            <w:pPr/>
-            <w:r>
-              <w:t xml:space="preserve">$547</w:t>
-            </w:r>
-          </w:p>
-        </w:tc>
-        <w:tc>
-          <w:tcPr>
-            <w:tcW w:w="1170" w:type="dxa"/>
-          </w:tcPr>
-          <w:p>
-            <w:pPr/>
-            <w:r>
-              <w:t xml:space="preserve">59</w:t>
-            </w:r>
-          </w:p>
-        </w:tc>
-        <w:tc>
-          <w:tcPr>
-            <w:tcW w:w="1170" w:type="dxa"/>
-          </w:tcPr>
-          <w:p>
-            <w:pPr/>
-            <w:r>
-              <w:t xml:space="preserve">31%</w:t>
-            </w:r>
-          </w:p>
-        </w:tc>
-        <w:tc>
-          <w:tcPr>
-            <w:tcW w:w="1170" w:type="dxa"/>
-          </w:tcPr>
-          <w:p>
-            <w:pPr/>
-            <w:r>
-              <w:t xml:space="preserve">$1.70</w:t>
-            </w:r>
-          </w:p>
-        </w:tc>
-        <w:tc>
-          <w:tcPr>
-            <w:tcW w:w="1170" w:type="dxa"/>
-          </w:tcPr>
-          <w:p>
-            <w:pPr/>
-            <w:r>
-              <w:t xml:space="preserve">$1.48</w:t>
-            </w:r>
-          </w:p>
-        </w:tc>
-        <w:tc>
-          <w:tcPr>
-            <w:tcW w:w="1170" w:type="dxa"/>
-          </w:tcPr>
-          <w:p>
-            <w:pPr/>
-            <w:r>
-              <w:t xml:space="preserve">$70</w:t>
-            </w:r>
-          </w:p>
-        </w:tc>
-      </w:tr>
-      <w:tr>
-        <w:tc>
-          <w:tcPr>
-            <w:tcW w:w="1170" w:type="dxa"/>
-          </w:tcPr>
-          <w:p>
-            <w:pPr/>
-            <w:r>
-              <w:t xml:space="preserve">silk twin bed sheets</w:t>
-            </w:r>
-          </w:p>
-        </w:tc>
-        <w:tc>
-          <w:tcPr>
-            <w:tcW w:w="1170" w:type="dxa"/>
-          </w:tcPr>
-          <w:p>
-            <w:pPr/>
-            <w:r>
-              <w:t xml:space="preserve">7</w:t>
-            </w:r>
-          </w:p>
-        </w:tc>
-        <w:tc>
-          <w:tcPr>
-            <w:tcW w:w="1170" w:type="dxa"/>
-          </w:tcPr>
-          <w:p>
-            <w:pPr/>
-            <w:r>
-              <w:t xml:space="preserve">$227</w:t>
-            </w:r>
-          </w:p>
-        </w:tc>
-        <w:tc>
-          <w:tcPr>
-            <w:tcW w:w="1170" w:type="dxa"/>
-          </w:tcPr>
-          <w:p>
-            <w:pPr/>
-            <w:r>
-              <w:t xml:space="preserve">20</w:t>
-            </w:r>
-          </w:p>
-        </w:tc>
-        <w:tc>
-          <w:tcPr>
-            <w:tcW w:w="1170" w:type="dxa"/>
-          </w:tcPr>
-          <w:p>
-            <w:pPr/>
-            <w:r>
-              <w:t xml:space="preserve">43%</w:t>
-            </w:r>
-          </w:p>
-        </w:tc>
-        <w:tc>
-          <w:tcPr>
-            <w:tcW w:w="1170" w:type="dxa"/>
-          </w:tcPr>
-          <w:p>
-            <w:pPr/>
-            <w:r>
-              <w:t xml:space="preserve">$3.29</w:t>
-            </w:r>
-          </w:p>
-        </w:tc>
-        <w:tc>
-          <w:tcPr>
-            <w:tcW w:w="1170" w:type="dxa"/>
-          </w:tcPr>
-          <w:p>
-            <w:pPr/>
-            <w:r>
-              <w:t xml:space="preserve">$2.34</w:t>
-            </w:r>
-          </w:p>
-        </w:tc>
-        <w:tc>
-          <w:tcPr>
-            <w:tcW w:w="1170" w:type="dxa"/>
-          </w:tcPr>
-          <w:p>
-            <w:pPr/>
-            <w:r>
-              <w:t xml:space="preserve">$65</w:t>
-            </w:r>
-          </w:p>
-        </w:tc>
-      </w:tr>
-      <w:tr>
-        <w:tc>
-          <w:tcPr>
-            <w:tcW w:w="1170" w:type="dxa"/>
-          </w:tcPr>
-          <w:p>
-            <w:pPr/>
-            <w:r>
-              <w:t xml:space="preserve">silk bedsheets</w:t>
-            </w:r>
-          </w:p>
-        </w:tc>
-        <w:tc>
-          <w:tcPr>
-            <w:tcW w:w="1170" w:type="dxa"/>
-          </w:tcPr>
-          <w:p>
-            <w:pPr/>
-            <w:r>
-              <w:t xml:space="preserve">16</w:t>
-            </w:r>
-          </w:p>
-        </w:tc>
-        <w:tc>
-          <w:tcPr>
-            <w:tcW w:w="1170" w:type="dxa"/>
-          </w:tcPr>
-          <w:p>
-            <w:pPr/>
-            <w:r>
-              <w:t xml:space="preserve">$175</w:t>
-            </w:r>
-          </w:p>
-        </w:tc>
-        <w:tc>
-          <w:tcPr>
-            <w:tcW w:w="1170" w:type="dxa"/>
-          </w:tcPr>
-          <w:p>
-            <w:pPr/>
-            <w:r>
-              <w:t xml:space="preserve">14</w:t>
-            </w:r>
-          </w:p>
-        </w:tc>
-        <w:tc>
-          <w:tcPr>
-            <w:tcW w:w="1170" w:type="dxa"/>
-          </w:tcPr>
-          <w:p>
-            <w:pPr/>
-            <w:r>
-              <w:t xml:space="preserve">43%</w:t>
-            </w:r>
-          </w:p>
-        </w:tc>
-        <w:tc>
-          <w:tcPr>
-            <w:tcW w:w="1170" w:type="dxa"/>
-          </w:tcPr>
-          <w:p>
-            <w:pPr/>
-            <w:r>
-              <w:t xml:space="preserve">$1.70</w:t>
-            </w:r>
-          </w:p>
-        </w:tc>
-        <w:tc>
-          <w:tcPr>
-            <w:tcW w:w="1170" w:type="dxa"/>
-          </w:tcPr>
-          <w:p>
-            <w:pPr/>
-            <w:r>
-              <w:t xml:space="preserve">$1.10</w:t>
-            </w:r>
-          </w:p>
-        </w:tc>
-        <w:tc>
-          <w:tcPr>
-            <w:tcW w:w="1170" w:type="dxa"/>
-          </w:tcPr>
-          <w:p>
-            <w:pPr/>
-            <w:r>
-              <w:t xml:space="preserve">$62</w:t>
-            </w:r>
-          </w:p>
-        </w:tc>
-      </w:tr>
-      <w:tr>
-        <w:tc>
-          <w:tcPr>
-            <w:tcW w:w="1170" w:type="dxa"/>
-          </w:tcPr>
-          <w:p>
-            <w:pPr/>
-            <w:r>
-              <w:t xml:space="preserve">red satin sheets</w:t>
-            </w:r>
-          </w:p>
-        </w:tc>
-        <w:tc>
-          <w:tcPr>
-            <w:tcW w:w="1170" w:type="dxa"/>
-          </w:tcPr>
-          <w:p>
-            <w:pPr/>
-            <w:r>
-              <w:t xml:space="preserve">4</w:t>
-            </w:r>
-          </w:p>
-        </w:tc>
-        <w:tc>
-          <w:tcPr>
-            <w:tcW w:w="1170" w:type="dxa"/>
-          </w:tcPr>
-          <w:p>
-            <w:pPr/>
-            <w:r>
-              <w:t xml:space="preserve">$345</w:t>
-            </w:r>
-          </w:p>
-        </w:tc>
-        <w:tc>
-          <w:tcPr>
-            <w:tcW w:w="1170" w:type="dxa"/>
-          </w:tcPr>
-          <w:p>
-            <w:pPr/>
-            <w:r>
-              <w:t xml:space="preserve">36</w:t>
-            </w:r>
-          </w:p>
-        </w:tc>
-        <w:tc>
-          <w:tcPr>
-            <w:tcW w:w="1170" w:type="dxa"/>
+            <w:tcW w:w="1040" w:type="dxa"/>
+          </w:tcPr>
+          <w:p>
+            <w:pPr/>
+            <w:r>
+              <w:t xml:space="preserve">$177</w:t>
+            </w:r>
+          </w:p>
+        </w:tc>
+        <w:tc>
+          <w:tcPr>
+            <w:tcW w:w="1040" w:type="dxa"/>
+          </w:tcPr>
+          <w:p>
+            <w:pPr/>
+            <w:r>
+              <w:t xml:space="preserve">18</w:t>
+            </w:r>
+          </w:p>
+        </w:tc>
+        <w:tc>
+          <w:tcPr>
+            <w:tcW w:w="1040" w:type="dxa"/>
           </w:tcPr>
           <w:p>
             <w:pPr/>
@@ -5446,277 +6354,7 @@
         </w:tc>
         <w:tc>
           <w:tcPr>
-            <w:tcW w:w="1170" w:type="dxa"/>
-          </w:tcPr>
-          <w:p>
-            <w:pPr/>
-            <w:r>
-              <w:t xml:space="preserve">$1.38</w:t>
-            </w:r>
-          </w:p>
-        </w:tc>
-        <w:tc>
-          <w:tcPr>
-            <w:tcW w:w="1170" w:type="dxa"/>
-          </w:tcPr>
-          <w:p>
-            <w:pPr/>
-            <w:r>
-              <w:t xml:space="preserve">$1.17</w:t>
-            </w:r>
-          </w:p>
-        </w:tc>
-        <w:tc>
-          <w:tcPr>
-            <w:tcW w:w="1170" w:type="dxa"/>
-          </w:tcPr>
-          <w:p>
-            <w:pPr/>
-            <w:r>
-              <w:t xml:space="preserve">$54</w:t>
-            </w:r>
-          </w:p>
-        </w:tc>
-      </w:tr>
-      <w:tr>
-        <w:tc>
-          <w:tcPr>
-            <w:tcW w:w="1170" w:type="dxa"/>
-          </w:tcPr>
-          <w:p>
-            <w:pPr/>
-            <w:r>
-              <w:t xml:space="preserve">silk sheets full</w:t>
-            </w:r>
-          </w:p>
-        </w:tc>
-        <w:tc>
-          <w:tcPr>
-            <w:tcW w:w="1170" w:type="dxa"/>
-          </w:tcPr>
-          <w:p>
-            <w:pPr/>
-            <w:r>
-              <w:t xml:space="preserve">9</w:t>
-            </w:r>
-          </w:p>
-        </w:tc>
-        <w:tc>
-          <w:tcPr>
-            <w:tcW w:w="1170" w:type="dxa"/>
-          </w:tcPr>
-          <w:p>
-            <w:pPr/>
-            <w:r>
-              <w:t xml:space="preserve">$288</w:t>
-            </w:r>
-          </w:p>
-        </w:tc>
-        <w:tc>
-          <w:tcPr>
-            <w:tcW w:w="1170" w:type="dxa"/>
-          </w:tcPr>
-          <w:p>
-            <w:pPr/>
-            <w:r>
-              <w:t xml:space="preserve">30</w:t>
-            </w:r>
-          </w:p>
-        </w:tc>
-        <w:tc>
-          <w:tcPr>
-            <w:tcW w:w="1170" w:type="dxa"/>
-          </w:tcPr>
-          <w:p>
-            <w:pPr/>
-            <w:r>
-              <w:t xml:space="preserve">33%</w:t>
-            </w:r>
-          </w:p>
-        </w:tc>
-        <w:tc>
-          <w:tcPr>
-            <w:tcW w:w="1170" w:type="dxa"/>
-          </w:tcPr>
-          <w:p>
-            <w:pPr/>
-            <w:r>
-              <w:t xml:space="preserve">$2.18</w:t>
-            </w:r>
-          </w:p>
-        </w:tc>
-        <w:tc>
-          <w:tcPr>
-            <w:tcW w:w="1170" w:type="dxa"/>
-          </w:tcPr>
-          <w:p>
-            <w:pPr/>
-            <w:r>
-              <w:t xml:space="preserve">$1.84</w:t>
-            </w:r>
-          </w:p>
-        </w:tc>
-        <w:tc>
-          <w:tcPr>
-            <w:tcW w:w="1170" w:type="dxa"/>
-          </w:tcPr>
-          <w:p>
-            <w:pPr/>
-            <w:r>
-              <w:t xml:space="preserve">$45</w:t>
-            </w:r>
-          </w:p>
-        </w:tc>
-      </w:tr>
-      <w:tr>
-        <w:tc>
-          <w:tcPr>
-            <w:tcW w:w="1170" w:type="dxa"/>
-          </w:tcPr>
-          <w:p>
-            <w:pPr/>
-            <w:r>
-              <w:t xml:space="preserve">black silk sheets</w:t>
-            </w:r>
-          </w:p>
-        </w:tc>
-        <w:tc>
-          <w:tcPr>
-            <w:tcW w:w="1170" w:type="dxa"/>
-          </w:tcPr>
-          <w:p>
-            <w:pPr/>
-            <w:r>
-              <w:t xml:space="preserve">12</w:t>
-            </w:r>
-          </w:p>
-        </w:tc>
-        <w:tc>
-          <w:tcPr>
-            <w:tcW w:w="1170" w:type="dxa"/>
-          </w:tcPr>
-          <w:p>
-            <w:pPr/>
-            <w:r>
-              <w:t xml:space="preserve">$245</w:t>
-            </w:r>
-          </w:p>
-        </w:tc>
-        <w:tc>
-          <w:tcPr>
-            <w:tcW w:w="1170" w:type="dxa"/>
-          </w:tcPr>
-          <w:p>
-            <w:pPr/>
-            <w:r>
-              <w:t xml:space="preserve">23</w:t>
-            </w:r>
-          </w:p>
-        </w:tc>
-        <w:tc>
-          <w:tcPr>
-            <w:tcW w:w="1170" w:type="dxa"/>
-          </w:tcPr>
-          <w:p>
-            <w:pPr/>
-            <w:r>
-              <w:t xml:space="preserve">33%</w:t>
-            </w:r>
-          </w:p>
-        </w:tc>
-        <w:tc>
-          <w:tcPr>
-            <w:tcW w:w="1170" w:type="dxa"/>
-          </w:tcPr>
-          <w:p>
-            <w:pPr/>
-            <w:r>
-              <w:t xml:space="preserve">$1.68</w:t>
-            </w:r>
-          </w:p>
-        </w:tc>
-        <w:tc>
-          <w:tcPr>
-            <w:tcW w:w="1170" w:type="dxa"/>
-          </w:tcPr>
-          <w:p>
-            <w:pPr/>
-            <w:r>
-              <w:t xml:space="preserve">$1.39</w:t>
-            </w:r>
-          </w:p>
-        </w:tc>
-        <w:tc>
-          <w:tcPr>
-            <w:tcW w:w="1170" w:type="dxa"/>
-          </w:tcPr>
-          <w:p>
-            <w:pPr/>
-            <w:r>
-              <w:t xml:space="preserve">$42</w:t>
-            </w:r>
-          </w:p>
-        </w:tc>
-      </w:tr>
-      <w:tr>
-        <w:tc>
-          <w:tcPr>
-            <w:tcW w:w="1170" w:type="dxa"/>
-          </w:tcPr>
-          <w:p>
-            <w:pPr/>
-            <w:r>
-              <w:t xml:space="preserve">queen satin sheets</w:t>
-            </w:r>
-          </w:p>
-        </w:tc>
-        <w:tc>
-          <w:tcPr>
-            <w:tcW w:w="1170" w:type="dxa"/>
-          </w:tcPr>
-          <w:p>
-            <w:pPr/>
-            <w:r>
-              <w:t xml:space="preserve">9</w:t>
-            </w:r>
-          </w:p>
-        </w:tc>
-        <w:tc>
-          <w:tcPr>
-            <w:tcW w:w="1170" w:type="dxa"/>
-          </w:tcPr>
-          <w:p>
-            <w:pPr/>
-            <w:r>
-              <w:t xml:space="preserve">$177</w:t>
-            </w:r>
-          </w:p>
-        </w:tc>
-        <w:tc>
-          <w:tcPr>
-            <w:tcW w:w="1170" w:type="dxa"/>
-          </w:tcPr>
-          <w:p>
-            <w:pPr/>
-            <w:r>
-              <w:t xml:space="preserve">18</w:t>
-            </w:r>
-          </w:p>
-        </w:tc>
-        <w:tc>
-          <w:tcPr>
-            <w:tcW w:w="1170" w:type="dxa"/>
-          </w:tcPr>
-          <w:p>
-            <w:pPr/>
-            <w:r>
-              <w:t xml:space="preserve">32%</w:t>
-            </w:r>
-          </w:p>
-        </w:tc>
-        <w:tc>
-          <w:tcPr>
-            <w:tcW w:w="1170" w:type="dxa"/>
+            <w:tcW w:w="1040" w:type="dxa"/>
           </w:tcPr>
           <w:p>
             <w:pPr/>
@@ -5727,23 +6365,34 @@
         </w:tc>
         <w:tc>
           <w:tcPr>
-            <w:tcW w:w="1170" w:type="dxa"/>
-          </w:tcPr>
-          <w:p>
-            <w:pPr/>
-            <w:r>
-              <w:t xml:space="preserve">$1.79</w:t>
-            </w:r>
-          </w:p>
-        </w:tc>
-        <w:tc>
-          <w:tcPr>
-            <w:tcW w:w="1170" w:type="dxa"/>
-          </w:tcPr>
-          <w:p>
-            <w:pPr/>
-            <w:r>
-              <w:t xml:space="preserve">$23</w:t>
+            <w:tcW w:w="1040" w:type="dxa"/>
+          </w:tcPr>
+          <w:p>
+            <w:pPr/>
+            <w:r>
+              <w:t xml:space="preserve">$1.37</w:t>
+            </w:r>
+          </w:p>
+        </w:tc>
+        <w:tc>
+          <w:tcPr>
+            <w:tcW w:w="1040" w:type="dxa"/>
+          </w:tcPr>
+          <w:p>
+            <w:pPr/>
+            <w:r>
+              <w:t xml:space="preserve">1.5×</w:t>
+            </w:r>
+          </w:p>
+        </w:tc>
+        <w:tc>
+          <w:tcPr>
+            <w:tcW w:w="1040" w:type="dxa"/>
+          </w:tcPr>
+          <w:p>
+            <w:pPr/>
+            <w:r>
+              <w:t xml:space="preserve">$59</w:t>
             </w:r>
           </w:p>
         </w:tc>
@@ -5752,7 +6401,7 @@
     <w:p>
       <w:pPr/>
       <w:r>
-        <w:t xml:space="preserve">Source: Command Center search terms, all keywords, product 37. The last 7 days of orders are still filling in, so losses read slightly high. Five of the top ten losers are King terms, with the widest gaps between CPC and profitable CPC. One of them, king size silk sheets, is the seq 21 hold released in N3; the others need their own records. SOP-26 asks for a Master Action Record on each of the top 20 this week.</w:t>
+        <w:t xml:space="preserve">Source: Command Center search terms, all keywords, product 37; margin from Sellerboard. The last 7 days of orders are still filling in, so losses read slightly high. Terms that looked near break-even on the old $8.09 figure now lose clearly: "silk sheets queen" $70 → $181 and "queen satin sheets" $23 → $59 over 30 days. The King terms carry the widest gaps (2.9–3.8×); one of them, king size silk sheets, is the seq 21 hold released in N3. SOP-26 asks for a Master Action Record on each of the top 20 this week.</w:t>
       </w:r>
     </w:p>
     <w:p>
@@ -6209,7 +6858,7 @@
         <w:t xml:space="preserve">The scoreboard (SOP-26 R4).</w:t>
       </w:r>
       <w:r>
-        <w:t xml:space="preserve"> About $540 a week released against a $2,131 overspend. By P9 that is not enough. At day 7, if TACoS has not inflected, deepen from the loss map (N8): satin sheets queen size, satin sheets, king size silk sheets set, king silk sheets, king satin sheets, king size satin sheet set and satin queen sheets set each paid 1.4–2.7× its profitable CPC over the last 30 days.</w:t>
+        <w:t xml:space="preserve"> About $540 a week released against a $2,131 overspend. By P9 that is not enough. At day 7, if TACoS has not inflected, deepen from the loss map (N8): satin sheets queen size, satin sheets, king size silk sheets set, king silk sheets, king satin sheets, king size satin sheet set and satin queen sheets set each paid 1.9–3.5× its profitable CPC over the last 30 days at the realised margin.</w:t>
       </w:r>
     </w:p>
     <w:p>
@@ -9231,18 +9880,18 @@
           <w:p>
             <w:pPr/>
             <w:r>
-              <w:t xml:space="preserve">five contribution and break-even figures in use</w:t>
-            </w:r>
-          </w:p>
-        </w:tc>
-        <w:tc>
-          <w:tcPr>
-            <w:tcW w:w="3120" w:type="dxa"/>
-          </w:tcPr>
-          <w:p>
-            <w:pPr/>
-            <w:r>
-              <w:t xml:space="preserve">one source, stated once in the brief</w:t>
+              <w:t xml:space="preserve">the engine prices on 27.47% before ads; Sellerboard shows 21.0% (30 days) to 26.6% (7 days), and four other figures are in use</w:t>
+            </w:r>
+          </w:p>
+        </w:tc>
+        <w:tc>
+          <w:tcPr>
+            <w:tcW w:w="3120" w:type="dxa"/>
+          </w:tcPr>
+          <w:p>
+            <w:pPr/>
+            <w:r>
+              <w:t xml:space="preserve">read the realised margin before ads from Sellerboard per window, refunds and storage fees included, and state it once in the brief</w:t>
             </w:r>
           </w:p>
         </w:tc>
@@ -9445,7 +10094,7 @@
         <w:t xml:space="preserve">Before the next run:</w:t>
       </w:r>
       <w:r>
-        <w:t xml:space="preserve"> complete the size map; one rank source; one margin; the engine fixes in F; export every decided campaign.</w:t>
+        <w:t xml:space="preserve"> complete the size map; one rank source; one margin, from Sellerboard, with every bid ceiling recomputed on it; the engine fixes in F; export every decided campaign.</w:t>
       </w:r>
     </w:p>
     <w:p>

</xml_diff>

<commit_message>
DSS4 review: re-price flagged cuts on the Bids and Placements logic
New section P: rule-by-rule comparison with the run and a re-priced table of
the 22 flagged cuts; 8 rows change value (9, 10, 81, 94, 180, 195, 214, 264).

Co-Authored-By: Claude Opus 5.5 <noreply@anthropic.com>
Claude-Session: https://claude.ai/code/session_01SJ43rruFMgodvVtPfpW8Ga
</commit_message>
<xml_diff>
--- a/DSS4_Audit_Review_Complete_20260924-d38957cf.docx
+++ b/DSS4_Audit_Review_Complete_20260924-d38957cf.docx
@@ -39,7 +39,7 @@
     <w:p>
       <w:pPr/>
       <w:r>
-        <w:t xml:space="preserve">Sources: the run's JSON export and workbook; the stored agent review (review 14); the 25 September review and its per-row workbook; Command Center search terms for 26 Aug – 24 Sep; Sellerboard P&amp;L for parent B0H631FLT8 over 7, 14 and 30 days to 25 Sep; SOP-26, 13, 14, 27, 29 and 33 in this repository.</w:t>
+        <w:t xml:space="preserve">Sources: the run's JSON export and workbook; the stored agent review (review 14); the 25 September review and its per-row workbook; Command Center search terms for 26 Aug – 24 Sep; Sellerboard P&amp;L for parent B0H631FLT8 over 7, 14 and 30 days to 25 Sep; the Bids and Placements on Exact Campaigns document and its 25 Sep redline; SOP-26, 13, 14, 27, 29 and 33 in this repository.</w:t>
       </w:r>
     </w:p>
     <w:p>
@@ -120,7 +120,7 @@
         <w:t xml:space="preserve">The head terms take unannounced top-of-search price cuts.</w:t>
       </w:r>
       <w:r>
-        <w:t xml:space="preserve"> Rows that say the price "holds" or "climbs" deploy as cuts: "satin sheets" −23%, "satin sheets queen size" −24%, "silk sheets queen" −35%. The cuts are right for a code red; the claims and predictions are not. Flagged and re-predicted (N2, N3).</w:t>
+        <w:t xml:space="preserve"> Rows that say the price "holds" or "climbs" deploy as cuts: "satin sheets" −23%, "satin sheets queen size" −24%, "silk sheets queen" −35%. The cuts are right for a code red; the claims and predictions are not. Flagged and re-predicted (N2, N3); re-priced on the Bids and Placements logic, 8 of them change value (P).</w:t>
       </w:r>
     </w:p>
     <w:p>
@@ -3480,6 +3480,12 @@
       </w:r>
     </w:p>
     <w:p>
+      <w:pPr/>
+      <w:r>
+        <w:t xml:space="preserve">Section P re-prices each of these rows against the Bids and Placements logic. Seq 9 and 10 take the full 25% base cut their 55% product-page leak calls for, and seq 81 is dropped because it takes "silk sheets queen" below its own top-of-search ceiling.</w:t>
+      </w:r>
+    </w:p>
+    <w:p>
       <w:pPr>
         <w:pStyle w:val="Heading3"/>
       </w:pPr>
@@ -6437,6 +6443,2052 @@
         <w:pStyle w:val="Heading2"/>
       </w:pPr>
       <w:r>
+        <w:t xml:space="preserve">P. The run against the Bids and Placements logic</w:t>
+      </w:r>
+    </w:p>
+    <w:p>
+      <w:pPr/>
+      <w:r>
+        <w:t xml:space="preserve">The run cites the Bids and Placements on Exact Campaigns document (its §5, §6, §9 and §10) but departs from it in six ways. Re-priced on that logic, 8 of the 22 flagged cuts change value; the rest stand as first steps.</w:t>
+      </w:r>
+    </w:p>
+    <w:tbl>
+      <w:tblPr>
+        <w:tblStyle w:val="TableGrid"/>
+        <w:tblW w:w="0" w:type="auto"/>
+        <w:tblLayout w:type="fixed"/>
+        <w:tblLook w:val="04A0" w:firstRow="1" w:lastRow="0" w:firstColumn="0" w:lastColumn="0" w:noHBand="0" w:noVBand="1"/>
+      </w:tblPr>
+      <w:tblGrid>
+        <w:gridCol w:w="4680"/>
+        <w:gridCol w:w="4680"/>
+      </w:tblGrid>
+      <w:tr>
+        <w:trPr>
+          <w:tblHeader/>
+        </w:trPr>
+        <w:tc>
+          <w:tcPr>
+            <w:tcW w:w="4680" w:type="dxa"/>
+            <w:shd w:val="clear" w:color="auto" w:fill="F2F2F2"/>
+          </w:tcPr>
+          <w:p>
+            <w:pPr/>
+            <w:r>
+              <w:t xml:space="preserve">Pricing rule (section of the Bids and Placements document)</w:t>
+            </w:r>
+          </w:p>
+        </w:tc>
+        <w:tc>
+          <w:tcPr>
+            <w:tcW w:w="4680" w:type="dxa"/>
+            <w:shd w:val="clear" w:color="auto" w:fill="F2F2F2"/>
+          </w:tcPr>
+          <w:p>
+            <w:pPr/>
+            <w:r>
+              <w:t xml:space="preserve">What the run did</w:t>
+            </w:r>
+          </w:p>
+        </w:tc>
+      </w:tr>
+      <w:tr>
+        <w:tc>
+          <w:tcPr>
+            <w:tcW w:w="4680" w:type="dxa"/>
+          </w:tcPr>
+          <w:p>
+            <w:pPr/>
+            <w:r>
+              <w:t xml:space="preserve">One bid, three prices; the modifier is solved from the price (§1, §4)</w:t>
+            </w:r>
+          </w:p>
+        </w:tc>
+        <w:tc>
+          <w:tcPr>
+            <w:tcW w:w="4680" w:type="dxa"/>
+          </w:tcPr>
+          <w:p>
+            <w:pPr/>
+            <w:r>
+              <w:t xml:space="preserve">The envelope refused the modifier half of 22 pairs and shipped the base cut alone; the rows still say the price "holds" or "climbs" (N2, N3)</w:t>
+            </w:r>
+          </w:p>
+        </w:tc>
+      </w:tr>
+      <w:tr>
+        <w:tc>
+          <w:tcPr>
+            <w:tcW w:w="4680" w:type="dxa"/>
+          </w:tcPr>
+          <w:p>
+            <w:pPr/>
+            <w:r>
+              <w:t xml:space="preserve">Contribution sets every price (§2)</w:t>
+            </w:r>
+          </w:p>
+        </w:tc>
+        <w:tc>
+          <w:tcPr>
+            <w:tcW w:w="4680" w:type="dxa"/>
+          </w:tcPr>
+          <w:p>
+            <w:pPr/>
+            <w:r>
+              <w:t xml:space="preserve">Priced on $8.09 a unit; the realised figure is $6.21 (section A)</w:t>
+            </w:r>
+          </w:p>
+        </w:tc>
+      </w:tr>
+      <w:tr>
+        <w:tc>
+          <w:tcPr>
+            <w:tcW w:w="4680" w:type="dxa"/>
+          </w:tcPr>
+          <w:p>
+            <w:pPr/>
+            <w:r>
+              <w:t xml:space="preserve">Rates are earned by click count, blended from 15 to 50 clicks (§3)</w:t>
+            </w:r>
+          </w:p>
+        </w:tc>
+        <w:tc>
+          <w:tcPr>
+            <w:tcW w:w="4680" w:type="dxa"/>
+          </w:tcPr>
+          <w:p>
+            <w:pPr/>
+            <w:r>
+              <w:t xml:space="preserve">Followed: the engine's blend weights match (38 clicks → 66%)</w:t>
+            </w:r>
+          </w:p>
+        </w:tc>
+      </w:tr>
+      <w:tr>
+        <w:tc>
+          <w:tcPr>
+            <w:tcW w:w="4680" w:type="dxa"/>
+          </w:tcPr>
+          <w:p>
+            <w:pPr/>
+            <w:r>
+              <w:t xml:space="preserve">Posture before any premium (the redline's new §6 gate)</w:t>
+            </w:r>
+          </w:p>
+        </w:tc>
+        <w:tc>
+          <w:tcPr>
+            <w:tcW w:w="4680" w:type="dxa"/>
+          </w:tcPr>
+          <w:p>
+            <w:pPr/>
+            <w:r>
+              <w:t xml:space="preserve">Rows carry "a LOSS of $6.45 per order, deliberate on a funded push" in a maintenance run, press off, TACoS in code red</w:t>
+            </w:r>
+          </w:p>
+        </w:tc>
+      </w:tr>
+      <w:tr>
+        <w:tc>
+          <w:tcPr>
+            <w:tcW w:w="4680" w:type="dxa"/>
+          </w:tcPr>
+          <w:p>
+            <w:pPr/>
+            <w:r>
+              <w:t xml:space="preserve">The market bound is what the position clears at, not our own CPC (§6)</w:t>
+            </w:r>
+          </w:p>
+        </w:tc>
+        <w:tc>
+          <w:tcPr>
+            <w:tcW w:w="4680" w:type="dxa"/>
+          </w:tcPr>
+          <w:p>
+            <w:pPr/>
+            <w:r>
+              <w:t xml:space="preserve">Bound = the group's own top-of-search CPC + 15%</w:t>
+            </w:r>
+          </w:p>
+        </w:tc>
+      </w:tr>
+      <w:tr>
+        <w:tc>
+          <w:tcPr>
+            <w:tcW w:w="4680" w:type="dxa"/>
+          </w:tcPr>
+          <w:p>
+            <w:pPr/>
+            <w:r>
+              <w:t xml:space="preserve">Base cut capped at 25% where the row has sales; product pages over 20% means cut the base (§10)</w:t>
+            </w:r>
+          </w:p>
+        </w:tc>
+        <w:tc>
+          <w:tcPr>
+            <w:tcW w:w="4680" w:type="dxa"/>
+          </w:tcPr>
+          <w:p>
+            <w:pPr/>
+            <w:r>
+              <w:t xml:space="preserve">Leak-sized steps instead: 13% on a 55% product-page leak (seq 9, 10); 10% on 29–46% leaks (94, 195, 214, 264)</w:t>
+            </w:r>
+          </w:p>
+        </w:tc>
+      </w:tr>
+      <w:tr>
+        <w:tc>
+          <w:tcPr>
+            <w:tcW w:w="4680" w:type="dxa"/>
+          </w:tcPr>
+          <w:p>
+            <w:pPr/>
+            <w:r>
+              <w:t xml:space="preserve">A price comes down to a named point, never as a residue (§9)</w:t>
+            </w:r>
+          </w:p>
+        </w:tc>
+        <w:tc>
+          <w:tcPr>
+            <w:tcW w:w="4680" w:type="dxa"/>
+          </w:tcPr>
+          <w:p>
+            <w:pPr/>
+            <w:r>
+              <w:t xml:space="preserve">Top-of-search prices fell as a residue; seq 81 took one below its own ceiling</w:t>
+            </w:r>
+          </w:p>
+        </w:tc>
+      </w:tr>
+    </w:tbl>
+    <w:p>
+      <w:pPr/>
+      <w:r>
+        <w:rPr>
+          <w:b/>
+        </w:rPr>
+        <w:t xml:space="preserve">The flagged cuts, re-priced.</w:t>
+      </w:r>
+      <w:r>
+        <w:t xml:space="preserve"> Code red means no premium: each placement is priced at or under its ceiling (contribution $6.21 × that placement's conversion, blended as the engine blends it). Mix is the share of the campaign's clicks at top of search and on product pages.</w:t>
+      </w:r>
+    </w:p>
+    <w:tbl>
+      <w:tblPr>
+        <w:tblStyle w:val="TableGrid"/>
+        <w:tblW w:w="0" w:type="auto"/>
+        <w:tblLayout w:type="fixed"/>
+        <w:tblLook w:val="04A0" w:firstRow="1" w:lastRow="0" w:firstColumn="0" w:lastColumn="0" w:noHBand="0" w:noVBand="1"/>
+      </w:tblPr>
+      <w:tblGrid>
+        <w:gridCol w:w="1040"/>
+        <w:gridCol w:w="1040"/>
+        <w:gridCol w:w="1040"/>
+        <w:gridCol w:w="1040"/>
+        <w:gridCol w:w="1040"/>
+        <w:gridCol w:w="1040"/>
+        <w:gridCol w:w="1040"/>
+        <w:gridCol w:w="1040"/>
+        <w:gridCol w:w="1040"/>
+      </w:tblGrid>
+      <w:tr>
+        <w:trPr>
+          <w:tblHeader/>
+        </w:trPr>
+        <w:tc>
+          <w:tcPr>
+            <w:tcW w:w="1040" w:type="dxa"/>
+            <w:shd w:val="clear" w:color="auto" w:fill="F2F2F2"/>
+          </w:tcPr>
+          <w:p>
+            <w:pPr/>
+            <w:r>
+              <w:t xml:space="preserve">Seq</w:t>
+            </w:r>
+          </w:p>
+        </w:tc>
+        <w:tc>
+          <w:tcPr>
+            <w:tcW w:w="1040" w:type="dxa"/>
+            <w:shd w:val="clear" w:color="auto" w:fill="F2F2F2"/>
+          </w:tcPr>
+          <w:p>
+            <w:pPr/>
+            <w:r>
+              <w:t xml:space="preserve">Term</w:t>
+            </w:r>
+          </w:p>
+        </w:tc>
+        <w:tc>
+          <w:tcPr>
+            <w:tcW w:w="1040" w:type="dxa"/>
+            <w:shd w:val="clear" w:color="auto" w:fill="F2F2F2"/>
+          </w:tcPr>
+          <w:p>
+            <w:pPr/>
+            <w:r>
+              <w:t xml:space="preserve">Mix: top / product pages</w:t>
+            </w:r>
+          </w:p>
+        </w:tc>
+        <w:tc>
+          <w:tcPr>
+            <w:tcW w:w="1040" w:type="dxa"/>
+            <w:shd w:val="clear" w:color="auto" w:fill="F2F2F2"/>
+          </w:tcPr>
+          <w:p>
+            <w:pPr/>
+            <w:r>
+              <w:t xml:space="preserve">Top-of-search price, now → as deployed</w:t>
+            </w:r>
+          </w:p>
+        </w:tc>
+        <w:tc>
+          <w:tcPr>
+            <w:tcW w:w="1040" w:type="dxa"/>
+            <w:shd w:val="clear" w:color="auto" w:fill="F2F2F2"/>
+          </w:tcPr>
+          <w:p>
+            <w:pPr/>
+            <w:r>
+              <w:t xml:space="preserve">Top-of-search ceiling</w:t>
+            </w:r>
+          </w:p>
+        </w:tc>
+        <w:tc>
+          <w:tcPr>
+            <w:tcW w:w="1040" w:type="dxa"/>
+            <w:shd w:val="clear" w:color="auto" w:fill="F2F2F2"/>
+          </w:tcPr>
+          <w:p>
+            <w:pPr/>
+            <w:r>
+              <w:t xml:space="preserve">Deployed ÷ ceiling</w:t>
+            </w:r>
+          </w:p>
+        </w:tc>
+        <w:tc>
+          <w:tcPr>
+            <w:tcW w:w="1040" w:type="dxa"/>
+            <w:shd w:val="clear" w:color="auto" w:fill="F2F2F2"/>
+          </w:tcPr>
+          <w:p>
+            <w:pPr/>
+            <w:r>
+              <w:t xml:space="preserve">Base, now → run</w:t>
+            </w:r>
+          </w:p>
+        </w:tc>
+        <w:tc>
+          <w:tcPr>
+            <w:tcW w:w="1040" w:type="dxa"/>
+            <w:shd w:val="clear" w:color="auto" w:fill="F2F2F2"/>
+          </w:tcPr>
+          <w:p>
+            <w:pPr/>
+            <w:r>
+              <w:t xml:space="preserve">Product-page ceiling</w:t>
+            </w:r>
+          </w:p>
+        </w:tc>
+        <w:tc>
+          <w:tcPr>
+            <w:tcW w:w="1040" w:type="dxa"/>
+            <w:shd w:val="clear" w:color="auto" w:fill="F2F2F2"/>
+          </w:tcPr>
+          <w:p>
+            <w:pPr/>
+            <w:r>
+              <w:t xml:space="preserve">Correction</w:t>
+            </w:r>
+          </w:p>
+        </w:tc>
+      </w:tr>
+      <w:tr>
+        <w:tc>
+          <w:tcPr>
+            <w:tcW w:w="1040" w:type="dxa"/>
+          </w:tcPr>
+          <w:p>
+            <w:pPr/>
+            <w:r>
+              <w:t xml:space="preserve">4</w:t>
+            </w:r>
+          </w:p>
+        </w:tc>
+        <w:tc>
+          <w:tcPr>
+            <w:tcW w:w="1040" w:type="dxa"/>
+          </w:tcPr>
+          <w:p>
+            <w:pPr/>
+            <w:r>
+              <w:t xml:space="preserve">satin sheets</w:t>
+            </w:r>
+          </w:p>
+        </w:tc>
+        <w:tc>
+          <w:tcPr>
+            <w:tcW w:w="1040" w:type="dxa"/>
+          </w:tcPr>
+          <w:p>
+            <w:pPr/>
+            <w:r>
+              <w:t xml:space="preserve">86% / 10%</w:t>
+            </w:r>
+          </w:p>
+        </w:tc>
+        <w:tc>
+          <w:tcPr>
+            <w:tcW w:w="1040" w:type="dxa"/>
+          </w:tcPr>
+          <w:p>
+            <w:pPr/>
+            <w:r>
+              <w:t xml:space="preserve">$2.30 → $1.78</w:t>
+            </w:r>
+          </w:p>
+        </w:tc>
+        <w:tc>
+          <w:tcPr>
+            <w:tcW w:w="1040" w:type="dxa"/>
+          </w:tcPr>
+          <w:p>
+            <w:pPr/>
+            <w:r>
+              <w:t xml:space="preserve">$1.06</w:t>
+            </w:r>
+          </w:p>
+        </w:tc>
+        <w:tc>
+          <w:tcPr>
+            <w:tcW w:w="1040" w:type="dxa"/>
+          </w:tcPr>
+          <w:p>
+            <w:pPr/>
+            <w:r>
+              <w:t xml:space="preserve">1.7×</w:t>
+            </w:r>
+          </w:p>
+        </w:tc>
+        <w:tc>
+          <w:tcPr>
+            <w:tcW w:w="1040" w:type="dxa"/>
+          </w:tcPr>
+          <w:p>
+            <w:pPr/>
+            <w:r>
+              <w:t xml:space="preserve">$1.15 → $0.89</w:t>
+            </w:r>
+          </w:p>
+        </w:tc>
+        <w:tc>
+          <w:tcPr>
+            <w:tcW w:w="1040" w:type="dxa"/>
+          </w:tcPr>
+          <w:p>
+            <w:pPr/>
+            <w:r>
+              <w:t xml:space="preserve">$0.82</w:t>
+            </w:r>
+          </w:p>
+        </w:tc>
+        <w:tc>
+          <w:tcPr>
+            <w:tcW w:w="1040" w:type="dxa"/>
+          </w:tcPr>
+          <w:p>
+            <w:pPr/>
+            <w:r>
+              <w:t xml:space="preserve">Stands; next step toward $1.06</w:t>
+            </w:r>
+          </w:p>
+        </w:tc>
+      </w:tr>
+      <w:tr>
+        <w:tc>
+          <w:tcPr>
+            <w:tcW w:w="1040" w:type="dxa"/>
+          </w:tcPr>
+          <w:p>
+            <w:pPr/>
+            <w:r>
+              <w:t xml:space="preserve">9, 10, 6</w:t>
+            </w:r>
+          </w:p>
+        </w:tc>
+        <w:tc>
+          <w:tcPr>
+            <w:tcW w:w="1040" w:type="dxa"/>
+          </w:tcPr>
+          <w:p>
+            <w:pPr/>
+            <w:r>
+              <w:t xml:space="preserve">satin sheets queen size</w:t>
+            </w:r>
+          </w:p>
+        </w:tc>
+        <w:tc>
+          <w:tcPr>
+            <w:tcW w:w="1040" w:type="dxa"/>
+          </w:tcPr>
+          <w:p>
+            <w:pPr/>
+            <w:r>
+              <w:t xml:space="preserve">42% / 55%</w:t>
+            </w:r>
+          </w:p>
+        </w:tc>
+        <w:tc>
+          <w:tcPr>
+            <w:tcW w:w="1040" w:type="dxa"/>
+          </w:tcPr>
+          <w:p>
+            <w:pPr/>
+            <w:r>
+              <w:t xml:space="preserve">$3.89 → $2.96</w:t>
+            </w:r>
+          </w:p>
+        </w:tc>
+        <w:tc>
+          <w:tcPr>
+            <w:tcW w:w="1040" w:type="dxa"/>
+          </w:tcPr>
+          <w:p>
+            <w:pPr/>
+            <w:r>
+              <w:t xml:space="preserve">$1.81</w:t>
+            </w:r>
+          </w:p>
+        </w:tc>
+        <w:tc>
+          <w:tcPr>
+            <w:tcW w:w="1040" w:type="dxa"/>
+          </w:tcPr>
+          <w:p>
+            <w:pPr/>
+            <w:r>
+              <w:t xml:space="preserve">1.6×</w:t>
+            </w:r>
+          </w:p>
+        </w:tc>
+        <w:tc>
+          <w:tcPr>
+            <w:tcW w:w="1040" w:type="dxa"/>
+          </w:tcPr>
+          <w:p>
+            <w:pPr/>
+            <w:r>
+              <w:t xml:space="preserve">$2.25 → $1.96</w:t>
+            </w:r>
+          </w:p>
+        </w:tc>
+        <w:tc>
+          <w:tcPr>
+            <w:tcW w:w="1040" w:type="dxa"/>
+          </w:tcPr>
+          <w:p>
+            <w:pPr/>
+            <w:r>
+              <w:t xml:space="preserve">$0.83</w:t>
+            </w:r>
+          </w:p>
+        </w:tc>
+        <w:tc>
+          <w:tcPr>
+            <w:tcW w:w="1040" w:type="dxa"/>
+          </w:tcPr>
+          <w:p>
+            <w:pPr/>
+            <w:r>
+              <w:rPr>
+                <w:b/>
+              </w:rPr>
+              <w:t xml:space="preserve">Base $1.69</w:t>
+            </w:r>
+            <w:r>
+              <w:t xml:space="preserve"> (−25%, the cap with sales); modifier 51% → top of search $2.55</w:t>
+            </w:r>
+          </w:p>
+        </w:tc>
+      </w:tr>
+      <w:tr>
+        <w:tc>
+          <w:tcPr>
+            <w:tcW w:w="1040" w:type="dxa"/>
+          </w:tcPr>
+          <w:p>
+            <w:pPr/>
+            <w:r>
+              <w:t xml:space="preserve">84, 81</w:t>
+            </w:r>
+          </w:p>
+        </w:tc>
+        <w:tc>
+          <w:tcPr>
+            <w:tcW w:w="1040" w:type="dxa"/>
+          </w:tcPr>
+          <w:p>
+            <w:pPr/>
+            <w:r>
+              <w:t xml:space="preserve">silk sheets queen</w:t>
+            </w:r>
+          </w:p>
+        </w:tc>
+        <w:tc>
+          <w:tcPr>
+            <w:tcW w:w="1040" w:type="dxa"/>
+          </w:tcPr>
+          <w:p>
+            <w:pPr/>
+            <w:r>
+              <w:t xml:space="preserve">94% / 6%</w:t>
+            </w:r>
+          </w:p>
+        </w:tc>
+        <w:tc>
+          <w:tcPr>
+            <w:tcW w:w="1040" w:type="dxa"/>
+          </w:tcPr>
+          <w:p>
+            <w:pPr/>
+            <w:r>
+              <w:t xml:space="preserve">$2.34 → $1.51</w:t>
+            </w:r>
+          </w:p>
+        </w:tc>
+        <w:tc>
+          <w:tcPr>
+            <w:tcW w:w="1040" w:type="dxa"/>
+          </w:tcPr>
+          <w:p>
+            <w:pPr/>
+            <w:r>
+              <w:t xml:space="preserve">$1.74</w:t>
+            </w:r>
+          </w:p>
+        </w:tc>
+        <w:tc>
+          <w:tcPr>
+            <w:tcW w:w="1040" w:type="dxa"/>
+          </w:tcPr>
+          <w:p>
+            <w:pPr/>
+            <w:r>
+              <w:t xml:space="preserve">0.9×</w:t>
+            </w:r>
+          </w:p>
+        </w:tc>
+        <w:tc>
+          <w:tcPr>
+            <w:tcW w:w="1040" w:type="dxa"/>
+          </w:tcPr>
+          <w:p>
+            <w:pPr/>
+            <w:r>
+              <w:t xml:space="preserve">$1.17 → $0.89</w:t>
+            </w:r>
+          </w:p>
+        </w:tc>
+        <w:tc>
+          <w:tcPr>
+            <w:tcW w:w="1040" w:type="dxa"/>
+          </w:tcPr>
+          <w:p>
+            <w:pPr/>
+            <w:r>
+              <w:t xml:space="preserve">unread</w:t>
+            </w:r>
+          </w:p>
+        </w:tc>
+        <w:tc>
+          <w:tcPr>
+            <w:tcW w:w="1040" w:type="dxa"/>
+          </w:tcPr>
+          <w:p>
+            <w:pPr/>
+            <w:r>
+              <w:rPr>
+                <w:b/>
+              </w:rPr>
+              <w:t xml:space="preserve">Hold the modifier at 100%</w:t>
+            </w:r>
+            <w:r>
+              <w:t xml:space="preserve"> (drop seq 81): top of search $1.78, at its ceiling</w:t>
+            </w:r>
+          </w:p>
+        </w:tc>
+      </w:tr>
+      <w:tr>
+        <w:tc>
+          <w:tcPr>
+            <w:tcW w:w="1040" w:type="dxa"/>
+          </w:tcPr>
+          <w:p>
+            <w:pPr/>
+            <w:r>
+              <w:t xml:space="preserve">74</w:t>
+            </w:r>
+          </w:p>
+        </w:tc>
+        <w:tc>
+          <w:tcPr>
+            <w:tcW w:w="1040" w:type="dxa"/>
+          </w:tcPr>
+          <w:p>
+            <w:pPr/>
+            <w:r>
+              <w:t xml:space="preserve">silk sheets</w:t>
+            </w:r>
+          </w:p>
+        </w:tc>
+        <w:tc>
+          <w:tcPr>
+            <w:tcW w:w="1040" w:type="dxa"/>
+          </w:tcPr>
+          <w:p>
+            <w:pPr/>
+            <w:r>
+              <w:t xml:space="preserve">92% / 6%</w:t>
+            </w:r>
+          </w:p>
+        </w:tc>
+        <w:tc>
+          <w:tcPr>
+            <w:tcW w:w="1040" w:type="dxa"/>
+          </w:tcPr>
+          <w:p>
+            <w:pPr/>
+            <w:r>
+              <w:t xml:space="preserve">$2.25 → $2.12</w:t>
+            </w:r>
+          </w:p>
+        </w:tc>
+        <w:tc>
+          <w:tcPr>
+            <w:tcW w:w="1040" w:type="dxa"/>
+          </w:tcPr>
+          <w:p>
+            <w:pPr/>
+            <w:r>
+              <w:t xml:space="preserve">$0.83</w:t>
+            </w:r>
+          </w:p>
+        </w:tc>
+        <w:tc>
+          <w:tcPr>
+            <w:tcW w:w="1040" w:type="dxa"/>
+          </w:tcPr>
+          <w:p>
+            <w:pPr/>
+            <w:r>
+              <w:t xml:space="preserve">2.6×</w:t>
+            </w:r>
+          </w:p>
+        </w:tc>
+        <w:tc>
+          <w:tcPr>
+            <w:tcW w:w="1040" w:type="dxa"/>
+          </w:tcPr>
+          <w:p>
+            <w:pPr/>
+            <w:r>
+              <w:t xml:space="preserve">$0.98 → $0.92</w:t>
+            </w:r>
+          </w:p>
+        </w:tc>
+        <w:tc>
+          <w:tcPr>
+            <w:tcW w:w="1040" w:type="dxa"/>
+          </w:tcPr>
+          <w:p>
+            <w:pPr/>
+            <w:r>
+              <w:t xml:space="preserve">unread</w:t>
+            </w:r>
+          </w:p>
+        </w:tc>
+        <w:tc>
+          <w:tcPr>
+            <w:tcW w:w="1040" w:type="dxa"/>
+          </w:tcPr>
+          <w:p>
+            <w:pPr/>
+            <w:r>
+              <w:t xml:space="preserve">Stands</w:t>
+            </w:r>
+          </w:p>
+        </w:tc>
+      </w:tr>
+      <w:tr>
+        <w:tc>
+          <w:tcPr>
+            <w:tcW w:w="1040" w:type="dxa"/>
+          </w:tcPr>
+          <w:p>
+            <w:pPr/>
+            <w:r>
+              <w:t xml:space="preserve">94</w:t>
+            </w:r>
+          </w:p>
+        </w:tc>
+        <w:tc>
+          <w:tcPr>
+            <w:tcW w:w="1040" w:type="dxa"/>
+          </w:tcPr>
+          <w:p>
+            <w:pPr/>
+            <w:r>
+              <w:t xml:space="preserve">satin sheets for queen</w:t>
+            </w:r>
+          </w:p>
+        </w:tc>
+        <w:tc>
+          <w:tcPr>
+            <w:tcW w:w="1040" w:type="dxa"/>
+          </w:tcPr>
+          <w:p>
+            <w:pPr/>
+            <w:r>
+              <w:t xml:space="preserve">69% / 29%</w:t>
+            </w:r>
+          </w:p>
+        </w:tc>
+        <w:tc>
+          <w:tcPr>
+            <w:tcW w:w="1040" w:type="dxa"/>
+          </w:tcPr>
+          <w:p>
+            <w:pPr/>
+            <w:r>
+              <w:t xml:space="preserve">$3.12 → $2.82</w:t>
+            </w:r>
+          </w:p>
+        </w:tc>
+        <w:tc>
+          <w:tcPr>
+            <w:tcW w:w="1040" w:type="dxa"/>
+          </w:tcPr>
+          <w:p>
+            <w:pPr/>
+            <w:r>
+              <w:t xml:space="preserve">$1.18</w:t>
+            </w:r>
+          </w:p>
+        </w:tc>
+        <w:tc>
+          <w:tcPr>
+            <w:tcW w:w="1040" w:type="dxa"/>
+          </w:tcPr>
+          <w:p>
+            <w:pPr/>
+            <w:r>
+              <w:t xml:space="preserve">2.4×</w:t>
+            </w:r>
+          </w:p>
+        </w:tc>
+        <w:tc>
+          <w:tcPr>
+            <w:tcW w:w="1040" w:type="dxa"/>
+          </w:tcPr>
+          <w:p>
+            <w:pPr/>
+            <w:r>
+              <w:t xml:space="preserve">$1.42 → $1.28</w:t>
+            </w:r>
+          </w:p>
+        </w:tc>
+        <w:tc>
+          <w:tcPr>
+            <w:tcW w:w="1040" w:type="dxa"/>
+          </w:tcPr>
+          <w:p>
+            <w:pPr/>
+            <w:r>
+              <w:t xml:space="preserve">$1.10</w:t>
+            </w:r>
+          </w:p>
+        </w:tc>
+        <w:tc>
+          <w:tcPr>
+            <w:tcW w:w="1040" w:type="dxa"/>
+          </w:tcPr>
+          <w:p>
+            <w:pPr/>
+            <w:r>
+              <w:rPr>
+                <w:b/>
+              </w:rPr>
+              <w:t xml:space="preserve">Base $1.10</w:t>
+            </w:r>
+            <w:r>
+              <w:t xml:space="preserve"> (to its product-page ceiling, −23%); top of search $2.42</w:t>
+            </w:r>
+          </w:p>
+        </w:tc>
+      </w:tr>
+      <w:tr>
+        <w:tc>
+          <w:tcPr>
+            <w:tcW w:w="1040" w:type="dxa"/>
+          </w:tcPr>
+          <w:p>
+            <w:pPr/>
+            <w:r>
+              <w:t xml:space="preserve">155</w:t>
+            </w:r>
+          </w:p>
+        </w:tc>
+        <w:tc>
+          <w:tcPr>
+            <w:tcW w:w="1040" w:type="dxa"/>
+          </w:tcPr>
+          <w:p>
+            <w:pPr/>
+            <w:r>
+              <w:t xml:space="preserve">black satin sheets full</w:t>
+            </w:r>
+          </w:p>
+        </w:tc>
+        <w:tc>
+          <w:tcPr>
+            <w:tcW w:w="1040" w:type="dxa"/>
+          </w:tcPr>
+          <w:p>
+            <w:pPr/>
+            <w:r>
+              <w:t xml:space="preserve">86% / 6%</w:t>
+            </w:r>
+          </w:p>
+        </w:tc>
+        <w:tc>
+          <w:tcPr>
+            <w:tcW w:w="1040" w:type="dxa"/>
+          </w:tcPr>
+          <w:p>
+            <w:pPr/>
+            <w:r>
+              <w:t xml:space="preserve">$2.54 → $2.28</w:t>
+            </w:r>
+          </w:p>
+        </w:tc>
+        <w:tc>
+          <w:tcPr>
+            <w:tcW w:w="1040" w:type="dxa"/>
+          </w:tcPr>
+          <w:p>
+            <w:pPr/>
+            <w:r>
+              <w:t xml:space="preserve">$1.75</w:t>
+            </w:r>
+          </w:p>
+        </w:tc>
+        <w:tc>
+          <w:tcPr>
+            <w:tcW w:w="1040" w:type="dxa"/>
+          </w:tcPr>
+          <w:p>
+            <w:pPr/>
+            <w:r>
+              <w:t xml:space="preserve">1.3×</w:t>
+            </w:r>
+          </w:p>
+        </w:tc>
+        <w:tc>
+          <w:tcPr>
+            <w:tcW w:w="1040" w:type="dxa"/>
+          </w:tcPr>
+          <w:p>
+            <w:pPr/>
+            <w:r>
+              <w:t xml:space="preserve">$1.27 → $1.14</w:t>
+            </w:r>
+          </w:p>
+        </w:tc>
+        <w:tc>
+          <w:tcPr>
+            <w:tcW w:w="1040" w:type="dxa"/>
+          </w:tcPr>
+          <w:p>
+            <w:pPr/>
+            <w:r>
+              <w:t xml:space="preserve">unread</w:t>
+            </w:r>
+          </w:p>
+        </w:tc>
+        <w:tc>
+          <w:tcPr>
+            <w:tcW w:w="1040" w:type="dxa"/>
+          </w:tcPr>
+          <w:p>
+            <w:pPr/>
+            <w:r>
+              <w:t xml:space="preserve">Stands</w:t>
+            </w:r>
+          </w:p>
+        </w:tc>
+      </w:tr>
+      <w:tr>
+        <w:tc>
+          <w:tcPr>
+            <w:tcW w:w="1040" w:type="dxa"/>
+          </w:tcPr>
+          <w:p>
+            <w:pPr/>
+            <w:r>
+              <w:t xml:space="preserve">195</w:t>
+            </w:r>
+          </w:p>
+        </w:tc>
+        <w:tc>
+          <w:tcPr>
+            <w:tcW w:w="1040" w:type="dxa"/>
+          </w:tcPr>
+          <w:p>
+            <w:pPr/>
+            <w:r>
+              <w:t xml:space="preserve">white satin sheets</w:t>
+            </w:r>
+          </w:p>
+        </w:tc>
+        <w:tc>
+          <w:tcPr>
+            <w:tcW w:w="1040" w:type="dxa"/>
+          </w:tcPr>
+          <w:p>
+            <w:pPr/>
+            <w:r>
+              <w:t xml:space="preserve">54% / 46%</w:t>
+            </w:r>
+          </w:p>
+        </w:tc>
+        <w:tc>
+          <w:tcPr>
+            <w:tcW w:w="1040" w:type="dxa"/>
+          </w:tcPr>
+          <w:p>
+            <w:pPr/>
+            <w:r>
+              <w:t xml:space="preserve">$2.06 → $1.85</w:t>
+            </w:r>
+          </w:p>
+        </w:tc>
+        <w:tc>
+          <w:tcPr>
+            <w:tcW w:w="1040" w:type="dxa"/>
+          </w:tcPr>
+          <w:p>
+            <w:pPr/>
+            <w:r>
+              <w:t xml:space="preserve">$0.97</w:t>
+            </w:r>
+          </w:p>
+        </w:tc>
+        <w:tc>
+          <w:tcPr>
+            <w:tcW w:w="1040" w:type="dxa"/>
+          </w:tcPr>
+          <w:p>
+            <w:pPr/>
+            <w:r>
+              <w:t xml:space="preserve">1.9×</w:t>
+            </w:r>
+          </w:p>
+        </w:tc>
+        <w:tc>
+          <w:tcPr>
+            <w:tcW w:w="1040" w:type="dxa"/>
+          </w:tcPr>
+          <w:p>
+            <w:pPr/>
+            <w:r>
+              <w:t xml:space="preserve">$0.98 → $0.88</w:t>
+            </w:r>
+          </w:p>
+        </w:tc>
+        <w:tc>
+          <w:tcPr>
+            <w:tcW w:w="1040" w:type="dxa"/>
+          </w:tcPr>
+          <w:p>
+            <w:pPr/>
+            <w:r>
+              <w:t xml:space="preserve">unread</w:t>
+            </w:r>
+          </w:p>
+        </w:tc>
+        <w:tc>
+          <w:tcPr>
+            <w:tcW w:w="1040" w:type="dxa"/>
+          </w:tcPr>
+          <w:p>
+            <w:pPr/>
+            <w:r>
+              <w:rPr>
+                <w:b/>
+              </w:rPr>
+              <w:t xml:space="preserve">Base $0.74</w:t>
+            </w:r>
+            <w:r>
+              <w:t xml:space="preserve"> (−25%); top of search $1.55</w:t>
+            </w:r>
+          </w:p>
+        </w:tc>
+      </w:tr>
+      <w:tr>
+        <w:tc>
+          <w:tcPr>
+            <w:tcW w:w="1040" w:type="dxa"/>
+          </w:tcPr>
+          <w:p>
+            <w:pPr/>
+            <w:r>
+              <w:t xml:space="preserve">214</w:t>
+            </w:r>
+          </w:p>
+        </w:tc>
+        <w:tc>
+          <w:tcPr>
+            <w:tcW w:w="1040" w:type="dxa"/>
+          </w:tcPr>
+          <w:p>
+            <w:pPr/>
+            <w:r>
+              <w:t xml:space="preserve">green satin sheets</w:t>
+            </w:r>
+          </w:p>
+        </w:tc>
+        <w:tc>
+          <w:tcPr>
+            <w:tcW w:w="1040" w:type="dxa"/>
+          </w:tcPr>
+          <w:p>
+            <w:pPr/>
+            <w:r>
+              <w:t xml:space="preserve">56% / 40%</w:t>
+            </w:r>
+          </w:p>
+        </w:tc>
+        <w:tc>
+          <w:tcPr>
+            <w:tcW w:w="1040" w:type="dxa"/>
+          </w:tcPr>
+          <w:p>
+            <w:pPr/>
+            <w:r>
+              <w:t xml:space="preserve">$2.18 → $1.98</w:t>
+            </w:r>
+          </w:p>
+        </w:tc>
+        <w:tc>
+          <w:tcPr>
+            <w:tcW w:w="1040" w:type="dxa"/>
+          </w:tcPr>
+          <w:p>
+            <w:pPr/>
+            <w:r>
+              <w:t xml:space="preserve">$0.97</w:t>
+            </w:r>
+          </w:p>
+        </w:tc>
+        <w:tc>
+          <w:tcPr>
+            <w:tcW w:w="1040" w:type="dxa"/>
+          </w:tcPr>
+          <w:p>
+            <w:pPr/>
+            <w:r>
+              <w:t xml:space="preserve">2.0×</w:t>
+            </w:r>
+          </w:p>
+        </w:tc>
+        <w:tc>
+          <w:tcPr>
+            <w:tcW w:w="1040" w:type="dxa"/>
+          </w:tcPr>
+          <w:p>
+            <w:pPr/>
+            <w:r>
+              <w:t xml:space="preserve">$1.15 → $1.04</w:t>
+            </w:r>
+          </w:p>
+        </w:tc>
+        <w:tc>
+          <w:tcPr>
+            <w:tcW w:w="1040" w:type="dxa"/>
+          </w:tcPr>
+          <w:p>
+            <w:pPr/>
+            <w:r>
+              <w:t xml:space="preserve">unread</w:t>
+            </w:r>
+          </w:p>
+        </w:tc>
+        <w:tc>
+          <w:tcPr>
+            <w:tcW w:w="1040" w:type="dxa"/>
+          </w:tcPr>
+          <w:p>
+            <w:pPr/>
+            <w:r>
+              <w:rPr>
+                <w:b/>
+              </w:rPr>
+              <w:t xml:space="preserve">Base $0.86</w:t>
+            </w:r>
+            <w:r>
+              <w:t xml:space="preserve"> (−25%); top of search $1.64</w:t>
+            </w:r>
+          </w:p>
+        </w:tc>
+      </w:tr>
+      <w:tr>
+        <w:tc>
+          <w:tcPr>
+            <w:tcW w:w="1040" w:type="dxa"/>
+          </w:tcPr>
+          <w:p>
+            <w:pPr/>
+            <w:r>
+              <w:t xml:space="preserve">264</w:t>
+            </w:r>
+          </w:p>
+        </w:tc>
+        <w:tc>
+          <w:tcPr>
+            <w:tcW w:w="1040" w:type="dxa"/>
+          </w:tcPr>
+          <w:p>
+            <w:pPr/>
+            <w:r>
+              <w:t xml:space="preserve">gold silk sheets</w:t>
+            </w:r>
+          </w:p>
+        </w:tc>
+        <w:tc>
+          <w:tcPr>
+            <w:tcW w:w="1040" w:type="dxa"/>
+          </w:tcPr>
+          <w:p>
+            <w:pPr/>
+            <w:r>
+              <w:t xml:space="preserve">64% / 32%</w:t>
+            </w:r>
+          </w:p>
+        </w:tc>
+        <w:tc>
+          <w:tcPr>
+            <w:tcW w:w="1040" w:type="dxa"/>
+          </w:tcPr>
+          <w:p>
+            <w:pPr/>
+            <w:r>
+              <w:t xml:space="preserve">$1.59 → $1.43</w:t>
+            </w:r>
+          </w:p>
+        </w:tc>
+        <w:tc>
+          <w:tcPr>
+            <w:tcW w:w="1040" w:type="dxa"/>
+          </w:tcPr>
+          <w:p>
+            <w:pPr/>
+            <w:r>
+              <w:t xml:space="preserve">$0.83</w:t>
+            </w:r>
+          </w:p>
+        </w:tc>
+        <w:tc>
+          <w:tcPr>
+            <w:tcW w:w="1040" w:type="dxa"/>
+          </w:tcPr>
+          <w:p>
+            <w:pPr/>
+            <w:r>
+              <w:t xml:space="preserve">1.7×</w:t>
+            </w:r>
+          </w:p>
+        </w:tc>
+        <w:tc>
+          <w:tcPr>
+            <w:tcW w:w="1040" w:type="dxa"/>
+          </w:tcPr>
+          <w:p>
+            <w:pPr/>
+            <w:r>
+              <w:t xml:space="preserve">$0.59 → $0.53</w:t>
+            </w:r>
+          </w:p>
+        </w:tc>
+        <w:tc>
+          <w:tcPr>
+            <w:tcW w:w="1040" w:type="dxa"/>
+          </w:tcPr>
+          <w:p>
+            <w:pPr/>
+            <w:r>
+              <w:t xml:space="preserve">unread</w:t>
+            </w:r>
+          </w:p>
+        </w:tc>
+        <w:tc>
+          <w:tcPr>
+            <w:tcW w:w="1040" w:type="dxa"/>
+          </w:tcPr>
+          <w:p>
+            <w:pPr/>
+            <w:r>
+              <w:rPr>
+                <w:b/>
+              </w:rPr>
+              <w:t xml:space="preserve">Base $0.44</w:t>
+            </w:r>
+            <w:r>
+              <w:t xml:space="preserve"> (−25%, at the base floor); top of search $1.19</w:t>
+            </w:r>
+          </w:p>
+        </w:tc>
+      </w:tr>
+      <w:tr>
+        <w:tc>
+          <w:tcPr>
+            <w:tcW w:w="1040" w:type="dxa"/>
+          </w:tcPr>
+          <w:p>
+            <w:pPr/>
+            <w:r>
+              <w:t xml:space="preserve">16</w:t>
+            </w:r>
+          </w:p>
+        </w:tc>
+        <w:tc>
+          <w:tcPr>
+            <w:tcW w:w="1040" w:type="dxa"/>
+          </w:tcPr>
+          <w:p>
+            <w:pPr/>
+            <w:r>
+              <w:t xml:space="preserve">king silk sheet set</w:t>
+            </w:r>
+          </w:p>
+        </w:tc>
+        <w:tc>
+          <w:tcPr>
+            <w:tcW w:w="1040" w:type="dxa"/>
+          </w:tcPr>
+          <w:p>
+            <w:pPr/>
+            <w:r>
+              <w:t xml:space="preserve">84% / 4%</w:t>
+            </w:r>
+          </w:p>
+        </w:tc>
+        <w:tc>
+          <w:tcPr>
+            <w:tcW w:w="1040" w:type="dxa"/>
+          </w:tcPr>
+          <w:p>
+            <w:pPr/>
+            <w:r>
+              <w:t xml:space="preserve">$5.50 → $4.14</w:t>
+            </w:r>
+          </w:p>
+        </w:tc>
+        <w:tc>
+          <w:tcPr>
+            <w:tcW w:w="1040" w:type="dxa"/>
+          </w:tcPr>
+          <w:p>
+            <w:pPr/>
+            <w:r>
+              <w:t xml:space="preserve">$1.20</w:t>
+            </w:r>
+          </w:p>
+        </w:tc>
+        <w:tc>
+          <w:tcPr>
+            <w:tcW w:w="1040" w:type="dxa"/>
+          </w:tcPr>
+          <w:p>
+            <w:pPr/>
+            <w:r>
+              <w:t xml:space="preserve">3.4×</w:t>
+            </w:r>
+          </w:p>
+        </w:tc>
+        <w:tc>
+          <w:tcPr>
+            <w:tcW w:w="1040" w:type="dxa"/>
+          </w:tcPr>
+          <w:p>
+            <w:pPr/>
+            <w:r>
+              <w:t xml:space="preserve">$2.75 → $2.07</w:t>
+            </w:r>
+          </w:p>
+        </w:tc>
+        <w:tc>
+          <w:tcPr>
+            <w:tcW w:w="1040" w:type="dxa"/>
+          </w:tcPr>
+          <w:p>
+            <w:pPr/>
+            <w:r>
+              <w:t xml:space="preserve">$1.00</w:t>
+            </w:r>
+          </w:p>
+        </w:tc>
+        <w:tc>
+          <w:tcPr>
+            <w:tcW w:w="1040" w:type="dxa"/>
+          </w:tcPr>
+          <w:p>
+            <w:pPr/>
+            <w:r>
+              <w:t xml:space="preserve">Stands</w:t>
+            </w:r>
+          </w:p>
+        </w:tc>
+      </w:tr>
+      <w:tr>
+        <w:tc>
+          <w:tcPr>
+            <w:tcW w:w="1040" w:type="dxa"/>
+          </w:tcPr>
+          <w:p>
+            <w:pPr/>
+            <w:r>
+              <w:t xml:space="preserve">21</w:t>
+            </w:r>
+          </w:p>
+        </w:tc>
+        <w:tc>
+          <w:tcPr>
+            <w:tcW w:w="1040" w:type="dxa"/>
+          </w:tcPr>
+          <w:p>
+            <w:pPr/>
+            <w:r>
+              <w:t xml:space="preserve">king size silk sheets</w:t>
+            </w:r>
+          </w:p>
+        </w:tc>
+        <w:tc>
+          <w:tcPr>
+            <w:tcW w:w="1040" w:type="dxa"/>
+          </w:tcPr>
+          <w:p>
+            <w:pPr/>
+            <w:r>
+              <w:t xml:space="preserve">76% / 12%</w:t>
+            </w:r>
+          </w:p>
+        </w:tc>
+        <w:tc>
+          <w:tcPr>
+            <w:tcW w:w="1040" w:type="dxa"/>
+          </w:tcPr>
+          <w:p>
+            <w:pPr/>
+            <w:r>
+              <w:t xml:space="preserve">$4.60 → $3.46</w:t>
+            </w:r>
+          </w:p>
+        </w:tc>
+        <w:tc>
+          <w:tcPr>
+            <w:tcW w:w="1040" w:type="dxa"/>
+          </w:tcPr>
+          <w:p>
+            <w:pPr/>
+            <w:r>
+              <w:t xml:space="preserve">$0.91</w:t>
+            </w:r>
+          </w:p>
+        </w:tc>
+        <w:tc>
+          <w:tcPr>
+            <w:tcW w:w="1040" w:type="dxa"/>
+          </w:tcPr>
+          <w:p>
+            <w:pPr/>
+            <w:r>
+              <w:t xml:space="preserve">3.8×</w:t>
+            </w:r>
+          </w:p>
+        </w:tc>
+        <w:tc>
+          <w:tcPr>
+            <w:tcW w:w="1040" w:type="dxa"/>
+          </w:tcPr>
+          <w:p>
+            <w:pPr/>
+            <w:r>
+              <w:t xml:space="preserve">$2.30 → $1.73</w:t>
+            </w:r>
+          </w:p>
+        </w:tc>
+        <w:tc>
+          <w:tcPr>
+            <w:tcW w:w="1040" w:type="dxa"/>
+          </w:tcPr>
+          <w:p>
+            <w:pPr/>
+            <w:r>
+              <w:t xml:space="preserve">$1.03</w:t>
+            </w:r>
+          </w:p>
+        </w:tc>
+        <w:tc>
+          <w:tcPr>
+            <w:tcW w:w="1040" w:type="dxa"/>
+          </w:tcPr>
+          <w:p>
+            <w:pPr/>
+            <w:r>
+              <w:t xml:space="preserve">Stands</w:t>
+            </w:r>
+          </w:p>
+        </w:tc>
+      </w:tr>
+      <w:tr>
+        <w:tc>
+          <w:tcPr>
+            <w:tcW w:w="1040" w:type="dxa"/>
+          </w:tcPr>
+          <w:p>
+            <w:pPr/>
+            <w:r>
+              <w:t xml:space="preserve">104–107</w:t>
+            </w:r>
+          </w:p>
+        </w:tc>
+        <w:tc>
+          <w:tcPr>
+            <w:tcW w:w="1040" w:type="dxa"/>
+          </w:tcPr>
+          <w:p>
+            <w:pPr/>
+            <w:r>
+              <w:t xml:space="preserve">queen sheet silk</w:t>
+            </w:r>
+          </w:p>
+        </w:tc>
+        <w:tc>
+          <w:tcPr>
+            <w:tcW w:w="1040" w:type="dxa"/>
+          </w:tcPr>
+          <w:p>
+            <w:pPr/>
+            <w:r>
+              <w:t xml:space="preserve">85% / 13%</w:t>
+            </w:r>
+          </w:p>
+        </w:tc>
+        <w:tc>
+          <w:tcPr>
+            <w:tcW w:w="1040" w:type="dxa"/>
+          </w:tcPr>
+          <w:p>
+            <w:pPr/>
+            <w:r>
+              <w:t xml:space="preserve">$3.36 → $2.36</w:t>
+            </w:r>
+          </w:p>
+        </w:tc>
+        <w:tc>
+          <w:tcPr>
+            <w:tcW w:w="1040" w:type="dxa"/>
+          </w:tcPr>
+          <w:p>
+            <w:pPr/>
+            <w:r>
+              <w:t xml:space="preserve">$1.07</w:t>
+            </w:r>
+          </w:p>
+        </w:tc>
+        <w:tc>
+          <w:tcPr>
+            <w:tcW w:w="1040" w:type="dxa"/>
+          </w:tcPr>
+          <w:p>
+            <w:pPr/>
+            <w:r>
+              <w:t xml:space="preserve">2.2×</w:t>
+            </w:r>
+          </w:p>
+        </w:tc>
+        <w:tc>
+          <w:tcPr>
+            <w:tcW w:w="1040" w:type="dxa"/>
+          </w:tcPr>
+          <w:p>
+            <w:pPr/>
+            <w:r>
+              <w:t xml:space="preserve">$1.68 → $1.18</w:t>
+            </w:r>
+          </w:p>
+        </w:tc>
+        <w:tc>
+          <w:tcPr>
+            <w:tcW w:w="1040" w:type="dxa"/>
+          </w:tcPr>
+          <w:p>
+            <w:pPr/>
+            <w:r>
+              <w:t xml:space="preserve">unread</w:t>
+            </w:r>
+          </w:p>
+        </w:tc>
+        <w:tc>
+          <w:tcPr>
+            <w:tcW w:w="1040" w:type="dxa"/>
+          </w:tcPr>
+          <w:p>
+            <w:pPr/>
+            <w:r>
+              <w:t xml:space="preserve">Stands</w:t>
+            </w:r>
+          </w:p>
+        </w:tc>
+      </w:tr>
+      <w:tr>
+        <w:tc>
+          <w:tcPr>
+            <w:tcW w:w="1040" w:type="dxa"/>
+          </w:tcPr>
+          <w:p>
+            <w:pPr/>
+            <w:r>
+              <w:t xml:space="preserve">130</w:t>
+            </w:r>
+          </w:p>
+        </w:tc>
+        <w:tc>
+          <w:tcPr>
+            <w:tcW w:w="1040" w:type="dxa"/>
+          </w:tcPr>
+          <w:p>
+            <w:pPr/>
+            <w:r>
+              <w:t xml:space="preserve">silk black sheets</w:t>
+            </w:r>
+          </w:p>
+        </w:tc>
+        <w:tc>
+          <w:tcPr>
+            <w:tcW w:w="1040" w:type="dxa"/>
+          </w:tcPr>
+          <w:p>
+            <w:pPr/>
+            <w:r>
+              <w:t xml:space="preserve">98% / 2%</w:t>
+            </w:r>
+          </w:p>
+        </w:tc>
+        <w:tc>
+          <w:tcPr>
+            <w:tcW w:w="1040" w:type="dxa"/>
+          </w:tcPr>
+          <w:p>
+            <w:pPr/>
+            <w:r>
+              <w:t xml:space="preserve">$2.55 → $1.79</w:t>
+            </w:r>
+          </w:p>
+        </w:tc>
+        <w:tc>
+          <w:tcPr>
+            <w:tcW w:w="1040" w:type="dxa"/>
+          </w:tcPr>
+          <w:p>
+            <w:pPr/>
+            <w:r>
+              <w:t xml:space="preserve">$0.59</w:t>
+            </w:r>
+          </w:p>
+        </w:tc>
+        <w:tc>
+          <w:tcPr>
+            <w:tcW w:w="1040" w:type="dxa"/>
+          </w:tcPr>
+          <w:p>
+            <w:pPr/>
+            <w:r>
+              <w:t xml:space="preserve">3.0×</w:t>
+            </w:r>
+          </w:p>
+        </w:tc>
+        <w:tc>
+          <w:tcPr>
+            <w:tcW w:w="1040" w:type="dxa"/>
+          </w:tcPr>
+          <w:p>
+            <w:pPr/>
+            <w:r>
+              <w:t xml:space="preserve">$1.34 → $0.94</w:t>
+            </w:r>
+          </w:p>
+        </w:tc>
+        <w:tc>
+          <w:tcPr>
+            <w:tcW w:w="1040" w:type="dxa"/>
+          </w:tcPr>
+          <w:p>
+            <w:pPr/>
+            <w:r>
+              <w:t xml:space="preserve">unread</w:t>
+            </w:r>
+          </w:p>
+        </w:tc>
+        <w:tc>
+          <w:tcPr>
+            <w:tcW w:w="1040" w:type="dxa"/>
+          </w:tcPr>
+          <w:p>
+            <w:pPr/>
+            <w:r>
+              <w:t xml:space="preserve">Stands</w:t>
+            </w:r>
+          </w:p>
+        </w:tc>
+      </w:tr>
+      <w:tr>
+        <w:tc>
+          <w:tcPr>
+            <w:tcW w:w="1040" w:type="dxa"/>
+          </w:tcPr>
+          <w:p>
+            <w:pPr/>
+            <w:r>
+              <w:t xml:space="preserve">140</w:t>
+            </w:r>
+          </w:p>
+        </w:tc>
+        <w:tc>
+          <w:tcPr>
+            <w:tcW w:w="1040" w:type="dxa"/>
+          </w:tcPr>
+          <w:p>
+            <w:pPr/>
+            <w:r>
+              <w:t xml:space="preserve">queen size sheets silk</w:t>
+            </w:r>
+          </w:p>
+        </w:tc>
+        <w:tc>
+          <w:tcPr>
+            <w:tcW w:w="1040" w:type="dxa"/>
+          </w:tcPr>
+          <w:p>
+            <w:pPr/>
+            <w:r>
+              <w:t xml:space="preserve">97% / 0%</w:t>
+            </w:r>
+          </w:p>
+        </w:tc>
+        <w:tc>
+          <w:tcPr>
+            <w:tcW w:w="1040" w:type="dxa"/>
+          </w:tcPr>
+          <w:p>
+            <w:pPr/>
+            <w:r>
+              <w:t xml:space="preserve">$3.58 → $2.52</w:t>
+            </w:r>
+          </w:p>
+        </w:tc>
+        <w:tc>
+          <w:tcPr>
+            <w:tcW w:w="1040" w:type="dxa"/>
+          </w:tcPr>
+          <w:p>
+            <w:pPr/>
+            <w:r>
+              <w:t xml:space="preserve">$1.42</w:t>
+            </w:r>
+          </w:p>
+        </w:tc>
+        <w:tc>
+          <w:tcPr>
+            <w:tcW w:w="1040" w:type="dxa"/>
+          </w:tcPr>
+          <w:p>
+            <w:pPr/>
+            <w:r>
+              <w:t xml:space="preserve">1.8×</w:t>
+            </w:r>
+          </w:p>
+        </w:tc>
+        <w:tc>
+          <w:tcPr>
+            <w:tcW w:w="1040" w:type="dxa"/>
+          </w:tcPr>
+          <w:p>
+            <w:pPr/>
+            <w:r>
+              <w:t xml:space="preserve">$1.79 → $1.26</w:t>
+            </w:r>
+          </w:p>
+        </w:tc>
+        <w:tc>
+          <w:tcPr>
+            <w:tcW w:w="1040" w:type="dxa"/>
+          </w:tcPr>
+          <w:p>
+            <w:pPr/>
+            <w:r>
+              <w:t xml:space="preserve">unread</w:t>
+            </w:r>
+          </w:p>
+        </w:tc>
+        <w:tc>
+          <w:tcPr>
+            <w:tcW w:w="1040" w:type="dxa"/>
+          </w:tcPr>
+          <w:p>
+            <w:pPr/>
+            <w:r>
+              <w:t xml:space="preserve">Stands</w:t>
+            </w:r>
+          </w:p>
+        </w:tc>
+      </w:tr>
+      <w:tr>
+        <w:tc>
+          <w:tcPr>
+            <w:tcW w:w="1040" w:type="dxa"/>
+          </w:tcPr>
+          <w:p>
+            <w:pPr/>
+            <w:r>
+              <w:t xml:space="preserve">180</w:t>
+            </w:r>
+          </w:p>
+        </w:tc>
+        <w:tc>
+          <w:tcPr>
+            <w:tcW w:w="1040" w:type="dxa"/>
+          </w:tcPr>
+          <w:p>
+            <w:pPr/>
+            <w:r>
+              <w:t xml:space="preserve">pink satin sheet</w:t>
+            </w:r>
+          </w:p>
+        </w:tc>
+        <w:tc>
+          <w:tcPr>
+            <w:tcW w:w="1040" w:type="dxa"/>
+          </w:tcPr>
+          <w:p>
+            <w:pPr/>
+            <w:r>
+              <w:t xml:space="preserve">13% / 79%</w:t>
+            </w:r>
+          </w:p>
+        </w:tc>
+        <w:tc>
+          <w:tcPr>
+            <w:tcW w:w="1040" w:type="dxa"/>
+          </w:tcPr>
+          <w:p>
+            <w:pPr/>
+            <w:r>
+              <w:t xml:space="preserve">$1.04 → $0.82</w:t>
+            </w:r>
+          </w:p>
+        </w:tc>
+        <w:tc>
+          <w:tcPr>
+            <w:tcW w:w="1040" w:type="dxa"/>
+          </w:tcPr>
+          <w:p>
+            <w:pPr/>
+            <w:r>
+              <w:t xml:space="preserve">$1.25</w:t>
+            </w:r>
+          </w:p>
+        </w:tc>
+        <w:tc>
+          <w:tcPr>
+            <w:tcW w:w="1040" w:type="dxa"/>
+          </w:tcPr>
+          <w:p>
+            <w:pPr/>
+            <w:r>
+              <w:t xml:space="preserve">0.7×</w:t>
+            </w:r>
+          </w:p>
+        </w:tc>
+        <w:tc>
+          <w:tcPr>
+            <w:tcW w:w="1040" w:type="dxa"/>
+          </w:tcPr>
+          <w:p>
+            <w:pPr/>
+            <w:r>
+              <w:t xml:space="preserve">$0.65 → $0.51</w:t>
+            </w:r>
+          </w:p>
+        </w:tc>
+        <w:tc>
+          <w:tcPr>
+            <w:tcW w:w="1040" w:type="dxa"/>
+          </w:tcPr>
+          <w:p>
+            <w:pPr/>
+            <w:r>
+              <w:t xml:space="preserve">$0.10</w:t>
+            </w:r>
+          </w:p>
+        </w:tc>
+        <w:tc>
+          <w:tcPr>
+            <w:tcW w:w="1040" w:type="dxa"/>
+          </w:tcPr>
+          <w:p>
+            <w:pPr/>
+            <w:r>
+              <w:rPr>
+                <w:b/>
+              </w:rPr>
+              <w:t xml:space="preserve">Base $0.49</w:t>
+            </w:r>
+            <w:r>
+              <w:t xml:space="preserve"> (−25%) and </w:t>
+            </w:r>
+            <w:r>
+              <w:rPr>
+                <w:b/>
+              </w:rPr>
+              <w:t xml:space="preserve">modifier 60% → 112%</w:t>
+            </w:r>
+            <w:r>
+              <w:t xml:space="preserve"> to hold top of search at $1.04</w:t>
+            </w:r>
+          </w:p>
+        </w:tc>
+      </w:tr>
+      <w:tr>
+        <w:tc>
+          <w:tcPr>
+            <w:tcW w:w="1040" w:type="dxa"/>
+          </w:tcPr>
+          <w:p>
+            <w:pPr/>
+            <w:r>
+              <w:t xml:space="preserve">185</w:t>
+            </w:r>
+          </w:p>
+        </w:tc>
+        <w:tc>
+          <w:tcPr>
+            <w:tcW w:w="1040" w:type="dxa"/>
+          </w:tcPr>
+          <w:p>
+            <w:pPr/>
+            <w:r>
+              <w:t xml:space="preserve">king size bed sheets silk</w:t>
+            </w:r>
+          </w:p>
+        </w:tc>
+        <w:tc>
+          <w:tcPr>
+            <w:tcW w:w="1040" w:type="dxa"/>
+          </w:tcPr>
+          <w:p>
+            <w:pPr/>
+            <w:r>
+              <w:t xml:space="preserve">95% / 0%</w:t>
+            </w:r>
+          </w:p>
+        </w:tc>
+        <w:tc>
+          <w:tcPr>
+            <w:tcW w:w="1040" w:type="dxa"/>
+          </w:tcPr>
+          <w:p>
+            <w:pPr/>
+            <w:r>
+              <w:t xml:space="preserve">$2.76 → $2.10</w:t>
+            </w:r>
+          </w:p>
+        </w:tc>
+        <w:tc>
+          <w:tcPr>
+            <w:tcW w:w="1040" w:type="dxa"/>
+          </w:tcPr>
+          <w:p>
+            <w:pPr/>
+            <w:r>
+              <w:t xml:space="preserve">$1.27</w:t>
+            </w:r>
+          </w:p>
+        </w:tc>
+        <w:tc>
+          <w:tcPr>
+            <w:tcW w:w="1040" w:type="dxa"/>
+          </w:tcPr>
+          <w:p>
+            <w:pPr/>
+            <w:r>
+              <w:t xml:space="preserve">1.6×</w:t>
+            </w:r>
+          </w:p>
+        </w:tc>
+        <w:tc>
+          <w:tcPr>
+            <w:tcW w:w="1040" w:type="dxa"/>
+          </w:tcPr>
+          <w:p>
+            <w:pPr/>
+            <w:r>
+              <w:t xml:space="preserve">$1.38 → $1.05</w:t>
+            </w:r>
+          </w:p>
+        </w:tc>
+        <w:tc>
+          <w:tcPr>
+            <w:tcW w:w="1040" w:type="dxa"/>
+          </w:tcPr>
+          <w:p>
+            <w:pPr/>
+            <w:r>
+              <w:t xml:space="preserve">unread</w:t>
+            </w:r>
+          </w:p>
+        </w:tc>
+        <w:tc>
+          <w:tcPr>
+            <w:tcW w:w="1040" w:type="dxa"/>
+          </w:tcPr>
+          <w:p>
+            <w:pPr/>
+            <w:r>
+              <w:t xml:space="preserve">Stands</w:t>
+            </w:r>
+          </w:p>
+        </w:tc>
+      </w:tr>
+    </w:tbl>
+    <w:p>
+      <w:pPr/>
+      <w:r>
+        <w:t xml:space="preserve">Source: the run's own rationale for each row (placement split, top-of-search conversion and the product-page and rest-of-search orders); "unread" = under 15 product-page clicks, so the child's planning rate applies. The product-page ceiling for 4, 9, 16 and 21 includes rest of search.</w:t>
+      </w:r>
+    </w:p>
+    <w:p>
+      <w:pPr/>
+      <w:r>
+        <w:t xml:space="preserve">The modifier rise on seq 180 is legal under the code-red freeze: it only holds the top-of-search price, which the redline's §4 rule now states. Every row marked "stands" is still 1.3–3.8× its ceiling after this run, so the descent continues on the SOP-26 R4 cadence, re-read twice a week. On "satin sheets" (#4–5) and "satin sheets queen size" (#5), a descent to the ceiling may cost position. That trade is the PPC Lead's under the code-red declaration, not a default.</w:t>
+      </w:r>
+    </w:p>
+    <w:p>
+      <w:pPr>
+        <w:pStyle w:val="Heading2"/>
+      </w:pPr>
+      <w:r>
         <w:t xml:space="preserve">The outcome, restated</w:t>
       </w:r>
     </w:p>
@@ -8516,6 +10568,12 @@
     <w:p>
       <w:pPr/>
       <w:r>
+        <w:t xml:space="preserve">Eight flagged rows load with the corrected values in section P: 9, 10, 94, 195, 214 and 264 (base), 81 (modifier held at 100%) and 180 (base and a price-holding modifier). The counts above do not change.</w:t>
+      </w:r>
+    </w:p>
+    <w:p>
+      <w:pPr/>
+      <w:r>
         <w:rPr>
           <w:b/>
         </w:rPr>
@@ -9900,6 +11958,12 @@
     <w:p>
       <w:pPr/>
       <w:r>
+        <w:t xml:space="preserve">Two more gaps come from reading the run against the Bids and Placements logic (section P): base steps are leak-sized (13% on a 55% product-page leak) instead of the document's 25% cap with sales, and rows written in a maintenance run price a "deliberate loss on a funded push". Fix: take step sizes from that document's §10 caps, and allow a premium only on a funded push that has passed the posture gate.</w:t>
+      </w:r>
+    </w:p>
+    <w:p>
+      <w:pPr/>
+      <w:r>
         <w:t xml:space="preserve">The first review's verdict table also double-counted three rows (41, 122, 167) and its spend denominators disagreed ($6,374 in 14 days in the stock section; $8,040 implied by "$2,010 = 25%"; the engine's $8,460). Its section numbering skipped C2, C3, C7 and C9–C12; this review keeps the numbers of the sections that exist.</w:t>
       </w:r>
     </w:p>
@@ -9968,7 +12032,7 @@
         <w:t xml:space="preserve">Load the run with this review's verdicts:</w:t>
       </w:r>
       <w:r>
-        <w:t xml:space="preserve"> 569 passes and 28 flags. The 25 flagged cuts (N2, N3 and 41, 122, 167) go through #38 with the code-red reference in the reason string and their new predictions.</w:t>
+        <w:t xml:space="preserve"> 569 passes and 28 flags. The 25 flagged cuts (N2, N3 and 41, 122, 167), with section P's corrected values on 9, 10, 81, 94, 180, 195, 214 and 264, go through #38 with the code-red reference in the reason string and their new predictions.</w:t>
       </w:r>
     </w:p>
     <w:p>
@@ -10094,7 +12158,7 @@
         <w:t xml:space="preserve">Before the next run:</w:t>
       </w:r>
       <w:r>
-        <w:t xml:space="preserve"> complete the size map; one rank source; one margin, from Sellerboard, with every bid ceiling recomputed on it; the engine fixes in F; export every decided campaign.</w:t>
+        <w:t xml:space="preserve"> complete the size map; one rank source; one margin, from Sellerboard, with every bid ceiling recomputed on it; adopt the Bids and Placements redline (rank gap in positions, incremental and reachable required clicks, posture gate, rules on prices not modifiers); the engine fixes in F; export every decided campaign.</w:t>
       </w:r>
     </w:p>
     <w:p>

</xml_diff>